<commit_message>
Added more detail to the analysis for the current state and design
</commit_message>
<xml_diff>
--- a/Documents/Analysis of Current State and Design.docx
+++ b/Documents/Analysis of Current State and Design.docx
@@ -1,7 +1,76 @@
 
 <file path=word/document.xml><?xml version="1.0" encoding="utf-8"?>
-<w:document xmlns:wpc="http://schemas.microsoft.com/office/word/2010/wordprocessingCanvas" xmlns:cx="http://schemas.microsoft.com/office/drawing/2014/chartex" xmlns:cx1="http://schemas.microsoft.com/office/drawing/2015/9/8/chartex" xmlns:cx2="http://schemas.microsoft.com/office/drawing/2015/10/21/chartex" xmlns:cx3="http://schemas.microsoft.com/office/drawing/2016/5/9/chartex" xmlns:cx4="http://schemas.microsoft.com/office/drawing/2016/5/10/chartex" xmlns:cx5="http://schemas.microsoft.com/office/drawing/2016/5/11/chartex" xmlns:cx6="http://schemas.microsoft.com/office/drawing/2016/5/12/chartex" xmlns:cx7="http://schemas.microsoft.com/office/drawing/2016/5/13/chartex" xmlns:cx8="http://schemas.microsoft.com/office/drawing/2016/5/14/chartex" xmlns:mc="http://schemas.openxmlformats.org/markup-compatibility/2006" xmlns:aink="http://schemas.microsoft.com/office/drawing/2016/ink" xmlns:am3d="http://schemas.microsoft.com/office/drawing/2017/model3d" xmlns:o="urn:schemas-microsoft-com:office:office" xmlns:oel="http://schemas.microsoft.com/office/2019/extlst" xmlns:r="http://schemas.openxmlformats.org/officeDocument/2006/relationships" xmlns:m="http://schemas.openxmlformats.org/officeDocument/2006/math" xmlns:v="urn:schemas-microsoft-com:vml" xmlns:wp14="http://schemas.microsoft.com/office/word/2010/wordprocessingDrawing" xmlns:wp="http://schemas.openxmlformats.org/drawingml/2006/wordprocessingDrawing" xmlns:w10="urn:schemas-microsoft-com:office:word" xmlns:w="http://schemas.openxmlformats.org/wordprocessingml/2006/main" xmlns:w14="http://schemas.microsoft.com/office/word/2010/wordml" xmlns:w15="http://schemas.microsoft.com/office/word/2012/wordml" xmlns:w16cex="http://schemas.microsoft.com/office/word/2018/wordml/cex" xmlns:w16cid="http://schemas.microsoft.com/office/word/2016/wordml/cid" xmlns:w16="http://schemas.microsoft.com/office/word/2018/wordml" xmlns:w16du="http://schemas.microsoft.com/office/word/2023/wordml/word16du" xmlns:w16sdtdh="http://schemas.microsoft.com/office/word/2020/wordml/sdtdatahash" xmlns:w16sdtfl="http://schemas.microsoft.com/office/word/2024/wordml/sdtformatlock" xmlns:w16se="http://schemas.microsoft.com/office/word/2015/wordml/symex" xmlns:wpg="http://schemas.microsoft.com/office/word/2010/wordprocessingGroup" xmlns:wpi="http://schemas.microsoft.com/office/word/2010/wordprocessingInk" xmlns:wne="http://schemas.microsoft.com/office/word/2006/wordml" xmlns:wps="http://schemas.microsoft.com/office/word/2010/wordprocessingShape" mc:Ignorable="w14 w15 w16se w16cid w16 w16cex w16sdtdh w16sdtfl w16du wp14">
+<w:document xmlns:wpc="http://schemas.microsoft.com/office/word/2010/wordprocessingCanvas" xmlns:cx="http://schemas.microsoft.com/office/drawing/2014/chartex" xmlns:cx1="http://schemas.microsoft.com/office/drawing/2015/9/8/chartex" xmlns:cx2="http://schemas.microsoft.com/office/drawing/2015/10/21/chartex" xmlns:cx3="http://schemas.microsoft.com/office/drawing/2016/5/9/chartex" xmlns:cx4="http://schemas.microsoft.com/office/drawing/2016/5/10/chartex" xmlns:cx5="http://schemas.microsoft.com/office/drawing/2016/5/11/chartex" xmlns:cx6="http://schemas.microsoft.com/office/drawing/2016/5/12/chartex" xmlns:cx7="http://schemas.microsoft.com/office/drawing/2016/5/13/chartex" xmlns:cx8="http://schemas.microsoft.com/office/drawing/2016/5/14/chartex" xmlns:mc="http://schemas.openxmlformats.org/markup-compatibility/2006" xmlns:aink="http://schemas.microsoft.com/office/drawing/2016/ink" xmlns:am3d="http://schemas.microsoft.com/office/drawing/2017/model3d" xmlns:o="urn:schemas-microsoft-com:office:office" xmlns:r="http://schemas.openxmlformats.org/officeDocument/2006/relationships" xmlns:m="http://schemas.openxmlformats.org/officeDocument/2006/math" xmlns:v="urn:schemas-microsoft-com:vml" xmlns:wp14="http://schemas.microsoft.com/office/word/2010/wordprocessingDrawing" xmlns:wp="http://schemas.openxmlformats.org/drawingml/2006/wordprocessingDrawing" xmlns:w10="urn:schemas-microsoft-com:office:word" xmlns:w="http://schemas.openxmlformats.org/wordprocessingml/2006/main" xmlns:w14="http://schemas.microsoft.com/office/word/2010/wordml" xmlns:w15="http://schemas.microsoft.com/office/word/2012/wordml" xmlns:w16cex="http://schemas.microsoft.com/office/word/2018/wordml/cex" xmlns:w16cid="http://schemas.microsoft.com/office/word/2016/wordml/cid" xmlns:w16="http://schemas.microsoft.com/office/word/2018/wordml" xmlns:w16sdtdh="http://schemas.microsoft.com/office/word/2020/wordml/sdtdatahash" xmlns:w16se="http://schemas.microsoft.com/office/word/2015/wordml/symex" xmlns:wpg="http://schemas.microsoft.com/office/word/2010/wordprocessingGroup" xmlns:wpi="http://schemas.microsoft.com/office/word/2010/wordprocessingInk" xmlns:wne="http://schemas.microsoft.com/office/word/2006/wordml" xmlns:wps="http://schemas.microsoft.com/office/word/2010/wordprocessingShape" mc:Ignorable="w14 w15 w16se w16cid w16 w16cex w16sdtdh wp14">
   <w:body>
+    <w:p>
+      <w:pPr>
+        <w:pStyle w:val="Title"/>
+        <w:jc w:val="both"/>
+      </w:pPr>
+      <w:r>
+        <w:t>Analysis Document</w:t>
+      </w:r>
+    </w:p>
+    <w:p>
+      <w:pPr>
+        <w:jc w:val="both"/>
+        <w:rPr>
+          <w:rStyle w:val="SubtleEmphasis"/>
+        </w:rPr>
+      </w:pPr>
+      <w:r>
+        <w:rPr>
+          <w:rStyle w:val="SubtleEmphasis"/>
+        </w:rPr>
+        <w:t xml:space="preserve">By Group SEA – </w:t>
+      </w:r>
+      <w:r>
+        <w:rPr>
+          <w:rStyle w:val="SubtleEmphasis"/>
+        </w:rPr>
+        <w:t xml:space="preserve">Sara </w:t>
+      </w:r>
+      <w:proofErr w:type="spellStart"/>
+      <w:r>
+        <w:rPr>
+          <w:rStyle w:val="SubtleEmphasis"/>
+        </w:rPr>
+        <w:t>Kiani</w:t>
+      </w:r>
+      <w:proofErr w:type="spellEnd"/>
+      <w:r>
+        <w:rPr>
+          <w:rStyle w:val="SubtleEmphasis"/>
+        </w:rPr>
+        <w:t xml:space="preserve"> </w:t>
+      </w:r>
+      <w:proofErr w:type="spellStart"/>
+      <w:r>
+        <w:rPr>
+          <w:rStyle w:val="SubtleEmphasis"/>
+        </w:rPr>
+        <w:t>Nejad</w:t>
+      </w:r>
+      <w:proofErr w:type="spellEnd"/>
+      <w:r>
+        <w:rPr>
+          <w:rStyle w:val="SubtleEmphasis"/>
+        </w:rPr>
+        <w:t>,</w:t>
+      </w:r>
+      <w:r>
+        <w:rPr>
+          <w:rStyle w:val="SubtleEmphasis"/>
+        </w:rPr>
+        <w:t xml:space="preserve"> </w:t>
+      </w:r>
+      <w:r>
+        <w:rPr>
+          <w:rStyle w:val="SubtleEmphasis"/>
+        </w:rPr>
+        <w:t>Eliza Horváth, Airaa Srinivasan</w:t>
+      </w:r>
+    </w:p>
     <w:p>
       <w:pPr>
         <w:pStyle w:val="Heading1"/>
@@ -9,15 +78,16 @@
           <w:ilvl w:val="0"/>
           <w:numId w:val="2"/>
         </w:numPr>
-      </w:pPr>
-      <w:r>
-        <w:t>Analysis of Current State and Design</w:t>
-      </w:r>
-    </w:p>
-    <w:p>
-      <w:pPr>
-        <w:pStyle w:val="ListParagraph"/>
-      </w:pPr>
+        <w:jc w:val="both"/>
+      </w:pPr>
+      <w:r>
+        <w:t>Analysis of Current State and Desig</w:t>
+      </w:r>
+      <w:r>
+        <w:t>n</w:t>
+      </w:r>
+    </w:p>
+    <w:p>
       <w:r>
         <w:t xml:space="preserve">The current state of </w:t>
       </w:r>
@@ -28,6 +98,26 @@
       <w:proofErr w:type="spellEnd"/>
       <w:r>
         <w:t xml:space="preserve"> is a monolithic, tightly coupled legacy system. It functions but fails most modern software quality standards.</w:t>
+      </w:r>
+    </w:p>
+    <w:p>
+      <w:pPr>
+        <w:pStyle w:val="Heading4"/>
+        <w:numPr>
+          <w:ilvl w:val="0"/>
+          <w:numId w:val="19"/>
+        </w:numPr>
+      </w:pPr>
+      <w:r>
+        <w:t>Tight Coupling Between Domain and Presentation:</w:t>
+      </w:r>
+    </w:p>
+    <w:p>
+      <w:r>
+        <w:t>Classes involved:</w:t>
+      </w:r>
+      <w:r>
+        <w:t xml:space="preserve"> </w:t>
       </w:r>
     </w:p>
     <w:p>
@@ -35,26 +125,995 @@
         <w:pStyle w:val="ListParagraph"/>
         <w:numPr>
           <w:ilvl w:val="0"/>
-          <w:numId w:val="3"/>
+          <w:numId w:val="14"/>
         </w:numPr>
       </w:pPr>
+      <w:proofErr w:type="spellStart"/>
+      <w:r>
+        <w:t>SlideItem</w:t>
+      </w:r>
+      <w:proofErr w:type="spellEnd"/>
+    </w:p>
+    <w:p>
+      <w:pPr>
+        <w:pStyle w:val="ListParagraph"/>
+        <w:numPr>
+          <w:ilvl w:val="0"/>
+          <w:numId w:val="14"/>
+        </w:numPr>
+      </w:pPr>
+      <w:proofErr w:type="spellStart"/>
+      <w:r>
+        <w:t>TextItem</w:t>
+      </w:r>
+      <w:proofErr w:type="spellEnd"/>
+    </w:p>
+    <w:p>
+      <w:pPr>
+        <w:pStyle w:val="ListParagraph"/>
+        <w:numPr>
+          <w:ilvl w:val="0"/>
+          <w:numId w:val="14"/>
+        </w:numPr>
+      </w:pPr>
+      <w:proofErr w:type="spellStart"/>
+      <w:r>
+        <w:t>BitmapItem</w:t>
+      </w:r>
+      <w:proofErr w:type="spellEnd"/>
+    </w:p>
+    <w:p>
+      <w:r>
+        <w:t>Issues:</w:t>
+      </w:r>
+    </w:p>
+    <w:p>
+      <w:r>
+        <w:t xml:space="preserve">The domain model contains functionality that directly depends on graphical user interface components. In the </w:t>
+      </w:r>
+      <w:proofErr w:type="spellStart"/>
+      <w:r>
+        <w:rPr>
+          <w:color w:val="4C94D8" w:themeColor="text2" w:themeTint="80"/>
+        </w:rPr>
+        <w:t>SlideItem</w:t>
+      </w:r>
+      <w:proofErr w:type="spellEnd"/>
+      <w:r>
+        <w:rPr>
+          <w:color w:val="4C94D8" w:themeColor="text2" w:themeTint="80"/>
+        </w:rPr>
+        <w:t xml:space="preserve"> </w:t>
+      </w:r>
+      <w:r>
+        <w:t xml:space="preserve">class hierarchy, rendering logic is implemented inside the domain objects. </w:t>
+      </w:r>
+    </w:p>
+    <w:p>
+      <w:r>
+        <w:rPr>
+          <w:noProof/>
+        </w:rPr>
+        <mc:AlternateContent>
+          <mc:Choice Requires="wps">
+            <w:drawing>
+              <wp:anchor distT="0" distB="0" distL="114300" distR="114300" simplePos="0" relativeHeight="251667456" behindDoc="1" locked="0" layoutInCell="1" allowOverlap="1" wp14:anchorId="225F6013" wp14:editId="344C908E">
+                <wp:simplePos x="0" y="0"/>
+                <wp:positionH relativeFrom="column">
+                  <wp:posOffset>0</wp:posOffset>
+                </wp:positionH>
+                <wp:positionV relativeFrom="paragraph">
+                  <wp:posOffset>1350010</wp:posOffset>
+                </wp:positionV>
+                <wp:extent cx="5951855" cy="635"/>
+                <wp:effectExtent l="0" t="0" r="0" b="0"/>
+                <wp:wrapTight wrapText="bothSides">
+                  <wp:wrapPolygon edited="0">
+                    <wp:start x="0" y="0"/>
+                    <wp:lineTo x="0" y="21600"/>
+                    <wp:lineTo x="21600" y="21600"/>
+                    <wp:lineTo x="21600" y="0"/>
+                  </wp:wrapPolygon>
+                </wp:wrapTight>
+                <wp:docPr id="8" name="Text Box 8"/>
+                <wp:cNvGraphicFramePr/>
+                <a:graphic xmlns:a="http://schemas.openxmlformats.org/drawingml/2006/main">
+                  <a:graphicData uri="http://schemas.microsoft.com/office/word/2010/wordprocessingShape">
+                    <wps:wsp>
+                      <wps:cNvSpPr txBox="1"/>
+                      <wps:spPr>
+                        <a:xfrm>
+                          <a:off x="0" y="0"/>
+                          <a:ext cx="5951855" cy="635"/>
+                        </a:xfrm>
+                        <a:prstGeom prst="rect">
+                          <a:avLst/>
+                        </a:prstGeom>
+                        <a:solidFill>
+                          <a:prstClr val="white"/>
+                        </a:solidFill>
+                        <a:ln>
+                          <a:noFill/>
+                        </a:ln>
+                      </wps:spPr>
+                      <wps:txbx>
+                        <w:txbxContent>
+                          <w:p>
+                            <w:pPr>
+                              <w:pStyle w:val="Caption"/>
+                              <w:rPr>
+                                <w:sz w:val="24"/>
+                                <w:szCs w:val="24"/>
+                              </w:rPr>
+                            </w:pPr>
+                            <w:r>
+                              <w:t xml:space="preserve">Figure </w:t>
+                            </w:r>
+                            <w:fldSimple w:instr=" SEQ Figure \* ARABIC ">
+                              <w:r>
+                                <w:rPr>
+                                  <w:noProof/>
+                                </w:rPr>
+                                <w:t>1</w:t>
+                              </w:r>
+                            </w:fldSimple>
+                            <w:r>
+                              <w:t xml:space="preserve">: Code from </w:t>
+                            </w:r>
+                            <w:proofErr w:type="spellStart"/>
+                            <w:r>
+                              <w:t>SlideItem</w:t>
+                            </w:r>
+                            <w:proofErr w:type="spellEnd"/>
+                            <w:r>
+                              <w:t xml:space="preserve"> Class</w:t>
+                            </w:r>
+                          </w:p>
+                        </w:txbxContent>
+                      </wps:txbx>
+                      <wps:bodyPr rot="0" spcFirstLastPara="0" vertOverflow="overflow" horzOverflow="overflow" vert="horz" wrap="square" lIns="0" tIns="0" rIns="0" bIns="0" numCol="1" spcCol="0" rtlCol="0" fromWordArt="0" anchor="t" anchorCtr="0" forceAA="0" compatLnSpc="1">
+                        <a:prstTxWarp prst="textNoShape">
+                          <a:avLst/>
+                        </a:prstTxWarp>
+                        <a:spAutoFit/>
+                      </wps:bodyPr>
+                    </wps:wsp>
+                  </a:graphicData>
+                </a:graphic>
+              </wp:anchor>
+            </w:drawing>
+          </mc:Choice>
+          <mc:Fallback>
+            <w:pict>
+              <v:shapetype w14:anchorId="225F6013" id="_x0000_t202" coordsize="21600,21600" o:spt="202" path="m,l,21600r21600,l21600,xe">
+                <v:stroke joinstyle="miter"/>
+                <v:path gradientshapeok="t" o:connecttype="rect"/>
+              </v:shapetype>
+              <v:shape id="Text Box 8" o:spid="_x0000_s1026" type="#_x0000_t202" style="position:absolute;margin-left:0;margin-top:106.3pt;width:468.65pt;height:.05pt;z-index:-251649024;visibility:visible;mso-wrap-style:square;mso-wrap-distance-left:9pt;mso-wrap-distance-top:0;mso-wrap-distance-right:9pt;mso-wrap-distance-bottom:0;mso-position-horizontal:absolute;mso-position-horizontal-relative:text;mso-position-vertical:absolute;mso-position-vertical-relative:text;v-text-anchor:top" o:gfxdata="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" stroked="f">
+                <v:textbox style="mso-fit-shape-to-text:t" inset="0,0,0,0">
+                  <w:txbxContent>
+                    <w:p>
+                      <w:pPr>
+                        <w:pStyle w:val="Caption"/>
+                        <w:rPr>
+                          <w:sz w:val="24"/>
+                          <w:szCs w:val="24"/>
+                        </w:rPr>
+                      </w:pPr>
+                      <w:r>
+                        <w:t xml:space="preserve">Figure </w:t>
+                      </w:r>
+                      <w:fldSimple w:instr=" SEQ Figure \* ARABIC ">
+                        <w:r>
+                          <w:rPr>
+                            <w:noProof/>
+                          </w:rPr>
+                          <w:t>1</w:t>
+                        </w:r>
+                      </w:fldSimple>
+                      <w:r>
+                        <w:t xml:space="preserve">: Code from </w:t>
+                      </w:r>
+                      <w:proofErr w:type="spellStart"/>
+                      <w:r>
+                        <w:t>SlideItem</w:t>
+                      </w:r>
+                      <w:proofErr w:type="spellEnd"/>
+                      <w:r>
+                        <w:t xml:space="preserve"> Class</w:t>
+                      </w:r>
+                    </w:p>
+                  </w:txbxContent>
+                </v:textbox>
+                <w10:wrap type="tight"/>
+              </v:shape>
+            </w:pict>
+          </mc:Fallback>
+        </mc:AlternateContent>
+      </w:r>
+      <w:r>
+        <w:drawing>
+          <wp:anchor distT="0" distB="0" distL="114300" distR="114300" simplePos="0" relativeHeight="251658240" behindDoc="1" locked="0" layoutInCell="1" allowOverlap="1" wp14:anchorId="694D96A7" wp14:editId="31646FBE">
+            <wp:simplePos x="0" y="0"/>
+            <wp:positionH relativeFrom="margin">
+              <wp:align>left</wp:align>
+            </wp:positionH>
+            <wp:positionV relativeFrom="paragraph">
+              <wp:posOffset>346921</wp:posOffset>
+            </wp:positionV>
+            <wp:extent cx="5951855" cy="946150"/>
+            <wp:effectExtent l="0" t="0" r="0" b="6350"/>
+            <wp:wrapTight wrapText="bothSides">
+              <wp:wrapPolygon edited="0">
+                <wp:start x="0" y="0"/>
+                <wp:lineTo x="0" y="21310"/>
+                <wp:lineTo x="21501" y="21310"/>
+                <wp:lineTo x="21501" y="0"/>
+                <wp:lineTo x="0" y="0"/>
+              </wp:wrapPolygon>
+            </wp:wrapTight>
+            <wp:docPr id="1" name="Picture 1"/>
+            <wp:cNvGraphicFramePr>
+              <a:graphicFrameLocks xmlns:a="http://schemas.openxmlformats.org/drawingml/2006/main" noChangeAspect="1"/>
+            </wp:cNvGraphicFramePr>
+            <a:graphic xmlns:a="http://schemas.openxmlformats.org/drawingml/2006/main">
+              <a:graphicData uri="http://schemas.openxmlformats.org/drawingml/2006/picture">
+                <pic:pic xmlns:pic="http://schemas.openxmlformats.org/drawingml/2006/picture">
+                  <pic:nvPicPr>
+                    <pic:cNvPr id="1" name=""/>
+                    <pic:cNvPicPr/>
+                  </pic:nvPicPr>
+                  <pic:blipFill>
+                    <a:blip r:embed="rId8">
+                      <a:extLst>
+                        <a:ext uri="{28A0092B-C50C-407E-A947-70E740481C1C}">
+                          <a14:useLocalDpi xmlns:a14="http://schemas.microsoft.com/office/drawing/2010/main" val="0"/>
+                        </a:ext>
+                      </a:extLst>
+                    </a:blip>
+                    <a:stretch>
+                      <a:fillRect/>
+                    </a:stretch>
+                  </pic:blipFill>
+                  <pic:spPr>
+                    <a:xfrm>
+                      <a:off x="0" y="0"/>
+                      <a:ext cx="5951855" cy="946150"/>
+                    </a:xfrm>
+                    <a:prstGeom prst="rect">
+                      <a:avLst/>
+                    </a:prstGeom>
+                  </pic:spPr>
+                </pic:pic>
+              </a:graphicData>
+            </a:graphic>
+          </wp:anchor>
+        </w:drawing>
+      </w:r>
+      <w:r>
+        <w:t xml:space="preserve">For example, the </w:t>
+      </w:r>
+      <w:proofErr w:type="spellStart"/>
+      <w:r>
+        <w:rPr>
+          <w:color w:val="4C94D8" w:themeColor="text2" w:themeTint="80"/>
+        </w:rPr>
+        <w:t>SlideItem</w:t>
+      </w:r>
+      <w:proofErr w:type="spellEnd"/>
+      <w:r>
+        <w:rPr>
+          <w:color w:val="4C94D8" w:themeColor="text2" w:themeTint="80"/>
+        </w:rPr>
+        <w:t xml:space="preserve"> </w:t>
+      </w:r>
+      <w:r>
+        <w:t>class defines the following method:</w:t>
+      </w:r>
+      <w:r>
+        <w:br/>
+      </w:r>
+    </w:p>
+    <w:p>
+      <w:r>
+        <w:t xml:space="preserve">It depends on graphical classes such as </w:t>
+      </w:r>
+      <w:r>
+        <w:rPr>
+          <w:color w:val="4C94D8" w:themeColor="text2" w:themeTint="80"/>
+        </w:rPr>
+        <w:t xml:space="preserve">Graphics </w:t>
+      </w:r>
+      <w:r>
+        <w:t xml:space="preserve">and </w:t>
+      </w:r>
+      <w:proofErr w:type="spellStart"/>
+      <w:r>
+        <w:rPr>
+          <w:color w:val="4C94D8" w:themeColor="text2" w:themeTint="80"/>
+        </w:rPr>
+        <w:t>ImageObserver</w:t>
+      </w:r>
+      <w:proofErr w:type="spellEnd"/>
+      <w:r>
+        <w:t xml:space="preserve">. This creates tight coupling between the domain model and the presentation layer. As a result, domain logic cannot easily be reused or tested independently from the graphical interface. </w:t>
+      </w:r>
+    </w:p>
+    <w:p>
+      <w:pPr>
+        <w:pStyle w:val="Heading4"/>
+        <w:numPr>
+          <w:ilvl w:val="0"/>
+          <w:numId w:val="19"/>
+        </w:numPr>
+      </w:pPr>
+      <w:r>
+        <w:t xml:space="preserve">MVC Violation </w:t>
+      </w:r>
+      <w:proofErr w:type="gramStart"/>
+      <w:r>
+        <w:t>In</w:t>
+      </w:r>
+      <w:proofErr w:type="gramEnd"/>
+      <w:r>
+        <w:t xml:space="preserve"> the Presentation Class</w:t>
+      </w:r>
+    </w:p>
+    <w:p>
+      <w:r>
+        <w:t>Class involved:</w:t>
+      </w:r>
+    </w:p>
+    <w:p>
+      <w:pPr>
+        <w:pStyle w:val="ListParagraph"/>
+        <w:numPr>
+          <w:ilvl w:val="0"/>
+          <w:numId w:val="15"/>
+        </w:numPr>
+      </w:pPr>
+      <w:r>
+        <w:t>Presentation</w:t>
+      </w:r>
+    </w:p>
+    <w:p>
+      <w:pPr>
+        <w:pStyle w:val="ListParagraph"/>
+        <w:numPr>
+          <w:ilvl w:val="0"/>
+          <w:numId w:val="15"/>
+        </w:numPr>
+      </w:pPr>
+      <w:proofErr w:type="spellStart"/>
+      <w:r>
+        <w:t>SlideViewerComponent</w:t>
+      </w:r>
+      <w:proofErr w:type="spellEnd"/>
+    </w:p>
+    <w:p>
+      <w:r>
+        <w:lastRenderedPageBreak/>
+        <w:t>Issues:</w:t>
+      </w:r>
+    </w:p>
+    <w:p>
+      <w:r>
+        <w:rPr>
+          <w:noProof/>
+        </w:rPr>
+        <mc:AlternateContent>
+          <mc:Choice Requires="wps">
+            <w:drawing>
+              <wp:anchor distT="0" distB="0" distL="114300" distR="114300" simplePos="0" relativeHeight="251665408" behindDoc="1" locked="0" layoutInCell="1" allowOverlap="1" wp14:anchorId="243CBA1D" wp14:editId="3859DCBD">
+                <wp:simplePos x="0" y="0"/>
+                <wp:positionH relativeFrom="column">
+                  <wp:posOffset>0</wp:posOffset>
+                </wp:positionH>
+                <wp:positionV relativeFrom="paragraph">
+                  <wp:posOffset>878205</wp:posOffset>
+                </wp:positionV>
+                <wp:extent cx="6577965" cy="635"/>
+                <wp:effectExtent l="0" t="0" r="0" b="0"/>
+                <wp:wrapTight wrapText="bothSides">
+                  <wp:wrapPolygon edited="0">
+                    <wp:start x="0" y="0"/>
+                    <wp:lineTo x="0" y="21600"/>
+                    <wp:lineTo x="21600" y="21600"/>
+                    <wp:lineTo x="21600" y="0"/>
+                  </wp:wrapPolygon>
+                </wp:wrapTight>
+                <wp:docPr id="7" name="Text Box 7"/>
+                <wp:cNvGraphicFramePr/>
+                <a:graphic xmlns:a="http://schemas.openxmlformats.org/drawingml/2006/main">
+                  <a:graphicData uri="http://schemas.microsoft.com/office/word/2010/wordprocessingShape">
+                    <wps:wsp>
+                      <wps:cNvSpPr txBox="1"/>
+                      <wps:spPr>
+                        <a:xfrm>
+                          <a:off x="0" y="0"/>
+                          <a:ext cx="6577965" cy="635"/>
+                        </a:xfrm>
+                        <a:prstGeom prst="rect">
+                          <a:avLst/>
+                        </a:prstGeom>
+                        <a:solidFill>
+                          <a:prstClr val="white"/>
+                        </a:solidFill>
+                        <a:ln>
+                          <a:noFill/>
+                        </a:ln>
+                      </wps:spPr>
+                      <wps:txbx>
+                        <w:txbxContent>
+                          <w:p>
+                            <w:pPr>
+                              <w:pStyle w:val="Caption"/>
+                              <w:rPr>
+                                <w:sz w:val="24"/>
+                                <w:szCs w:val="24"/>
+                              </w:rPr>
+                            </w:pPr>
+                            <w:r>
+                              <w:t xml:space="preserve">Figure </w:t>
+                            </w:r>
+                            <w:fldSimple w:instr=" SEQ Figure \* ARABIC ">
+                              <w:r>
+                                <w:rPr>
+                                  <w:noProof/>
+                                </w:rPr>
+                                <w:t>2</w:t>
+                              </w:r>
+                            </w:fldSimple>
+                            <w:r>
+                              <w:t>: Code from Presentation Class 1</w:t>
+                            </w:r>
+                          </w:p>
+                        </w:txbxContent>
+                      </wps:txbx>
+                      <wps:bodyPr rot="0" spcFirstLastPara="0" vertOverflow="overflow" horzOverflow="overflow" vert="horz" wrap="square" lIns="0" tIns="0" rIns="0" bIns="0" numCol="1" spcCol="0" rtlCol="0" fromWordArt="0" anchor="t" anchorCtr="0" forceAA="0" compatLnSpc="1">
+                        <a:prstTxWarp prst="textNoShape">
+                          <a:avLst/>
+                        </a:prstTxWarp>
+                        <a:spAutoFit/>
+                      </wps:bodyPr>
+                    </wps:wsp>
+                  </a:graphicData>
+                </a:graphic>
+              </wp:anchor>
+            </w:drawing>
+          </mc:Choice>
+          <mc:Fallback>
+            <w:pict>
+              <v:shape w14:anchorId="243CBA1D" id="Text Box 7" o:spid="_x0000_s1027" type="#_x0000_t202" style="position:absolute;margin-left:0;margin-top:69.15pt;width:517.95pt;height:.05pt;z-index:-251651072;visibility:visible;mso-wrap-style:square;mso-wrap-distance-left:9pt;mso-wrap-distance-top:0;mso-wrap-distance-right:9pt;mso-wrap-distance-bottom:0;mso-position-horizontal:absolute;mso-position-horizontal-relative:text;mso-position-vertical:absolute;mso-position-vertical-relative:text;v-text-anchor:top" o:gfxdata="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" stroked="f">
+                <v:textbox style="mso-fit-shape-to-text:t" inset="0,0,0,0">
+                  <w:txbxContent>
+                    <w:p>
+                      <w:pPr>
+                        <w:pStyle w:val="Caption"/>
+                        <w:rPr>
+                          <w:sz w:val="24"/>
+                          <w:szCs w:val="24"/>
+                        </w:rPr>
+                      </w:pPr>
+                      <w:r>
+                        <w:t xml:space="preserve">Figure </w:t>
+                      </w:r>
+                      <w:fldSimple w:instr=" SEQ Figure \* ARABIC ">
+                        <w:r>
+                          <w:rPr>
+                            <w:noProof/>
+                          </w:rPr>
+                          <w:t>2</w:t>
+                        </w:r>
+                      </w:fldSimple>
+                      <w:r>
+                        <w:t>: Code from Presentation Class 1</w:t>
+                      </w:r>
+                    </w:p>
+                  </w:txbxContent>
+                </v:textbox>
+                <w10:wrap type="tight"/>
+              </v:shape>
+            </w:pict>
+          </mc:Fallback>
+        </mc:AlternateContent>
+      </w:r>
+      <w:r>
+        <w:drawing>
+          <wp:anchor distT="0" distB="0" distL="114300" distR="114300" simplePos="0" relativeHeight="251659264" behindDoc="1" locked="0" layoutInCell="1" allowOverlap="1" wp14:anchorId="4DC429E2" wp14:editId="05924F89">
+            <wp:simplePos x="0" y="0"/>
+            <wp:positionH relativeFrom="margin">
+              <wp:align>left</wp:align>
+            </wp:positionH>
+            <wp:positionV relativeFrom="paragraph">
+              <wp:posOffset>567266</wp:posOffset>
+            </wp:positionV>
+            <wp:extent cx="6577965" cy="254000"/>
+            <wp:effectExtent l="0" t="0" r="0" b="0"/>
+            <wp:wrapTight wrapText="bothSides">
+              <wp:wrapPolygon edited="0">
+                <wp:start x="0" y="0"/>
+                <wp:lineTo x="0" y="19440"/>
+                <wp:lineTo x="21519" y="19440"/>
+                <wp:lineTo x="21519" y="0"/>
+                <wp:lineTo x="0" y="0"/>
+              </wp:wrapPolygon>
+            </wp:wrapTight>
+            <wp:docPr id="2" name="Picture 2"/>
+            <wp:cNvGraphicFramePr>
+              <a:graphicFrameLocks xmlns:a="http://schemas.openxmlformats.org/drawingml/2006/main" noChangeAspect="1"/>
+            </wp:cNvGraphicFramePr>
+            <a:graphic xmlns:a="http://schemas.openxmlformats.org/drawingml/2006/main">
+              <a:graphicData uri="http://schemas.openxmlformats.org/drawingml/2006/picture">
+                <pic:pic xmlns:pic="http://schemas.openxmlformats.org/drawingml/2006/picture">
+                  <pic:nvPicPr>
+                    <pic:cNvPr id="1" name=""/>
+                    <pic:cNvPicPr/>
+                  </pic:nvPicPr>
+                  <pic:blipFill>
+                    <a:blip r:embed="rId9">
+                      <a:extLst>
+                        <a:ext uri="{28A0092B-C50C-407E-A947-70E740481C1C}">
+                          <a14:useLocalDpi xmlns:a14="http://schemas.microsoft.com/office/drawing/2010/main" val="0"/>
+                        </a:ext>
+                      </a:extLst>
+                    </a:blip>
+                    <a:stretch>
+                      <a:fillRect/>
+                    </a:stretch>
+                  </pic:blipFill>
+                  <pic:spPr>
+                    <a:xfrm>
+                      <a:off x="0" y="0"/>
+                      <a:ext cx="6577965" cy="254000"/>
+                    </a:xfrm>
+                    <a:prstGeom prst="rect">
+                      <a:avLst/>
+                    </a:prstGeom>
+                  </pic:spPr>
+                </pic:pic>
+              </a:graphicData>
+            </a:graphic>
+            <wp14:sizeRelH relativeFrom="margin">
+              <wp14:pctWidth>0</wp14:pctWidth>
+            </wp14:sizeRelH>
+            <wp14:sizeRelV relativeFrom="margin">
+              <wp14:pctHeight>0</wp14:pctHeight>
+            </wp14:sizeRelV>
+          </wp:anchor>
+        </w:drawing>
+      </w:r>
+      <w:r>
+        <w:t xml:space="preserve">The </w:t>
+      </w:r>
+      <w:r>
+        <w:rPr>
+          <w:color w:val="4C94D8" w:themeColor="text2" w:themeTint="80"/>
+        </w:rPr>
+        <w:t xml:space="preserve">Presentation </w:t>
+      </w:r>
+      <w:r>
+        <w:t>class, which represents the slideshow model, directly references a view component. For example:</w:t>
+      </w:r>
+    </w:p>
+    <w:p>
+      <w:r>
+        <w:t>And later in the code:</w:t>
+      </w:r>
+    </w:p>
+    <w:p>
+      <w:pPr>
+        <w:keepNext/>
+      </w:pPr>
+      <w:r>
+        <w:drawing>
+          <wp:inline distT="0" distB="0" distL="0" distR="0" wp14:anchorId="2F335565" wp14:editId="4FB237E7">
+            <wp:extent cx="6443133" cy="1696769"/>
+            <wp:effectExtent l="0" t="0" r="0" b="0"/>
+            <wp:docPr id="3" name="Picture 3"/>
+            <wp:cNvGraphicFramePr>
+              <a:graphicFrameLocks xmlns:a="http://schemas.openxmlformats.org/drawingml/2006/main" noChangeAspect="1"/>
+            </wp:cNvGraphicFramePr>
+            <a:graphic xmlns:a="http://schemas.openxmlformats.org/drawingml/2006/main">
+              <a:graphicData uri="http://schemas.openxmlformats.org/drawingml/2006/picture">
+                <pic:pic xmlns:pic="http://schemas.openxmlformats.org/drawingml/2006/picture">
+                  <pic:nvPicPr>
+                    <pic:cNvPr id="1" name=""/>
+                    <pic:cNvPicPr/>
+                  </pic:nvPicPr>
+                  <pic:blipFill>
+                    <a:blip r:embed="rId10"/>
+                    <a:stretch>
+                      <a:fillRect/>
+                    </a:stretch>
+                  </pic:blipFill>
+                  <pic:spPr>
+                    <a:xfrm>
+                      <a:off x="0" y="0"/>
+                      <a:ext cx="6496780" cy="1710897"/>
+                    </a:xfrm>
+                    <a:prstGeom prst="rect">
+                      <a:avLst/>
+                    </a:prstGeom>
+                  </pic:spPr>
+                </pic:pic>
+              </a:graphicData>
+            </a:graphic>
+          </wp:inline>
+        </w:drawing>
+      </w:r>
+    </w:p>
+    <w:p>
+      <w:pPr>
+        <w:pStyle w:val="Caption"/>
+      </w:pPr>
+      <w:r>
+        <w:t xml:space="preserve">Figure </w:t>
+      </w:r>
+      <w:fldSimple w:instr=" SEQ Figure \* ARABIC ">
+        <w:r>
+          <w:rPr>
+            <w:noProof/>
+          </w:rPr>
+          <w:t>3</w:t>
+        </w:r>
+      </w:fldSimple>
+      <w:r>
+        <w:t xml:space="preserve">: Code from </w:t>
+      </w:r>
+      <w:proofErr w:type="spellStart"/>
+      <w:r>
+        <w:t>Presntation</w:t>
+      </w:r>
+      <w:proofErr w:type="spellEnd"/>
+      <w:r>
+        <w:t xml:space="preserve"> Class 2</w:t>
+      </w:r>
+    </w:p>
+    <w:p>
+      <w:pPr>
+        <w:jc w:val="both"/>
+      </w:pPr>
+      <w:r>
+        <w:t>In a proper MVC architecture, the model should not depend on view components. This dependency introduces tight coupling between the model and the user interface, reducing modularity and maintainability.</w:t>
+      </w:r>
+    </w:p>
+    <w:p>
+      <w:pPr>
+        <w:pStyle w:val="Heading4"/>
+        <w:numPr>
+          <w:ilvl w:val="0"/>
+          <w:numId w:val="19"/>
+        </w:numPr>
+      </w:pPr>
+      <w:bookmarkStart w:id="0" w:name="_Ref224252026"/>
+      <w:r>
+        <w:t>XML Accessor Violates the Single Responsibility Principle</w:t>
+      </w:r>
+      <w:bookmarkEnd w:id="0"/>
+    </w:p>
+    <w:p>
+      <w:r>
+        <w:t>Classes involved:</w:t>
+      </w:r>
+    </w:p>
+    <w:p>
+      <w:pPr>
+        <w:pStyle w:val="ListParagraph"/>
+        <w:numPr>
+          <w:ilvl w:val="0"/>
+          <w:numId w:val="17"/>
+        </w:numPr>
+      </w:pPr>
+      <w:proofErr w:type="spellStart"/>
+      <w:r>
+        <w:t>XMLAccessor</w:t>
+      </w:r>
+      <w:proofErr w:type="spellEnd"/>
+    </w:p>
+    <w:p>
+      <w:pPr>
+        <w:pStyle w:val="ListParagraph"/>
+        <w:numPr>
+          <w:ilvl w:val="0"/>
+          <w:numId w:val="17"/>
+        </w:numPr>
+      </w:pPr>
+      <w:proofErr w:type="spellStart"/>
+      <w:r>
+        <w:t>TextItem</w:t>
+      </w:r>
+      <w:proofErr w:type="spellEnd"/>
+    </w:p>
+    <w:p>
+      <w:pPr>
+        <w:pStyle w:val="ListParagraph"/>
+        <w:numPr>
+          <w:ilvl w:val="0"/>
+          <w:numId w:val="17"/>
+        </w:numPr>
+      </w:pPr>
+      <w:proofErr w:type="spellStart"/>
+      <w:r>
+        <w:t>BitmapItem</w:t>
+      </w:r>
+      <w:proofErr w:type="spellEnd"/>
+    </w:p>
+    <w:p>
+      <w:pPr>
+        <w:pStyle w:val="ListParagraph"/>
+        <w:numPr>
+          <w:ilvl w:val="0"/>
+          <w:numId w:val="17"/>
+        </w:numPr>
+      </w:pPr>
+      <w:r>
+        <w:t>Slide</w:t>
+      </w:r>
+    </w:p>
+    <w:p>
+      <w:r>
+        <w:t>Issue:</w:t>
+      </w:r>
+    </w:p>
+    <w:p>
+      <w:r>
+        <w:rPr>
+          <w:noProof/>
+        </w:rPr>
+        <w:lastRenderedPageBreak/>
+        <mc:AlternateContent>
+          <mc:Choice Requires="wps">
+            <w:drawing>
+              <wp:anchor distT="0" distB="0" distL="114300" distR="114300" simplePos="0" relativeHeight="251663360" behindDoc="0" locked="0" layoutInCell="1" allowOverlap="1" wp14:anchorId="21F9B6B5" wp14:editId="343A869F">
+                <wp:simplePos x="0" y="0"/>
+                <wp:positionH relativeFrom="column">
+                  <wp:posOffset>0</wp:posOffset>
+                </wp:positionH>
+                <wp:positionV relativeFrom="paragraph">
+                  <wp:posOffset>3519170</wp:posOffset>
+                </wp:positionV>
+                <wp:extent cx="6036310" cy="635"/>
+                <wp:effectExtent l="0" t="0" r="0" b="0"/>
+                <wp:wrapThrough wrapText="bothSides">
+                  <wp:wrapPolygon edited="0">
+                    <wp:start x="0" y="0"/>
+                    <wp:lineTo x="0" y="21600"/>
+                    <wp:lineTo x="21600" y="21600"/>
+                    <wp:lineTo x="21600" y="0"/>
+                  </wp:wrapPolygon>
+                </wp:wrapThrough>
+                <wp:docPr id="6" name="Text Box 6"/>
+                <wp:cNvGraphicFramePr/>
+                <a:graphic xmlns:a="http://schemas.openxmlformats.org/drawingml/2006/main">
+                  <a:graphicData uri="http://schemas.microsoft.com/office/word/2010/wordprocessingShape">
+                    <wps:wsp>
+                      <wps:cNvSpPr txBox="1"/>
+                      <wps:spPr>
+                        <a:xfrm>
+                          <a:off x="0" y="0"/>
+                          <a:ext cx="6036310" cy="635"/>
+                        </a:xfrm>
+                        <a:prstGeom prst="rect">
+                          <a:avLst/>
+                        </a:prstGeom>
+                        <a:solidFill>
+                          <a:prstClr val="white"/>
+                        </a:solidFill>
+                        <a:ln>
+                          <a:noFill/>
+                        </a:ln>
+                      </wps:spPr>
+                      <wps:txbx>
+                        <w:txbxContent>
+                          <w:p>
+                            <w:pPr>
+                              <w:pStyle w:val="Caption"/>
+                              <w:rPr>
+                                <w:sz w:val="24"/>
+                                <w:szCs w:val="24"/>
+                              </w:rPr>
+                            </w:pPr>
+                            <w:r>
+                              <w:t xml:space="preserve">Figure </w:t>
+                            </w:r>
+                            <w:fldSimple w:instr=" SEQ Figure \* ARABIC ">
+                              <w:r>
+                                <w:rPr>
+                                  <w:noProof/>
+                                </w:rPr>
+                                <w:t>4</w:t>
+                              </w:r>
+                            </w:fldSimple>
+                            <w:r>
+                              <w:t xml:space="preserve">: Code from </w:t>
+                            </w:r>
+                            <w:proofErr w:type="spellStart"/>
+                            <w:r>
+                              <w:t>XMLAccessor</w:t>
+                            </w:r>
+                            <w:proofErr w:type="spellEnd"/>
+                            <w:r>
+                              <w:t xml:space="preserve"> Class</w:t>
+                            </w:r>
+                          </w:p>
+                        </w:txbxContent>
+                      </wps:txbx>
+                      <wps:bodyPr rot="0" spcFirstLastPara="0" vertOverflow="overflow" horzOverflow="overflow" vert="horz" wrap="square" lIns="0" tIns="0" rIns="0" bIns="0" numCol="1" spcCol="0" rtlCol="0" fromWordArt="0" anchor="t" anchorCtr="0" forceAA="0" compatLnSpc="1">
+                        <a:prstTxWarp prst="textNoShape">
+                          <a:avLst/>
+                        </a:prstTxWarp>
+                        <a:spAutoFit/>
+                      </wps:bodyPr>
+                    </wps:wsp>
+                  </a:graphicData>
+                </a:graphic>
+              </wp:anchor>
+            </w:drawing>
+          </mc:Choice>
+          <mc:Fallback>
+            <w:pict>
+              <v:shape w14:anchorId="21F9B6B5" id="Text Box 6" o:spid="_x0000_s1028" type="#_x0000_t202" style="position:absolute;margin-left:0;margin-top:277.1pt;width:475.3pt;height:.05pt;z-index:251663360;visibility:visible;mso-wrap-style:square;mso-wrap-distance-left:9pt;mso-wrap-distance-top:0;mso-wrap-distance-right:9pt;mso-wrap-distance-bottom:0;mso-position-horizontal:absolute;mso-position-horizontal-relative:text;mso-position-vertical:absolute;mso-position-vertical-relative:text;v-text-anchor:top" o:gfxdata="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" stroked="f">
+                <v:textbox style="mso-fit-shape-to-text:t" inset="0,0,0,0">
+                  <w:txbxContent>
+                    <w:p>
+                      <w:pPr>
+                        <w:pStyle w:val="Caption"/>
+                        <w:rPr>
+                          <w:sz w:val="24"/>
+                          <w:szCs w:val="24"/>
+                        </w:rPr>
+                      </w:pPr>
+                      <w:r>
+                        <w:t xml:space="preserve">Figure </w:t>
+                      </w:r>
+                      <w:fldSimple w:instr=" SEQ Figure \* ARABIC ">
+                        <w:r>
+                          <w:rPr>
+                            <w:noProof/>
+                          </w:rPr>
+                          <w:t>4</w:t>
+                        </w:r>
+                      </w:fldSimple>
+                      <w:r>
+                        <w:t xml:space="preserve">: Code from </w:t>
+                      </w:r>
+                      <w:proofErr w:type="spellStart"/>
+                      <w:r>
+                        <w:t>XMLAccessor</w:t>
+                      </w:r>
+                      <w:proofErr w:type="spellEnd"/>
+                      <w:r>
+                        <w:t xml:space="preserve"> Class</w:t>
+                      </w:r>
+                    </w:p>
+                  </w:txbxContent>
+                </v:textbox>
+                <w10:wrap type="through"/>
+              </v:shape>
+            </w:pict>
+          </mc:Fallback>
+        </mc:AlternateContent>
+      </w:r>
+      <w:r>
+        <w:drawing>
+          <wp:anchor distT="0" distB="0" distL="114300" distR="114300" simplePos="0" relativeHeight="251661312" behindDoc="0" locked="0" layoutInCell="1" allowOverlap="1" wp14:anchorId="3B9E6E16" wp14:editId="0807BCAC">
+            <wp:simplePos x="0" y="0"/>
+            <wp:positionH relativeFrom="margin">
+              <wp:align>left</wp:align>
+            </wp:positionH>
+            <wp:positionV relativeFrom="paragraph">
+              <wp:posOffset>786976</wp:posOffset>
+            </wp:positionV>
+            <wp:extent cx="6036310" cy="2675255"/>
+            <wp:effectExtent l="0" t="0" r="2540" b="0"/>
+            <wp:wrapThrough wrapText="bothSides">
+              <wp:wrapPolygon edited="0">
+                <wp:start x="0" y="0"/>
+                <wp:lineTo x="0" y="21380"/>
+                <wp:lineTo x="21541" y="21380"/>
+                <wp:lineTo x="21541" y="0"/>
+                <wp:lineTo x="0" y="0"/>
+              </wp:wrapPolygon>
+            </wp:wrapThrough>
+            <wp:docPr id="5" name="Picture 5"/>
+            <wp:cNvGraphicFramePr>
+              <a:graphicFrameLocks xmlns:a="http://schemas.openxmlformats.org/drawingml/2006/main" noChangeAspect="1"/>
+            </wp:cNvGraphicFramePr>
+            <a:graphic xmlns:a="http://schemas.openxmlformats.org/drawingml/2006/main">
+              <a:graphicData uri="http://schemas.openxmlformats.org/drawingml/2006/picture">
+                <pic:pic xmlns:pic="http://schemas.openxmlformats.org/drawingml/2006/picture">
+                  <pic:nvPicPr>
+                    <pic:cNvPr id="1" name=""/>
+                    <pic:cNvPicPr/>
+                  </pic:nvPicPr>
+                  <pic:blipFill>
+                    <a:blip r:embed="rId11">
+                      <a:extLst>
+                        <a:ext uri="{28A0092B-C50C-407E-A947-70E740481C1C}">
+                          <a14:useLocalDpi xmlns:a14="http://schemas.microsoft.com/office/drawing/2010/main" val="0"/>
+                        </a:ext>
+                      </a:extLst>
+                    </a:blip>
+                    <a:stretch>
+                      <a:fillRect/>
+                    </a:stretch>
+                  </pic:blipFill>
+                  <pic:spPr>
+                    <a:xfrm>
+                      <a:off x="0" y="0"/>
+                      <a:ext cx="6040884" cy="2677320"/>
+                    </a:xfrm>
+                    <a:prstGeom prst="rect">
+                      <a:avLst/>
+                    </a:prstGeom>
+                  </pic:spPr>
+                </pic:pic>
+              </a:graphicData>
+            </a:graphic>
+            <wp14:sizeRelH relativeFrom="margin">
+              <wp14:pctWidth>0</wp14:pctWidth>
+            </wp14:sizeRelH>
+            <wp14:sizeRelV relativeFrom="margin">
+              <wp14:pctHeight>0</wp14:pctHeight>
+            </wp14:sizeRelV>
+          </wp:anchor>
+        </w:drawing>
+      </w:r>
+      <w:r>
+        <w:t xml:space="preserve">The </w:t>
+      </w:r>
+      <w:proofErr w:type="spellStart"/>
+      <w:r>
+        <w:rPr>
+          <w:color w:val="4C94D8" w:themeColor="text2" w:themeTint="80"/>
+        </w:rPr>
+        <w:t>XMLAccessor</w:t>
+      </w:r>
+      <w:proofErr w:type="spellEnd"/>
+      <w:r>
+        <w:rPr>
+          <w:color w:val="4C94D8" w:themeColor="text2" w:themeTint="80"/>
+        </w:rPr>
+        <w:t xml:space="preserve"> </w:t>
+      </w:r>
+      <w:r>
+        <w:t>class is responsible for several different tasks related to persistence. It handles file reading, XML parsing, and the creation of domain objects. For example, the method that loads slide items contains logic such as:</w:t>
+      </w:r>
+      <w:r>
+        <w:br/>
+      </w:r>
+    </w:p>
+    <w:p>
+      <w:r>
+        <w:t xml:space="preserve">This code shows that the class determines the slide item type and directly instantiates the corresponding objects. As a result, the class combines file access, parsing logic, and object creation. This violates the </w:t>
+      </w:r>
       <w:r>
         <w:rPr>
           <w:b/>
           <w:bCs/>
         </w:rPr>
-        <w:t>Tight Coupling:</w:t>
-      </w:r>
-      <w:r>
-        <w:t xml:space="preserve"> The Presentation class is directly aware of the </w:t>
-      </w:r>
-      <w:proofErr w:type="spellStart"/>
-      <w:r>
-        <w:t>SlideViewerComponent</w:t>
-      </w:r>
-      <w:proofErr w:type="spellEnd"/>
-      <w:r>
-        <w:t>, creating a "leaky" MVC where the model depends on the view.</w:t>
+        <w:t>Single Responsibility Principle</w:t>
+      </w:r>
+      <w:r>
+        <w:t>, since changes in file format, parsing logic, or slide item creation would all require modifications to the same class.</w:t>
+      </w:r>
+    </w:p>
+    <w:p>
+      <w:pPr>
+        <w:pStyle w:val="Heading4"/>
+        <w:numPr>
+          <w:ilvl w:val="0"/>
+          <w:numId w:val="19"/>
+        </w:numPr>
+      </w:pPr>
+      <w:r>
+        <w:t>Violation of the Open-Closed Principle</w:t>
+      </w:r>
+    </w:p>
+    <w:p>
+      <w:r>
+        <w:t>Class involved:</w:t>
       </w:r>
     </w:p>
     <w:p>
@@ -62,42 +1121,112 @@
         <w:pStyle w:val="ListParagraph"/>
         <w:numPr>
           <w:ilvl w:val="0"/>
-          <w:numId w:val="3"/>
+          <w:numId w:val="18"/>
         </w:numPr>
       </w:pPr>
+      <w:proofErr w:type="spellStart"/>
+      <w:r>
+        <w:t>XMLAccessor</w:t>
+      </w:r>
+      <w:proofErr w:type="spellEnd"/>
+    </w:p>
+    <w:p>
+      <w:pPr>
+        <w:pStyle w:val="ListParagraph"/>
+        <w:numPr>
+          <w:ilvl w:val="0"/>
+          <w:numId w:val="18"/>
+        </w:numPr>
+      </w:pPr>
+      <w:proofErr w:type="spellStart"/>
+      <w:r>
+        <w:t>TextItem</w:t>
+      </w:r>
+      <w:proofErr w:type="spellEnd"/>
+    </w:p>
+    <w:p>
+      <w:pPr>
+        <w:pStyle w:val="ListParagraph"/>
+        <w:numPr>
+          <w:ilvl w:val="0"/>
+          <w:numId w:val="18"/>
+        </w:numPr>
+      </w:pPr>
+      <w:proofErr w:type="spellStart"/>
+      <w:r>
+        <w:t>BitmapItem</w:t>
+      </w:r>
+      <w:proofErr w:type="spellEnd"/>
+    </w:p>
+    <w:p>
+      <w:r>
+        <w:t>Issue:</w:t>
+      </w:r>
+    </w:p>
+    <w:p>
+      <w:r>
+        <w:t xml:space="preserve">The system is not easily extensible with new types of slide items. In the </w:t>
+      </w:r>
+      <w:proofErr w:type="spellStart"/>
+      <w:r>
+        <w:rPr>
+          <w:color w:val="4C94D8" w:themeColor="text2" w:themeTint="80"/>
+        </w:rPr>
+        <w:t>XMLAccessor</w:t>
+      </w:r>
+      <w:proofErr w:type="spellEnd"/>
+      <w:r>
+        <w:rPr>
+          <w:color w:val="4C94D8" w:themeColor="text2" w:themeTint="80"/>
+        </w:rPr>
+        <w:t xml:space="preserve"> </w:t>
+      </w:r>
+      <w:r>
+        <w:t>class the type of slide item is determined using conditional statements – refer to Figure 4.</w:t>
+      </w:r>
+    </w:p>
+    <w:p>
+      <w:r>
+        <w:t xml:space="preserve">Figure 4 shows that every time a new slide item type is introduced (for example </w:t>
+      </w:r>
+      <w:proofErr w:type="spellStart"/>
+      <w:r>
+        <w:rPr>
+          <w:color w:val="4C94D8" w:themeColor="text2" w:themeTint="80"/>
+        </w:rPr>
+        <w:t>VideoItem</w:t>
+      </w:r>
+      <w:proofErr w:type="spellEnd"/>
+      <w:r>
+        <w:t xml:space="preserve">) this method must be modified to handle the new case. This violates the Open-Closed Principle which states that software entities should be open for extension but </w:t>
+      </w:r>
       <w:r>
         <w:rPr>
           <w:b/>
           <w:bCs/>
         </w:rPr>
-        <w:t>Lack of Abstraction:</w:t>
-      </w:r>
-      <w:r>
-        <w:t xml:space="preserve"> The </w:t>
-      </w:r>
-      <w:proofErr w:type="spellStart"/>
-      <w:r>
-        <w:t>XMLAccessor</w:t>
-      </w:r>
-      <w:proofErr w:type="spellEnd"/>
-      <w:r>
-        <w:t xml:space="preserve"> class contains hardcoded logic for specific slide items like </w:t>
-      </w:r>
-      <w:proofErr w:type="spellStart"/>
-      <w:r>
-        <w:t>TextItem</w:t>
-      </w:r>
-      <w:proofErr w:type="spellEnd"/>
-      <w:r>
-        <w:t xml:space="preserve"> and </w:t>
-      </w:r>
-      <w:proofErr w:type="spellStart"/>
-      <w:r>
-        <w:t>BitmapItem</w:t>
-      </w:r>
-      <w:proofErr w:type="spellEnd"/>
+        <w:t>closed for modification</w:t>
+      </w:r>
       <w:r>
         <w:t>.</w:t>
+      </w:r>
+    </w:p>
+    <w:p>
+      <w:pPr>
+        <w:pStyle w:val="Heading4"/>
+        <w:numPr>
+          <w:ilvl w:val="0"/>
+          <w:numId w:val="19"/>
+        </w:numPr>
+      </w:pPr>
+      <w:r>
+        <w:lastRenderedPageBreak/>
+        <w:t>Static Configuration in Style Class</w:t>
+      </w:r>
+    </w:p>
+    <w:p>
+      <w:r>
+        <w:t>Classes involved:</w:t>
       </w:r>
     </w:p>
     <w:p>
@@ -105,96 +1234,265 @@
         <w:pStyle w:val="ListParagraph"/>
         <w:numPr>
           <w:ilvl w:val="0"/>
-          <w:numId w:val="3"/>
+          <w:numId w:val="20"/>
         </w:numPr>
       </w:pPr>
+      <w:r>
+        <w:t>Style</w:t>
+      </w:r>
+    </w:p>
+    <w:p>
+      <w:r>
+        <w:t>Issue:</w:t>
+      </w:r>
+    </w:p>
+    <w:p>
+      <w:r>
+        <w:t>The visual styling of slides is managed by the Style class, which uses static fields and hardcoded values to define the available styles. For example:</w:t>
+      </w:r>
+    </w:p>
+    <w:p>
+      <w:r>
+        <w:drawing>
+          <wp:inline distT="0" distB="0" distL="0" distR="0" wp14:anchorId="5BFC9C3B" wp14:editId="5ED8A036">
+            <wp:extent cx="5862104" cy="491066"/>
+            <wp:effectExtent l="0" t="0" r="5715" b="4445"/>
+            <wp:docPr id="9" name="Picture 9"/>
+            <wp:cNvGraphicFramePr>
+              <a:graphicFrameLocks xmlns:a="http://schemas.openxmlformats.org/drawingml/2006/main" noChangeAspect="1"/>
+            </wp:cNvGraphicFramePr>
+            <a:graphic xmlns:a="http://schemas.openxmlformats.org/drawingml/2006/main">
+              <a:graphicData uri="http://schemas.openxmlformats.org/drawingml/2006/picture">
+                <pic:pic xmlns:pic="http://schemas.openxmlformats.org/drawingml/2006/picture">
+                  <pic:nvPicPr>
+                    <pic:cNvPr id="1" name=""/>
+                    <pic:cNvPicPr/>
+                  </pic:nvPicPr>
+                  <pic:blipFill>
+                    <a:blip r:embed="rId12"/>
+                    <a:stretch>
+                      <a:fillRect/>
+                    </a:stretch>
+                  </pic:blipFill>
+                  <pic:spPr>
+                    <a:xfrm>
+                      <a:off x="0" y="0"/>
+                      <a:ext cx="5991897" cy="501939"/>
+                    </a:xfrm>
+                    <a:prstGeom prst="rect">
+                      <a:avLst/>
+                    </a:prstGeom>
+                  </pic:spPr>
+                </pic:pic>
+              </a:graphicData>
+            </a:graphic>
+          </wp:inline>
+        </w:drawing>
+      </w:r>
+    </w:p>
+    <w:p>
+      <w:r>
+        <w:drawing>
+          <wp:inline distT="0" distB="0" distL="0" distR="0" wp14:anchorId="36EFB2CE" wp14:editId="34A9C965">
+            <wp:extent cx="5918200" cy="2053607"/>
+            <wp:effectExtent l="0" t="0" r="6350" b="3810"/>
+            <wp:docPr id="11" name="Picture 11"/>
+            <wp:cNvGraphicFramePr>
+              <a:graphicFrameLocks xmlns:a="http://schemas.openxmlformats.org/drawingml/2006/main" noChangeAspect="1"/>
+            </wp:cNvGraphicFramePr>
+            <a:graphic xmlns:a="http://schemas.openxmlformats.org/drawingml/2006/main">
+              <a:graphicData uri="http://schemas.openxmlformats.org/drawingml/2006/picture">
+                <pic:pic xmlns:pic="http://schemas.openxmlformats.org/drawingml/2006/picture">
+                  <pic:nvPicPr>
+                    <pic:cNvPr id="1" name=""/>
+                    <pic:cNvPicPr/>
+                  </pic:nvPicPr>
+                  <pic:blipFill>
+                    <a:blip r:embed="rId13"/>
+                    <a:stretch>
+                      <a:fillRect/>
+                    </a:stretch>
+                  </pic:blipFill>
+                  <pic:spPr>
+                    <a:xfrm>
+                      <a:off x="0" y="0"/>
+                      <a:ext cx="5932439" cy="2058548"/>
+                    </a:xfrm>
+                    <a:prstGeom prst="rect">
+                      <a:avLst/>
+                    </a:prstGeom>
+                  </pic:spPr>
+                </pic:pic>
+              </a:graphicData>
+            </a:graphic>
+          </wp:inline>
+        </w:drawing>
+      </w:r>
+    </w:p>
+    <w:p>
+      <w:r>
+        <w:t xml:space="preserve">The styles are defined at runtime using fixed values for font size, indentation, and other layout properties. </w:t>
+      </w:r>
+      <w:r>
+        <w:t xml:space="preserve">As these values are </w:t>
+      </w:r>
       <w:r>
         <w:rPr>
           <w:b/>
           <w:bCs/>
         </w:rPr>
-        <w:t>Violations of SOLID:</w:t>
-      </w:r>
-      <w:r>
-        <w:t xml:space="preserve"> </w:t>
-      </w:r>
-      <w:proofErr w:type="spellStart"/>
-      <w:r>
-        <w:t>XMLAccessor</w:t>
-      </w:r>
-      <w:proofErr w:type="spellEnd"/>
-      <w:r>
-        <w:t xml:space="preserve"> handles both file I/O and object instantiation logic.</w:t>
-      </w:r>
-    </w:p>
-    <w:p>
-      <w:pPr>
-        <w:pStyle w:val="ListParagraph"/>
-        <w:numPr>
-          <w:ilvl w:val="1"/>
-          <w:numId w:val="3"/>
-        </w:numPr>
-      </w:pPr>
+        <w:t>hardcoded</w:t>
+      </w:r>
+      <w:r>
+        <w:t xml:space="preserve">, changing the visual appearance of slides requires modifying the sources code and recompiling the application. This </w:t>
+      </w:r>
       <w:r>
         <w:rPr>
           <w:b/>
           <w:bCs/>
         </w:rPr>
-        <w:t>Open-Closed Principle (OCP):</w:t>
-      </w:r>
-      <w:r>
-        <w:t xml:space="preserve"> Adding a new content type (e.g., "</w:t>
-      </w:r>
-      <w:proofErr w:type="spellStart"/>
-      <w:r>
-        <w:t>VideoItem</w:t>
-      </w:r>
-      <w:proofErr w:type="spellEnd"/>
-      <w:r>
-        <w:t xml:space="preserve">") requires modifying the </w:t>
-      </w:r>
-      <w:proofErr w:type="spellStart"/>
-      <w:r>
-        <w:t>saveFile</w:t>
-      </w:r>
-      <w:proofErr w:type="spellEnd"/>
-      <w:r>
-        <w:t xml:space="preserve"> and </w:t>
-      </w:r>
-      <w:proofErr w:type="spellStart"/>
-      <w:r>
-        <w:t>loadSlideItem</w:t>
-      </w:r>
-      <w:proofErr w:type="spellEnd"/>
-      <w:r>
-        <w:t xml:space="preserve"> methods in </w:t>
-      </w:r>
-      <w:proofErr w:type="spellStart"/>
-      <w:r>
-        <w:t>XMLAccessor</w:t>
-      </w:r>
-      <w:proofErr w:type="spellEnd"/>
-      <w:r>
-        <w:t>.</w:t>
-      </w:r>
-    </w:p>
-    <w:p>
-      <w:pPr>
-        <w:pStyle w:val="ListParagraph"/>
-        <w:numPr>
-          <w:ilvl w:val="0"/>
-          <w:numId w:val="3"/>
-        </w:numPr>
-      </w:pPr>
+        <w:t>limits</w:t>
+      </w:r>
+      <w:r>
+        <w:t xml:space="preserve"> flexibility and makes it difficult to support configurable themes or </w:t>
+      </w:r>
       <w:r>
         <w:rPr>
           <w:b/>
           <w:bCs/>
         </w:rPr>
-        <w:t>Static Dependencies:</w:t>
-      </w:r>
-      <w:r>
-        <w:t xml:space="preserve"> The Style class uses static arrays and hardcoded values, making it impossible to change themes without recompiling the code.</w:t>
+        <w:t>dynamic</w:t>
+      </w:r>
+      <w:r>
+        <w:t xml:space="preserve"> styling.</w:t>
+      </w:r>
+    </w:p>
+    <w:p>
+      <w:pPr>
+        <w:pStyle w:val="Heading4"/>
+        <w:numPr>
+          <w:ilvl w:val="0"/>
+          <w:numId w:val="19"/>
+        </w:numPr>
+      </w:pPr>
+      <w:r>
+        <w:t>Direct Dependency on Concrete Persistence Class</w:t>
+      </w:r>
+    </w:p>
+    <w:p>
+      <w:r>
+        <w:t>Classes Involved:</w:t>
+      </w:r>
+    </w:p>
+    <w:p>
+      <w:pPr>
+        <w:pStyle w:val="ListParagraph"/>
+        <w:numPr>
+          <w:ilvl w:val="0"/>
+          <w:numId w:val="20"/>
+        </w:numPr>
+      </w:pPr>
+      <w:proofErr w:type="spellStart"/>
+      <w:r>
+        <w:t>MenuController</w:t>
+      </w:r>
+      <w:proofErr w:type="spellEnd"/>
+    </w:p>
+    <w:p>
+      <w:pPr>
+        <w:pStyle w:val="ListParagraph"/>
+        <w:numPr>
+          <w:ilvl w:val="0"/>
+          <w:numId w:val="20"/>
+        </w:numPr>
+      </w:pPr>
+      <w:proofErr w:type="spellStart"/>
+      <w:r>
+        <w:t>XMLAccessor</w:t>
+      </w:r>
+      <w:proofErr w:type="spellEnd"/>
+    </w:p>
+    <w:p>
+      <w:r>
+        <w:t>Issue:</w:t>
+      </w:r>
+      <w:r>
+        <w:br/>
+        <w:t xml:space="preserve">The </w:t>
+      </w:r>
+      <w:proofErr w:type="spellStart"/>
+      <w:r>
+        <w:t>MenuController</w:t>
+      </w:r>
+      <w:proofErr w:type="spellEnd"/>
+      <w:r>
+        <w:t xml:space="preserve"> class directly instantiates the </w:t>
+      </w:r>
+      <w:proofErr w:type="spellStart"/>
+      <w:r>
+        <w:t>XMLAccessor</w:t>
+      </w:r>
+      <w:proofErr w:type="spellEnd"/>
+      <w:r>
+        <w:t xml:space="preserve"> class when loading or saving presentations. For example:</w:t>
+      </w:r>
+    </w:p>
+    <w:p>
+      <w:r>
+        <w:lastRenderedPageBreak/>
+        <w:drawing>
+          <wp:inline distT="0" distB="0" distL="0" distR="0" wp14:anchorId="5BCB1DB7" wp14:editId="68CD280B">
+            <wp:extent cx="5765800" cy="3669145"/>
+            <wp:effectExtent l="0" t="0" r="6350" b="7620"/>
+            <wp:docPr id="14" name="Picture 14"/>
+            <wp:cNvGraphicFramePr>
+              <a:graphicFrameLocks xmlns:a="http://schemas.openxmlformats.org/drawingml/2006/main" noChangeAspect="1"/>
+            </wp:cNvGraphicFramePr>
+            <a:graphic xmlns:a="http://schemas.openxmlformats.org/drawingml/2006/main">
+              <a:graphicData uri="http://schemas.openxmlformats.org/drawingml/2006/picture">
+                <pic:pic xmlns:pic="http://schemas.openxmlformats.org/drawingml/2006/picture">
+                  <pic:nvPicPr>
+                    <pic:cNvPr id="1" name=""/>
+                    <pic:cNvPicPr/>
+                  </pic:nvPicPr>
+                  <pic:blipFill>
+                    <a:blip r:embed="rId14"/>
+                    <a:stretch>
+                      <a:fillRect/>
+                    </a:stretch>
+                  </pic:blipFill>
+                  <pic:spPr>
+                    <a:xfrm>
+                      <a:off x="0" y="0"/>
+                      <a:ext cx="5789710" cy="3684360"/>
+                    </a:xfrm>
+                    <a:prstGeom prst="rect">
+                      <a:avLst/>
+                    </a:prstGeom>
+                  </pic:spPr>
+                </pic:pic>
+              </a:graphicData>
+            </a:graphic>
+          </wp:inline>
+        </w:drawing>
+      </w:r>
+    </w:p>
+    <w:p>
+      <w:r>
+        <w:t>The controller becomes tightly coupled to the XML implementation. If another storage format or persistence method were introduced, the controller would need to be modified. A more flexible design would depend on abstractions rather than concrete implementations.</w:t>
+      </w:r>
+    </w:p>
+    <w:p>
+      <w:pPr>
+        <w:rPr>
+          <w:rFonts w:asciiTheme="majorHAnsi" w:eastAsiaTheme="majorEastAsia" w:hAnsiTheme="majorHAnsi" w:cstheme="majorBidi"/>
+          <w:color w:val="0F4761" w:themeColor="accent1" w:themeShade="BF"/>
+          <w:sz w:val="40"/>
+          <w:szCs w:val="40"/>
+        </w:rPr>
+      </w:pPr>
+      <w:r>
+        <w:br w:type="page"/>
       </w:r>
     </w:p>
     <w:p>
@@ -204,14 +1502,17 @@
           <w:ilvl w:val="0"/>
           <w:numId w:val="2"/>
         </w:numPr>
-      </w:pPr>
-      <w:r>
+        <w:jc w:val="both"/>
+      </w:pPr>
+      <w:r>
+        <w:lastRenderedPageBreak/>
         <w:t>Architecture Overview (Current System)</w:t>
       </w:r>
     </w:p>
     <w:p>
       <w:pPr>
         <w:pStyle w:val="ListParagraph"/>
+        <w:jc w:val="both"/>
       </w:pPr>
       <w:r>
         <w:t xml:space="preserve">The current architecture follows a </w:t>
@@ -230,6 +1531,7 @@
     <w:p>
       <w:pPr>
         <w:pStyle w:val="ListParagraph"/>
+        <w:jc w:val="both"/>
       </w:pPr>
     </w:p>
     <w:tbl>
@@ -240,9 +1542,9 @@
         <w:tblLook w:val="04A0" w:firstRow="1" w:lastRow="0" w:firstColumn="1" w:lastColumn="0" w:noHBand="0" w:noVBand="1"/>
       </w:tblPr>
       <w:tblGrid>
-        <w:gridCol w:w="2803"/>
         <w:gridCol w:w="2813"/>
-        <w:gridCol w:w="3014"/>
+        <w:gridCol w:w="2819"/>
+        <w:gridCol w:w="2998"/>
       </w:tblGrid>
       <w:tr>
         <w:tc>
@@ -254,6 +1556,7 @@
             <w:pPr>
               <w:pStyle w:val="ListParagraph"/>
               <w:ind w:left="0"/>
+              <w:jc w:val="both"/>
               <w:rPr>
                 <w:b/>
                 <w:bCs/>
@@ -280,6 +1583,7 @@
                 <w:tab w:val="left" w:pos="1896"/>
               </w:tabs>
               <w:ind w:left="0"/>
+              <w:jc w:val="both"/>
               <w:rPr>
                 <w:b/>
                 <w:bCs/>
@@ -303,6 +1607,7 @@
             <w:pPr>
               <w:pStyle w:val="ListParagraph"/>
               <w:ind w:left="0"/>
+              <w:jc w:val="both"/>
               <w:rPr>
                 <w:b/>
                 <w:bCs/>
@@ -327,6 +1632,7 @@
             <w:pPr>
               <w:pStyle w:val="ListParagraph"/>
               <w:ind w:left="0"/>
+              <w:jc w:val="both"/>
               <w:rPr>
                 <w:b/>
                 <w:bCs/>
@@ -349,6 +1655,7 @@
             <w:pPr>
               <w:pStyle w:val="ListParagraph"/>
               <w:ind w:left="0"/>
+              <w:jc w:val="both"/>
             </w:pPr>
             <w:r>
               <w:t>Handles the GUI and drawing logic</w:t>
@@ -363,6 +1670,7 @@
             <w:pPr>
               <w:pStyle w:val="ListParagraph"/>
               <w:ind w:left="0"/>
+              <w:jc w:val="both"/>
             </w:pPr>
             <w:proofErr w:type="spellStart"/>
             <w:r>
@@ -389,6 +1697,7 @@
             <w:pPr>
               <w:pStyle w:val="ListParagraph"/>
               <w:ind w:left="0"/>
+              <w:jc w:val="both"/>
               <w:rPr>
                 <w:b/>
                 <w:bCs/>
@@ -411,6 +1720,7 @@
             <w:pPr>
               <w:pStyle w:val="ListParagraph"/>
               <w:ind w:left="0"/>
+              <w:jc w:val="both"/>
             </w:pPr>
             <w:r>
               <w:t>Translates user input into actions.</w:t>
@@ -425,6 +1735,7 @@
             <w:pPr>
               <w:pStyle w:val="ListParagraph"/>
               <w:ind w:left="0"/>
+              <w:jc w:val="both"/>
             </w:pPr>
             <w:proofErr w:type="spellStart"/>
             <w:r>
@@ -451,6 +1762,7 @@
             <w:pPr>
               <w:pStyle w:val="ListParagraph"/>
               <w:ind w:left="0"/>
+              <w:jc w:val="both"/>
               <w:rPr>
                 <w:b/>
                 <w:bCs/>
@@ -473,6 +1785,7 @@
             <w:pPr>
               <w:pStyle w:val="ListParagraph"/>
               <w:ind w:left="0"/>
+              <w:jc w:val="both"/>
             </w:pPr>
             <w:r>
               <w:t>Manages the data structure of the slideshow</w:t>
@@ -487,6 +1800,7 @@
             <w:pPr>
               <w:pStyle w:val="ListParagraph"/>
               <w:ind w:left="0"/>
+              <w:jc w:val="both"/>
             </w:pPr>
             <w:r>
               <w:t xml:space="preserve">Presentation, Slide, </w:t>
@@ -508,6 +1822,7 @@
             <w:pPr>
               <w:pStyle w:val="ListParagraph"/>
               <w:ind w:left="0"/>
+              <w:jc w:val="both"/>
               <w:rPr>
                 <w:b/>
                 <w:bCs/>
@@ -530,6 +1845,7 @@
             <w:pPr>
               <w:pStyle w:val="ListParagraph"/>
               <w:ind w:left="0"/>
+              <w:jc w:val="both"/>
             </w:pPr>
             <w:r>
               <w:t>Reads/writes files to the disk</w:t>
@@ -544,6 +1860,7 @@
             <w:pPr>
               <w:pStyle w:val="ListParagraph"/>
               <w:ind w:left="0"/>
+              <w:jc w:val="both"/>
             </w:pPr>
             <w:proofErr w:type="spellStart"/>
             <w:r>
@@ -559,381 +1876,8 @@
     </w:tbl>
     <w:p>
       <w:pPr>
-        <w:pStyle w:val="ListParagraph"/>
-      </w:pPr>
-    </w:p>
-    <w:p>
-      <w:pPr>
-        <w:pStyle w:val="ListParagraph"/>
-      </w:pPr>
-    </w:p>
-    <w:p>
-      <w:pPr>
-        <w:pStyle w:val="Heading1"/>
-        <w:numPr>
-          <w:ilvl w:val="0"/>
-          <w:numId w:val="2"/>
-        </w:numPr>
-      </w:pPr>
-      <w:r>
-        <w:lastRenderedPageBreak/>
-        <w:t>Advice for Improvements (Draft Advice)</w:t>
-      </w:r>
-    </w:p>
-    <w:p>
-      <w:pPr>
         <w:spacing w:after="0"/>
-        <w:ind w:left="360"/>
-        <w:rPr>
-          <w:b/>
-          <w:bCs/>
-        </w:rPr>
-      </w:pPr>
-      <w:r>
-        <w:rPr>
-          <w:b/>
-          <w:bCs/>
-        </w:rPr>
-        <w:t>Recommendation A: The Factory</w:t>
-      </w:r>
-      <w:r>
-        <w:rPr>
-          <w:b/>
-          <w:bCs/>
-        </w:rPr>
-        <w:t xml:space="preserve"> Method</w:t>
-      </w:r>
-    </w:p>
-    <w:p>
-      <w:pPr>
-        <w:pStyle w:val="ListParagraph"/>
-        <w:numPr>
-          <w:ilvl w:val="0"/>
-          <w:numId w:val="5"/>
-        </w:numPr>
-        <w:spacing w:after="0"/>
-      </w:pPr>
-      <w:r>
-        <w:rPr>
-          <w:b/>
-          <w:bCs/>
-        </w:rPr>
-        <w:t>Improvement:</w:t>
-      </w:r>
-      <w:r>
-        <w:t xml:space="preserve"> Replace the </w:t>
-      </w:r>
-      <w:r>
-        <w:rPr>
-          <w:b/>
-          <w:bCs/>
-          <w:i/>
-          <w:iCs/>
-        </w:rPr>
-        <w:t>if-else</w:t>
-      </w:r>
-      <w:r>
-        <w:rPr>
-          <w:b/>
-          <w:bCs/>
-        </w:rPr>
-        <w:t xml:space="preserve"> </w:t>
-      </w:r>
-      <w:r>
-        <w:t xml:space="preserve">blocks in </w:t>
-      </w:r>
-      <w:proofErr w:type="spellStart"/>
-      <w:r>
-        <w:t>XMLAccessor</w:t>
-      </w:r>
-      <w:proofErr w:type="spellEnd"/>
-      <w:r>
-        <w:t xml:space="preserve"> with a </w:t>
-      </w:r>
-      <w:proofErr w:type="spellStart"/>
-      <w:r>
-        <w:rPr>
-          <w:b/>
-          <w:bCs/>
-          <w:i/>
-          <w:iCs/>
-        </w:rPr>
-        <w:t>SlideItemFactory</w:t>
-      </w:r>
-      <w:proofErr w:type="spellEnd"/>
-      <w:r>
-        <w:t>.</w:t>
-      </w:r>
-    </w:p>
-    <w:p>
-      <w:pPr>
-        <w:pStyle w:val="ListParagraph"/>
-        <w:numPr>
-          <w:ilvl w:val="0"/>
-          <w:numId w:val="5"/>
-        </w:numPr>
-        <w:spacing w:after="0"/>
-      </w:pPr>
-      <w:r>
-        <w:rPr>
-          <w:b/>
-          <w:bCs/>
-        </w:rPr>
-        <w:t>Benefit:</w:t>
-      </w:r>
-      <w:r>
-        <w:t xml:space="preserve"> This moves the creation logic out of the XML parser. If you add new items, you only update the Factory, leaving the XML logic "Closed for Modification" (OCP).</w:t>
-      </w:r>
-    </w:p>
-    <w:p>
-      <w:pPr>
-        <w:spacing w:after="0"/>
-      </w:pPr>
-    </w:p>
-    <w:p>
-      <w:pPr>
-        <w:spacing w:after="0"/>
-        <w:ind w:left="360"/>
-        <w:rPr>
-          <w:b/>
-          <w:bCs/>
-        </w:rPr>
-      </w:pPr>
-      <w:r>
-        <w:rPr>
-          <w:b/>
-          <w:bCs/>
-        </w:rPr>
-        <w:t>Recommendation B: The Observer Pattern</w:t>
-      </w:r>
-    </w:p>
-    <w:p>
-      <w:pPr>
-        <w:numPr>
-          <w:ilvl w:val="0"/>
-          <w:numId w:val="6"/>
-        </w:numPr>
-        <w:tabs>
-          <w:tab w:val="clear" w:pos="720"/>
-          <w:tab w:val="num" w:pos="1080"/>
-        </w:tabs>
-        <w:spacing w:after="0"/>
-        <w:ind w:left="1080"/>
-      </w:pPr>
-      <w:r>
-        <w:rPr>
-          <w:b/>
-          <w:bCs/>
-        </w:rPr>
-        <w:t>Improvement:</w:t>
-      </w:r>
-      <w:r>
-        <w:t xml:space="preserve"> Make the Presentation an "Observable" and the </w:t>
-      </w:r>
-      <w:proofErr w:type="spellStart"/>
-      <w:r>
-        <w:t>SlideViewerComponent</w:t>
-      </w:r>
-      <w:proofErr w:type="spellEnd"/>
-      <w:r>
-        <w:t xml:space="preserve"> an "Observer."</w:t>
-      </w:r>
-      <w:r>
-        <w:t xml:space="preserve"> – Slide object might need to be observer for a subject (Presentation-</w:t>
-      </w:r>
-      <w:proofErr w:type="spellStart"/>
-      <w:r>
-        <w:t>Slideviewercomponent</w:t>
-      </w:r>
-      <w:proofErr w:type="spellEnd"/>
-      <w:r>
-        <w:t>)</w:t>
-      </w:r>
-    </w:p>
-    <w:p>
-      <w:pPr>
-        <w:numPr>
-          <w:ilvl w:val="0"/>
-          <w:numId w:val="6"/>
-        </w:numPr>
-        <w:tabs>
-          <w:tab w:val="clear" w:pos="720"/>
-          <w:tab w:val="num" w:pos="1080"/>
-        </w:tabs>
-        <w:spacing w:after="0"/>
-        <w:ind w:left="1080"/>
-      </w:pPr>
-      <w:r>
-        <w:rPr>
-          <w:b/>
-          <w:bCs/>
-        </w:rPr>
-        <w:t>Benefit:</w:t>
-      </w:r>
-      <w:r>
-        <w:t xml:space="preserve"> The Presentation will no longer need a direct reference to the GUI. It simply broadcasts "I have changed," and any view can react. This fixes the DIP violation</w:t>
-      </w:r>
-      <w:r>
-        <w:t>.</w:t>
-      </w:r>
-    </w:p>
-    <w:p>
-      <w:pPr>
-        <w:spacing w:after="0"/>
-      </w:pPr>
-    </w:p>
-    <w:p>
-      <w:pPr>
-        <w:spacing w:after="0"/>
-        <w:ind w:firstLine="360"/>
-        <w:rPr>
-          <w:b/>
-          <w:bCs/>
-        </w:rPr>
-      </w:pPr>
-      <w:r>
-        <w:rPr>
-          <w:b/>
-          <w:bCs/>
-        </w:rPr>
-        <w:t xml:space="preserve">Recommendation C: The Strategy Pattern </w:t>
-      </w:r>
-    </w:p>
-    <w:p>
-      <w:pPr>
-        <w:numPr>
-          <w:ilvl w:val="0"/>
-          <w:numId w:val="7"/>
-        </w:numPr>
-        <w:tabs>
-          <w:tab w:val="num" w:pos="720"/>
-        </w:tabs>
-        <w:spacing w:after="0"/>
-      </w:pPr>
-      <w:r>
-        <w:rPr>
-          <w:b/>
-          <w:bCs/>
-        </w:rPr>
-        <w:t>Improvement:</w:t>
-      </w:r>
-      <w:r>
-        <w:t xml:space="preserve"> Use a Strategy pattern for the Accessor classes.</w:t>
-      </w:r>
-    </w:p>
-    <w:p>
-      <w:pPr>
-        <w:numPr>
-          <w:ilvl w:val="0"/>
-          <w:numId w:val="7"/>
-        </w:numPr>
-        <w:tabs>
-          <w:tab w:val="num" w:pos="720"/>
-        </w:tabs>
-        <w:spacing w:after="0"/>
-      </w:pPr>
-      <w:r>
-        <w:rPr>
-          <w:b/>
-          <w:bCs/>
-        </w:rPr>
-        <w:t>Benefit:</w:t>
-      </w:r>
-      <w:r>
-        <w:t xml:space="preserve"> Currently, switching from XML to another format (like JSON or Markdown) is difficult. A Strategy pattern allows the application to swap data-loading "strategies" at runtime without changing the main Presentation logic.</w:t>
-      </w:r>
-    </w:p>
-    <w:p>
-      <w:pPr>
-        <w:spacing w:after="0"/>
-      </w:pPr>
-    </w:p>
-    <w:p>
-      <w:pPr>
-        <w:spacing w:after="0"/>
-        <w:ind w:left="360"/>
-        <w:rPr>
-          <w:b/>
-          <w:bCs/>
-        </w:rPr>
-      </w:pPr>
-      <w:r>
-        <w:rPr>
-          <w:b/>
-          <w:bCs/>
-        </w:rPr>
-        <w:t>Recommendation D: Composite Pattern</w:t>
-      </w:r>
-    </w:p>
-    <w:p>
-      <w:pPr>
-        <w:numPr>
-          <w:ilvl w:val="0"/>
-          <w:numId w:val="8"/>
-        </w:numPr>
-        <w:tabs>
-          <w:tab w:val="clear" w:pos="720"/>
-          <w:tab w:val="num" w:pos="1080"/>
-        </w:tabs>
-        <w:spacing w:after="0"/>
-        <w:ind w:left="1080"/>
-      </w:pPr>
-      <w:r>
-        <w:rPr>
-          <w:b/>
-          <w:bCs/>
-        </w:rPr>
-        <w:t>Improvement:</w:t>
-      </w:r>
-      <w:r>
-        <w:t xml:space="preserve"> Treat Slide and </w:t>
-      </w:r>
-      <w:proofErr w:type="spellStart"/>
-      <w:r>
-        <w:t>SlideItem</w:t>
-      </w:r>
-      <w:proofErr w:type="spellEnd"/>
-      <w:r>
-        <w:t xml:space="preserve"> as a composite structure.</w:t>
-      </w:r>
-    </w:p>
-    <w:p>
-      <w:pPr>
-        <w:numPr>
-          <w:ilvl w:val="0"/>
-          <w:numId w:val="8"/>
-        </w:numPr>
-        <w:tabs>
-          <w:tab w:val="clear" w:pos="720"/>
-          <w:tab w:val="num" w:pos="1080"/>
-        </w:tabs>
-        <w:spacing w:after="0"/>
-        <w:ind w:left="1080"/>
-      </w:pPr>
-      <w:r>
-        <w:rPr>
-          <w:b/>
-          <w:bCs/>
-        </w:rPr>
-        <w:t>Benefit:</w:t>
-      </w:r>
-      <w:r>
-        <w:t xml:space="preserve"> This simplifies the draw() and save() logic, as the system can treat a single item and a group of items the same way, increasing </w:t>
-      </w:r>
-      <w:r>
-        <w:rPr>
-          <w:b/>
-          <w:bCs/>
-        </w:rPr>
-        <w:t>Consistency</w:t>
-      </w:r>
-      <w:r>
-        <w:t>.</w:t>
-      </w:r>
-    </w:p>
-    <w:p>
-      <w:pPr>
-        <w:spacing w:after="0"/>
+        <w:jc w:val="both"/>
       </w:pPr>
     </w:p>
     <w:sectPr>
@@ -946,9 +1890,172 @@
 </w:document>
 </file>
 
+<file path=word/endnotes.xml><?xml version="1.0" encoding="utf-8"?>
+<w:endnotes xmlns:wpc="http://schemas.microsoft.com/office/word/2010/wordprocessingCanvas" xmlns:cx="http://schemas.microsoft.com/office/drawing/2014/chartex" xmlns:cx1="http://schemas.microsoft.com/office/drawing/2015/9/8/chartex" xmlns:cx2="http://schemas.microsoft.com/office/drawing/2015/10/21/chartex" xmlns:cx3="http://schemas.microsoft.com/office/drawing/2016/5/9/chartex" xmlns:cx4="http://schemas.microsoft.com/office/drawing/2016/5/10/chartex" xmlns:cx5="http://schemas.microsoft.com/office/drawing/2016/5/11/chartex" xmlns:cx6="http://schemas.microsoft.com/office/drawing/2016/5/12/chartex" xmlns:cx7="http://schemas.microsoft.com/office/drawing/2016/5/13/chartex" xmlns:cx8="http://schemas.microsoft.com/office/drawing/2016/5/14/chartex" xmlns:mc="http://schemas.openxmlformats.org/markup-compatibility/2006" xmlns:aink="http://schemas.microsoft.com/office/drawing/2016/ink" xmlns:am3d="http://schemas.microsoft.com/office/drawing/2017/model3d" xmlns:o="urn:schemas-microsoft-com:office:office" xmlns:r="http://schemas.openxmlformats.org/officeDocument/2006/relationships" xmlns:m="http://schemas.openxmlformats.org/officeDocument/2006/math" xmlns:v="urn:schemas-microsoft-com:vml" xmlns:wp14="http://schemas.microsoft.com/office/word/2010/wordprocessingDrawing" xmlns:wp="http://schemas.openxmlformats.org/drawingml/2006/wordprocessingDrawing" xmlns:w10="urn:schemas-microsoft-com:office:word" xmlns:w="http://schemas.openxmlformats.org/wordprocessingml/2006/main" xmlns:w14="http://schemas.microsoft.com/office/word/2010/wordml" xmlns:w15="http://schemas.microsoft.com/office/word/2012/wordml" xmlns:w16cex="http://schemas.microsoft.com/office/word/2018/wordml/cex" xmlns:w16cid="http://schemas.microsoft.com/office/word/2016/wordml/cid" xmlns:w16="http://schemas.microsoft.com/office/word/2018/wordml" xmlns:w16sdtdh="http://schemas.microsoft.com/office/word/2020/wordml/sdtdatahash" xmlns:w16se="http://schemas.microsoft.com/office/word/2015/wordml/symex" xmlns:wpg="http://schemas.microsoft.com/office/word/2010/wordprocessingGroup" xmlns:wpi="http://schemas.microsoft.com/office/word/2010/wordprocessingInk" xmlns:wne="http://schemas.microsoft.com/office/word/2006/wordml" xmlns:wps="http://schemas.microsoft.com/office/word/2010/wordprocessingShape" mc:Ignorable="w14 w15 w16se w16cid w16 w16cex w16sdtdh wp14">
+  <w:endnote w:type="separator" w:id="-1">
+    <w:p>
+      <w:pPr>
+        <w:spacing w:after="0" w:line="240" w:lineRule="auto"/>
+      </w:pPr>
+      <w:r>
+        <w:separator/>
+      </w:r>
+    </w:p>
+  </w:endnote>
+  <w:endnote w:type="continuationSeparator" w:id="0">
+    <w:p>
+      <w:pPr>
+        <w:spacing w:after="0" w:line="240" w:lineRule="auto"/>
+      </w:pPr>
+      <w:r>
+        <w:continuationSeparator/>
+      </w:r>
+    </w:p>
+  </w:endnote>
+</w:endnotes>
+</file>
+
+<file path=word/footnotes.xml><?xml version="1.0" encoding="utf-8"?>
+<w:footnotes xmlns:wpc="http://schemas.microsoft.com/office/word/2010/wordprocessingCanvas" xmlns:cx="http://schemas.microsoft.com/office/drawing/2014/chartex" xmlns:cx1="http://schemas.microsoft.com/office/drawing/2015/9/8/chartex" xmlns:cx2="http://schemas.microsoft.com/office/drawing/2015/10/21/chartex" xmlns:cx3="http://schemas.microsoft.com/office/drawing/2016/5/9/chartex" xmlns:cx4="http://schemas.microsoft.com/office/drawing/2016/5/10/chartex" xmlns:cx5="http://schemas.microsoft.com/office/drawing/2016/5/11/chartex" xmlns:cx6="http://schemas.microsoft.com/office/drawing/2016/5/12/chartex" xmlns:cx7="http://schemas.microsoft.com/office/drawing/2016/5/13/chartex" xmlns:cx8="http://schemas.microsoft.com/office/drawing/2016/5/14/chartex" xmlns:mc="http://schemas.openxmlformats.org/markup-compatibility/2006" xmlns:aink="http://schemas.microsoft.com/office/drawing/2016/ink" xmlns:am3d="http://schemas.microsoft.com/office/drawing/2017/model3d" xmlns:o="urn:schemas-microsoft-com:office:office" xmlns:r="http://schemas.openxmlformats.org/officeDocument/2006/relationships" xmlns:m="http://schemas.openxmlformats.org/officeDocument/2006/math" xmlns:v="urn:schemas-microsoft-com:vml" xmlns:wp14="http://schemas.microsoft.com/office/word/2010/wordprocessingDrawing" xmlns:wp="http://schemas.openxmlformats.org/drawingml/2006/wordprocessingDrawing" xmlns:w10="urn:schemas-microsoft-com:office:word" xmlns:w="http://schemas.openxmlformats.org/wordprocessingml/2006/main" xmlns:w14="http://schemas.microsoft.com/office/word/2010/wordml" xmlns:w15="http://schemas.microsoft.com/office/word/2012/wordml" xmlns:w16cex="http://schemas.microsoft.com/office/word/2018/wordml/cex" xmlns:w16cid="http://schemas.microsoft.com/office/word/2016/wordml/cid" xmlns:w16="http://schemas.microsoft.com/office/word/2018/wordml" xmlns:w16sdtdh="http://schemas.microsoft.com/office/word/2020/wordml/sdtdatahash" xmlns:w16se="http://schemas.microsoft.com/office/word/2015/wordml/symex" xmlns:wpg="http://schemas.microsoft.com/office/word/2010/wordprocessingGroup" xmlns:wpi="http://schemas.microsoft.com/office/word/2010/wordprocessingInk" xmlns:wne="http://schemas.microsoft.com/office/word/2006/wordml" xmlns:wps="http://schemas.microsoft.com/office/word/2010/wordprocessingShape" mc:Ignorable="w14 w15 w16se w16cid w16 w16cex w16sdtdh wp14">
+  <w:footnote w:type="separator" w:id="-1">
+    <w:p>
+      <w:pPr>
+        <w:spacing w:after="0" w:line="240" w:lineRule="auto"/>
+      </w:pPr>
+      <w:r>
+        <w:separator/>
+      </w:r>
+    </w:p>
+  </w:footnote>
+  <w:footnote w:type="continuationSeparator" w:id="0">
+    <w:p>
+      <w:pPr>
+        <w:spacing w:after="0" w:line="240" w:lineRule="auto"/>
+      </w:pPr>
+      <w:r>
+        <w:continuationSeparator/>
+      </w:r>
+    </w:p>
+  </w:footnote>
+</w:footnotes>
+</file>
+
 <file path=word/numbering.xml><?xml version="1.0" encoding="utf-8"?>
-<w:numbering xmlns:wpc="http://schemas.microsoft.com/office/word/2010/wordprocessingCanvas" xmlns:cx="http://schemas.microsoft.com/office/drawing/2014/chartex" xmlns:cx1="http://schemas.microsoft.com/office/drawing/2015/9/8/chartex" xmlns:cx2="http://schemas.microsoft.com/office/drawing/2015/10/21/chartex" xmlns:cx3="http://schemas.microsoft.com/office/drawing/2016/5/9/chartex" xmlns:cx4="http://schemas.microsoft.com/office/drawing/2016/5/10/chartex" xmlns:cx5="http://schemas.microsoft.com/office/drawing/2016/5/11/chartex" xmlns:cx6="http://schemas.microsoft.com/office/drawing/2016/5/12/chartex" xmlns:cx7="http://schemas.microsoft.com/office/drawing/2016/5/13/chartex" xmlns:cx8="http://schemas.microsoft.com/office/drawing/2016/5/14/chartex" xmlns:mc="http://schemas.openxmlformats.org/markup-compatibility/2006" xmlns:aink="http://schemas.microsoft.com/office/drawing/2016/ink" xmlns:am3d="http://schemas.microsoft.com/office/drawing/2017/model3d" xmlns:o="urn:schemas-microsoft-com:office:office" xmlns:oel="http://schemas.microsoft.com/office/2019/extlst" xmlns:r="http://schemas.openxmlformats.org/officeDocument/2006/relationships" xmlns:m="http://schemas.openxmlformats.org/officeDocument/2006/math" xmlns:v="urn:schemas-microsoft-com:vml" xmlns:wp14="http://schemas.microsoft.com/office/word/2010/wordprocessingDrawing" xmlns:wp="http://schemas.openxmlformats.org/drawingml/2006/wordprocessingDrawing" xmlns:w10="urn:schemas-microsoft-com:office:word" xmlns:w="http://schemas.openxmlformats.org/wordprocessingml/2006/main" xmlns:w14="http://schemas.microsoft.com/office/word/2010/wordml" xmlns:w15="http://schemas.microsoft.com/office/word/2012/wordml" xmlns:w16cex="http://schemas.microsoft.com/office/word/2018/wordml/cex" xmlns:w16cid="http://schemas.microsoft.com/office/word/2016/wordml/cid" xmlns:w16="http://schemas.microsoft.com/office/word/2018/wordml" xmlns:w16du="http://schemas.microsoft.com/office/word/2023/wordml/word16du" xmlns:w16sdtdh="http://schemas.microsoft.com/office/word/2020/wordml/sdtdatahash" xmlns:w16sdtfl="http://schemas.microsoft.com/office/word/2024/wordml/sdtformatlock" xmlns:w16se="http://schemas.microsoft.com/office/word/2015/wordml/symex" xmlns:wpg="http://schemas.microsoft.com/office/word/2010/wordprocessingGroup" xmlns:wpi="http://schemas.microsoft.com/office/word/2010/wordprocessingInk" xmlns:wne="http://schemas.microsoft.com/office/word/2006/wordml" xmlns:wps="http://schemas.microsoft.com/office/word/2010/wordprocessingShape" mc:Ignorable="w14 w15 w16se w16cid w16 w16cex w16sdtdh w16sdtfl w16du wp14">
+<w:numbering xmlns:wpc="http://schemas.microsoft.com/office/word/2010/wordprocessingCanvas" xmlns:cx="http://schemas.microsoft.com/office/drawing/2014/chartex" xmlns:cx1="http://schemas.microsoft.com/office/drawing/2015/9/8/chartex" xmlns:cx2="http://schemas.microsoft.com/office/drawing/2015/10/21/chartex" xmlns:cx3="http://schemas.microsoft.com/office/drawing/2016/5/9/chartex" xmlns:cx4="http://schemas.microsoft.com/office/drawing/2016/5/10/chartex" xmlns:cx5="http://schemas.microsoft.com/office/drawing/2016/5/11/chartex" xmlns:cx6="http://schemas.microsoft.com/office/drawing/2016/5/12/chartex" xmlns:cx7="http://schemas.microsoft.com/office/drawing/2016/5/13/chartex" xmlns:cx8="http://schemas.microsoft.com/office/drawing/2016/5/14/chartex" xmlns:mc="http://schemas.openxmlformats.org/markup-compatibility/2006" xmlns:aink="http://schemas.microsoft.com/office/drawing/2016/ink" xmlns:am3d="http://schemas.microsoft.com/office/drawing/2017/model3d" xmlns:o="urn:schemas-microsoft-com:office:office" xmlns:r="http://schemas.openxmlformats.org/officeDocument/2006/relationships" xmlns:m="http://schemas.openxmlformats.org/officeDocument/2006/math" xmlns:v="urn:schemas-microsoft-com:vml" xmlns:wp14="http://schemas.microsoft.com/office/word/2010/wordprocessingDrawing" xmlns:wp="http://schemas.openxmlformats.org/drawingml/2006/wordprocessingDrawing" xmlns:w10="urn:schemas-microsoft-com:office:word" xmlns:w="http://schemas.openxmlformats.org/wordprocessingml/2006/main" xmlns:w14="http://schemas.microsoft.com/office/word/2010/wordml" xmlns:w15="http://schemas.microsoft.com/office/word/2012/wordml" xmlns:w16cex="http://schemas.microsoft.com/office/word/2018/wordml/cex" xmlns:w16cid="http://schemas.microsoft.com/office/word/2016/wordml/cid" xmlns:w16="http://schemas.microsoft.com/office/word/2018/wordml" xmlns:w16sdtdh="http://schemas.microsoft.com/office/word/2020/wordml/sdtdatahash" xmlns:w16se="http://schemas.microsoft.com/office/word/2015/wordml/symex" xmlns:wpg="http://schemas.microsoft.com/office/word/2010/wordprocessingGroup" xmlns:wpi="http://schemas.microsoft.com/office/word/2010/wordprocessingInk" xmlns:wne="http://schemas.microsoft.com/office/word/2006/wordml" xmlns:wps="http://schemas.microsoft.com/office/word/2010/wordprocessingShape" mc:Ignorable="w14 w15 w16se w16cid w16 w16cex w16sdtdh wp14">
   <w:abstractNum w:abstractNumId="0" w15:restartNumberingAfterBreak="0">
+    <w:nsid w:val="06256CF1"/>
+    <w:multiLevelType w:val="hybridMultilevel"/>
+    <w:tmpl w:val="422C13FC"/>
+    <w:lvl w:ilvl="0" w:tplc="D35E7872">
+      <w:start w:val="1"/>
+      <w:numFmt w:val="bullet"/>
+      <w:lvlText w:val="-"/>
+      <w:lvlJc w:val="left"/>
+      <w:pPr>
+        <w:ind w:left="1080" w:hanging="360"/>
+      </w:pPr>
+      <w:rPr>
+        <w:rFonts w:ascii="Aptos" w:eastAsiaTheme="minorHAnsi" w:hAnsi="Aptos" w:cstheme="minorBidi" w:hint="default"/>
+      </w:rPr>
+    </w:lvl>
+    <w:lvl w:ilvl="1" w:tplc="10000003" w:tentative="1">
+      <w:start w:val="1"/>
+      <w:numFmt w:val="bullet"/>
+      <w:lvlText w:val="o"/>
+      <w:lvlJc w:val="left"/>
+      <w:pPr>
+        <w:ind w:left="1800" w:hanging="360"/>
+      </w:pPr>
+      <w:rPr>
+        <w:rFonts w:ascii="Courier New" w:hAnsi="Courier New" w:cs="Courier New" w:hint="default"/>
+      </w:rPr>
+    </w:lvl>
+    <w:lvl w:ilvl="2" w:tplc="10000005" w:tentative="1">
+      <w:start w:val="1"/>
+      <w:numFmt w:val="bullet"/>
+      <w:lvlText w:val=""/>
+      <w:lvlJc w:val="left"/>
+      <w:pPr>
+        <w:ind w:left="2520" w:hanging="360"/>
+      </w:pPr>
+      <w:rPr>
+        <w:rFonts w:ascii="Wingdings" w:hAnsi="Wingdings" w:hint="default"/>
+      </w:rPr>
+    </w:lvl>
+    <w:lvl w:ilvl="3" w:tplc="10000001" w:tentative="1">
+      <w:start w:val="1"/>
+      <w:numFmt w:val="bullet"/>
+      <w:lvlText w:val=""/>
+      <w:lvlJc w:val="left"/>
+      <w:pPr>
+        <w:ind w:left="3240" w:hanging="360"/>
+      </w:pPr>
+      <w:rPr>
+        <w:rFonts w:ascii="Symbol" w:hAnsi="Symbol" w:hint="default"/>
+      </w:rPr>
+    </w:lvl>
+    <w:lvl w:ilvl="4" w:tplc="10000003" w:tentative="1">
+      <w:start w:val="1"/>
+      <w:numFmt w:val="bullet"/>
+      <w:lvlText w:val="o"/>
+      <w:lvlJc w:val="left"/>
+      <w:pPr>
+        <w:ind w:left="3960" w:hanging="360"/>
+      </w:pPr>
+      <w:rPr>
+        <w:rFonts w:ascii="Courier New" w:hAnsi="Courier New" w:cs="Courier New" w:hint="default"/>
+      </w:rPr>
+    </w:lvl>
+    <w:lvl w:ilvl="5" w:tplc="10000005" w:tentative="1">
+      <w:start w:val="1"/>
+      <w:numFmt w:val="bullet"/>
+      <w:lvlText w:val=""/>
+      <w:lvlJc w:val="left"/>
+      <w:pPr>
+        <w:ind w:left="4680" w:hanging="360"/>
+      </w:pPr>
+      <w:rPr>
+        <w:rFonts w:ascii="Wingdings" w:hAnsi="Wingdings" w:hint="default"/>
+      </w:rPr>
+    </w:lvl>
+    <w:lvl w:ilvl="6" w:tplc="10000001" w:tentative="1">
+      <w:start w:val="1"/>
+      <w:numFmt w:val="bullet"/>
+      <w:lvlText w:val=""/>
+      <w:lvlJc w:val="left"/>
+      <w:pPr>
+        <w:ind w:left="5400" w:hanging="360"/>
+      </w:pPr>
+      <w:rPr>
+        <w:rFonts w:ascii="Symbol" w:hAnsi="Symbol" w:hint="default"/>
+      </w:rPr>
+    </w:lvl>
+    <w:lvl w:ilvl="7" w:tplc="10000003" w:tentative="1">
+      <w:start w:val="1"/>
+      <w:numFmt w:val="bullet"/>
+      <w:lvlText w:val="o"/>
+      <w:lvlJc w:val="left"/>
+      <w:pPr>
+        <w:ind w:left="6120" w:hanging="360"/>
+      </w:pPr>
+      <w:rPr>
+        <w:rFonts w:ascii="Courier New" w:hAnsi="Courier New" w:cs="Courier New" w:hint="default"/>
+      </w:rPr>
+    </w:lvl>
+    <w:lvl w:ilvl="8" w:tplc="10000005" w:tentative="1">
+      <w:start w:val="1"/>
+      <w:numFmt w:val="bullet"/>
+      <w:lvlText w:val=""/>
+      <w:lvlJc w:val="left"/>
+      <w:pPr>
+        <w:ind w:left="6840" w:hanging="360"/>
+      </w:pPr>
+      <w:rPr>
+        <w:rFonts w:ascii="Wingdings" w:hAnsi="Wingdings" w:hint="default"/>
+      </w:rPr>
+    </w:lvl>
+  </w:abstractNum>
+  <w:abstractNum w:abstractNumId="1" w15:restartNumberingAfterBreak="0">
     <w:nsid w:val="07E50CB6"/>
     <w:multiLevelType w:val="multilevel"/>
     <w:tmpl w:val="B9B4C3C6"/>
@@ -1097,7 +2204,545 @@
       </w:rPr>
     </w:lvl>
   </w:abstractNum>
-  <w:abstractNum w:abstractNumId="1" w15:restartNumberingAfterBreak="0">
+  <w:abstractNum w:abstractNumId="2" w15:restartNumberingAfterBreak="0">
+    <w:nsid w:val="0DB20C9E"/>
+    <w:multiLevelType w:val="hybridMultilevel"/>
+    <w:tmpl w:val="9A367258"/>
+    <w:lvl w:ilvl="0" w:tplc="375052AA">
+      <w:start w:val="1"/>
+      <w:numFmt w:val="bullet"/>
+      <w:lvlText w:val="-"/>
+      <w:lvlJc w:val="left"/>
+      <w:pPr>
+        <w:ind w:left="720" w:hanging="360"/>
+      </w:pPr>
+      <w:rPr>
+        <w:rFonts w:ascii="Aptos" w:eastAsiaTheme="minorHAnsi" w:hAnsi="Aptos" w:cstheme="minorBidi" w:hint="default"/>
+      </w:rPr>
+    </w:lvl>
+    <w:lvl w:ilvl="1" w:tplc="10000003">
+      <w:start w:val="1"/>
+      <w:numFmt w:val="bullet"/>
+      <w:lvlText w:val="o"/>
+      <w:lvlJc w:val="left"/>
+      <w:pPr>
+        <w:ind w:left="1440" w:hanging="360"/>
+      </w:pPr>
+      <w:rPr>
+        <w:rFonts w:ascii="Courier New" w:hAnsi="Courier New" w:cs="Courier New" w:hint="default"/>
+      </w:rPr>
+    </w:lvl>
+    <w:lvl w:ilvl="2" w:tplc="10000005" w:tentative="1">
+      <w:start w:val="1"/>
+      <w:numFmt w:val="bullet"/>
+      <w:lvlText w:val=""/>
+      <w:lvlJc w:val="left"/>
+      <w:pPr>
+        <w:ind w:left="2160" w:hanging="360"/>
+      </w:pPr>
+      <w:rPr>
+        <w:rFonts w:ascii="Wingdings" w:hAnsi="Wingdings" w:hint="default"/>
+      </w:rPr>
+    </w:lvl>
+    <w:lvl w:ilvl="3" w:tplc="10000001" w:tentative="1">
+      <w:start w:val="1"/>
+      <w:numFmt w:val="bullet"/>
+      <w:lvlText w:val=""/>
+      <w:lvlJc w:val="left"/>
+      <w:pPr>
+        <w:ind w:left="2880" w:hanging="360"/>
+      </w:pPr>
+      <w:rPr>
+        <w:rFonts w:ascii="Symbol" w:hAnsi="Symbol" w:hint="default"/>
+      </w:rPr>
+    </w:lvl>
+    <w:lvl w:ilvl="4" w:tplc="10000003" w:tentative="1">
+      <w:start w:val="1"/>
+      <w:numFmt w:val="bullet"/>
+      <w:lvlText w:val="o"/>
+      <w:lvlJc w:val="left"/>
+      <w:pPr>
+        <w:ind w:left="3600" w:hanging="360"/>
+      </w:pPr>
+      <w:rPr>
+        <w:rFonts w:ascii="Courier New" w:hAnsi="Courier New" w:cs="Courier New" w:hint="default"/>
+      </w:rPr>
+    </w:lvl>
+    <w:lvl w:ilvl="5" w:tplc="10000005" w:tentative="1">
+      <w:start w:val="1"/>
+      <w:numFmt w:val="bullet"/>
+      <w:lvlText w:val=""/>
+      <w:lvlJc w:val="left"/>
+      <w:pPr>
+        <w:ind w:left="4320" w:hanging="360"/>
+      </w:pPr>
+      <w:rPr>
+        <w:rFonts w:ascii="Wingdings" w:hAnsi="Wingdings" w:hint="default"/>
+      </w:rPr>
+    </w:lvl>
+    <w:lvl w:ilvl="6" w:tplc="10000001" w:tentative="1">
+      <w:start w:val="1"/>
+      <w:numFmt w:val="bullet"/>
+      <w:lvlText w:val=""/>
+      <w:lvlJc w:val="left"/>
+      <w:pPr>
+        <w:ind w:left="5040" w:hanging="360"/>
+      </w:pPr>
+      <w:rPr>
+        <w:rFonts w:ascii="Symbol" w:hAnsi="Symbol" w:hint="default"/>
+      </w:rPr>
+    </w:lvl>
+    <w:lvl w:ilvl="7" w:tplc="10000003" w:tentative="1">
+      <w:start w:val="1"/>
+      <w:numFmt w:val="bullet"/>
+      <w:lvlText w:val="o"/>
+      <w:lvlJc w:val="left"/>
+      <w:pPr>
+        <w:ind w:left="5760" w:hanging="360"/>
+      </w:pPr>
+      <w:rPr>
+        <w:rFonts w:ascii="Courier New" w:hAnsi="Courier New" w:cs="Courier New" w:hint="default"/>
+      </w:rPr>
+    </w:lvl>
+    <w:lvl w:ilvl="8" w:tplc="10000005" w:tentative="1">
+      <w:start w:val="1"/>
+      <w:numFmt w:val="bullet"/>
+      <w:lvlText w:val=""/>
+      <w:lvlJc w:val="left"/>
+      <w:pPr>
+        <w:ind w:left="6480" w:hanging="360"/>
+      </w:pPr>
+      <w:rPr>
+        <w:rFonts w:ascii="Wingdings" w:hAnsi="Wingdings" w:hint="default"/>
+      </w:rPr>
+    </w:lvl>
+  </w:abstractNum>
+  <w:abstractNum w:abstractNumId="3" w15:restartNumberingAfterBreak="0">
+    <w:nsid w:val="0F7B0B2B"/>
+    <w:multiLevelType w:val="hybridMultilevel"/>
+    <w:tmpl w:val="739E06F6"/>
+    <w:lvl w:ilvl="0" w:tplc="F6D4A3CC">
+      <w:start w:val="1"/>
+      <w:numFmt w:val="bullet"/>
+      <w:lvlText w:val="-"/>
+      <w:lvlJc w:val="left"/>
+      <w:pPr>
+        <w:ind w:left="720" w:hanging="360"/>
+      </w:pPr>
+      <w:rPr>
+        <w:rFonts w:ascii="Consolas" w:eastAsiaTheme="minorHAnsi" w:hAnsi="Consolas" w:cstheme="minorBidi" w:hint="default"/>
+      </w:rPr>
+    </w:lvl>
+    <w:lvl w:ilvl="1" w:tplc="10000003" w:tentative="1">
+      <w:start w:val="1"/>
+      <w:numFmt w:val="bullet"/>
+      <w:lvlText w:val="o"/>
+      <w:lvlJc w:val="left"/>
+      <w:pPr>
+        <w:ind w:left="1440" w:hanging="360"/>
+      </w:pPr>
+      <w:rPr>
+        <w:rFonts w:ascii="Courier New" w:hAnsi="Courier New" w:cs="Courier New" w:hint="default"/>
+      </w:rPr>
+    </w:lvl>
+    <w:lvl w:ilvl="2" w:tplc="10000005" w:tentative="1">
+      <w:start w:val="1"/>
+      <w:numFmt w:val="bullet"/>
+      <w:lvlText w:val=""/>
+      <w:lvlJc w:val="left"/>
+      <w:pPr>
+        <w:ind w:left="2160" w:hanging="360"/>
+      </w:pPr>
+      <w:rPr>
+        <w:rFonts w:ascii="Wingdings" w:hAnsi="Wingdings" w:hint="default"/>
+      </w:rPr>
+    </w:lvl>
+    <w:lvl w:ilvl="3" w:tplc="10000001" w:tentative="1">
+      <w:start w:val="1"/>
+      <w:numFmt w:val="bullet"/>
+      <w:lvlText w:val=""/>
+      <w:lvlJc w:val="left"/>
+      <w:pPr>
+        <w:ind w:left="2880" w:hanging="360"/>
+      </w:pPr>
+      <w:rPr>
+        <w:rFonts w:ascii="Symbol" w:hAnsi="Symbol" w:hint="default"/>
+      </w:rPr>
+    </w:lvl>
+    <w:lvl w:ilvl="4" w:tplc="10000003" w:tentative="1">
+      <w:start w:val="1"/>
+      <w:numFmt w:val="bullet"/>
+      <w:lvlText w:val="o"/>
+      <w:lvlJc w:val="left"/>
+      <w:pPr>
+        <w:ind w:left="3600" w:hanging="360"/>
+      </w:pPr>
+      <w:rPr>
+        <w:rFonts w:ascii="Courier New" w:hAnsi="Courier New" w:cs="Courier New" w:hint="default"/>
+      </w:rPr>
+    </w:lvl>
+    <w:lvl w:ilvl="5" w:tplc="10000005" w:tentative="1">
+      <w:start w:val="1"/>
+      <w:numFmt w:val="bullet"/>
+      <w:lvlText w:val=""/>
+      <w:lvlJc w:val="left"/>
+      <w:pPr>
+        <w:ind w:left="4320" w:hanging="360"/>
+      </w:pPr>
+      <w:rPr>
+        <w:rFonts w:ascii="Wingdings" w:hAnsi="Wingdings" w:hint="default"/>
+      </w:rPr>
+    </w:lvl>
+    <w:lvl w:ilvl="6" w:tplc="10000001" w:tentative="1">
+      <w:start w:val="1"/>
+      <w:numFmt w:val="bullet"/>
+      <w:lvlText w:val=""/>
+      <w:lvlJc w:val="left"/>
+      <w:pPr>
+        <w:ind w:left="5040" w:hanging="360"/>
+      </w:pPr>
+      <w:rPr>
+        <w:rFonts w:ascii="Symbol" w:hAnsi="Symbol" w:hint="default"/>
+      </w:rPr>
+    </w:lvl>
+    <w:lvl w:ilvl="7" w:tplc="10000003" w:tentative="1">
+      <w:start w:val="1"/>
+      <w:numFmt w:val="bullet"/>
+      <w:lvlText w:val="o"/>
+      <w:lvlJc w:val="left"/>
+      <w:pPr>
+        <w:ind w:left="5760" w:hanging="360"/>
+      </w:pPr>
+      <w:rPr>
+        <w:rFonts w:ascii="Courier New" w:hAnsi="Courier New" w:cs="Courier New" w:hint="default"/>
+      </w:rPr>
+    </w:lvl>
+    <w:lvl w:ilvl="8" w:tplc="10000005" w:tentative="1">
+      <w:start w:val="1"/>
+      <w:numFmt w:val="bullet"/>
+      <w:lvlText w:val=""/>
+      <w:lvlJc w:val="left"/>
+      <w:pPr>
+        <w:ind w:left="6480" w:hanging="360"/>
+      </w:pPr>
+      <w:rPr>
+        <w:rFonts w:ascii="Wingdings" w:hAnsi="Wingdings" w:hint="default"/>
+      </w:rPr>
+    </w:lvl>
+  </w:abstractNum>
+  <w:abstractNum w:abstractNumId="4" w15:restartNumberingAfterBreak="0">
+    <w:nsid w:val="1F937506"/>
+    <w:multiLevelType w:val="hybridMultilevel"/>
+    <w:tmpl w:val="6FFA63F6"/>
+    <w:lvl w:ilvl="0" w:tplc="10000013">
+      <w:start w:val="1"/>
+      <w:numFmt w:val="upperRoman"/>
+      <w:lvlText w:val="%1."/>
+      <w:lvlJc w:val="right"/>
+      <w:pPr>
+        <w:ind w:left="720" w:hanging="360"/>
+      </w:pPr>
+    </w:lvl>
+    <w:lvl w:ilvl="1" w:tplc="10000019" w:tentative="1">
+      <w:start w:val="1"/>
+      <w:numFmt w:val="lowerLetter"/>
+      <w:lvlText w:val="%2."/>
+      <w:lvlJc w:val="left"/>
+      <w:pPr>
+        <w:ind w:left="1440" w:hanging="360"/>
+      </w:pPr>
+    </w:lvl>
+    <w:lvl w:ilvl="2" w:tplc="1000001B" w:tentative="1">
+      <w:start w:val="1"/>
+      <w:numFmt w:val="lowerRoman"/>
+      <w:lvlText w:val="%3."/>
+      <w:lvlJc w:val="right"/>
+      <w:pPr>
+        <w:ind w:left="2160" w:hanging="180"/>
+      </w:pPr>
+    </w:lvl>
+    <w:lvl w:ilvl="3" w:tplc="1000000F" w:tentative="1">
+      <w:start w:val="1"/>
+      <w:numFmt w:val="decimal"/>
+      <w:lvlText w:val="%4."/>
+      <w:lvlJc w:val="left"/>
+      <w:pPr>
+        <w:ind w:left="2880" w:hanging="360"/>
+      </w:pPr>
+    </w:lvl>
+    <w:lvl w:ilvl="4" w:tplc="10000019" w:tentative="1">
+      <w:start w:val="1"/>
+      <w:numFmt w:val="lowerLetter"/>
+      <w:lvlText w:val="%5."/>
+      <w:lvlJc w:val="left"/>
+      <w:pPr>
+        <w:ind w:left="3600" w:hanging="360"/>
+      </w:pPr>
+    </w:lvl>
+    <w:lvl w:ilvl="5" w:tplc="1000001B" w:tentative="1">
+      <w:start w:val="1"/>
+      <w:numFmt w:val="lowerRoman"/>
+      <w:lvlText w:val="%6."/>
+      <w:lvlJc w:val="right"/>
+      <w:pPr>
+        <w:ind w:left="4320" w:hanging="180"/>
+      </w:pPr>
+    </w:lvl>
+    <w:lvl w:ilvl="6" w:tplc="1000000F" w:tentative="1">
+      <w:start w:val="1"/>
+      <w:numFmt w:val="decimal"/>
+      <w:lvlText w:val="%7."/>
+      <w:lvlJc w:val="left"/>
+      <w:pPr>
+        <w:ind w:left="5040" w:hanging="360"/>
+      </w:pPr>
+    </w:lvl>
+    <w:lvl w:ilvl="7" w:tplc="10000019" w:tentative="1">
+      <w:start w:val="1"/>
+      <w:numFmt w:val="lowerLetter"/>
+      <w:lvlText w:val="%8."/>
+      <w:lvlJc w:val="left"/>
+      <w:pPr>
+        <w:ind w:left="5760" w:hanging="360"/>
+      </w:pPr>
+    </w:lvl>
+    <w:lvl w:ilvl="8" w:tplc="1000001B" w:tentative="1">
+      <w:start w:val="1"/>
+      <w:numFmt w:val="lowerRoman"/>
+      <w:lvlText w:val="%9."/>
+      <w:lvlJc w:val="right"/>
+      <w:pPr>
+        <w:ind w:left="6480" w:hanging="180"/>
+      </w:pPr>
+    </w:lvl>
+  </w:abstractNum>
+  <w:abstractNum w:abstractNumId="5" w15:restartNumberingAfterBreak="0">
+    <w:nsid w:val="2B5F0C27"/>
+    <w:multiLevelType w:val="hybridMultilevel"/>
+    <w:tmpl w:val="AA0C4314"/>
+    <w:lvl w:ilvl="0" w:tplc="10000001">
+      <w:start w:val="1"/>
+      <w:numFmt w:val="bullet"/>
+      <w:lvlText w:val=""/>
+      <w:lvlJc w:val="left"/>
+      <w:pPr>
+        <w:ind w:left="720" w:hanging="360"/>
+      </w:pPr>
+      <w:rPr>
+        <w:rFonts w:ascii="Symbol" w:hAnsi="Symbol" w:hint="default"/>
+      </w:rPr>
+    </w:lvl>
+    <w:lvl w:ilvl="1" w:tplc="10000003" w:tentative="1">
+      <w:start w:val="1"/>
+      <w:numFmt w:val="bullet"/>
+      <w:lvlText w:val="o"/>
+      <w:lvlJc w:val="left"/>
+      <w:pPr>
+        <w:ind w:left="1440" w:hanging="360"/>
+      </w:pPr>
+      <w:rPr>
+        <w:rFonts w:ascii="Courier New" w:hAnsi="Courier New" w:cs="Courier New" w:hint="default"/>
+      </w:rPr>
+    </w:lvl>
+    <w:lvl w:ilvl="2" w:tplc="10000005" w:tentative="1">
+      <w:start w:val="1"/>
+      <w:numFmt w:val="bullet"/>
+      <w:lvlText w:val=""/>
+      <w:lvlJc w:val="left"/>
+      <w:pPr>
+        <w:ind w:left="2160" w:hanging="360"/>
+      </w:pPr>
+      <w:rPr>
+        <w:rFonts w:ascii="Wingdings" w:hAnsi="Wingdings" w:hint="default"/>
+      </w:rPr>
+    </w:lvl>
+    <w:lvl w:ilvl="3" w:tplc="10000001" w:tentative="1">
+      <w:start w:val="1"/>
+      <w:numFmt w:val="bullet"/>
+      <w:lvlText w:val=""/>
+      <w:lvlJc w:val="left"/>
+      <w:pPr>
+        <w:ind w:left="2880" w:hanging="360"/>
+      </w:pPr>
+      <w:rPr>
+        <w:rFonts w:ascii="Symbol" w:hAnsi="Symbol" w:hint="default"/>
+      </w:rPr>
+    </w:lvl>
+    <w:lvl w:ilvl="4" w:tplc="10000003" w:tentative="1">
+      <w:start w:val="1"/>
+      <w:numFmt w:val="bullet"/>
+      <w:lvlText w:val="o"/>
+      <w:lvlJc w:val="left"/>
+      <w:pPr>
+        <w:ind w:left="3600" w:hanging="360"/>
+      </w:pPr>
+      <w:rPr>
+        <w:rFonts w:ascii="Courier New" w:hAnsi="Courier New" w:cs="Courier New" w:hint="default"/>
+      </w:rPr>
+    </w:lvl>
+    <w:lvl w:ilvl="5" w:tplc="10000005" w:tentative="1">
+      <w:start w:val="1"/>
+      <w:numFmt w:val="bullet"/>
+      <w:lvlText w:val=""/>
+      <w:lvlJc w:val="left"/>
+      <w:pPr>
+        <w:ind w:left="4320" w:hanging="360"/>
+      </w:pPr>
+      <w:rPr>
+        <w:rFonts w:ascii="Wingdings" w:hAnsi="Wingdings" w:hint="default"/>
+      </w:rPr>
+    </w:lvl>
+    <w:lvl w:ilvl="6" w:tplc="10000001" w:tentative="1">
+      <w:start w:val="1"/>
+      <w:numFmt w:val="bullet"/>
+      <w:lvlText w:val=""/>
+      <w:lvlJc w:val="left"/>
+      <w:pPr>
+        <w:ind w:left="5040" w:hanging="360"/>
+      </w:pPr>
+      <w:rPr>
+        <w:rFonts w:ascii="Symbol" w:hAnsi="Symbol" w:hint="default"/>
+      </w:rPr>
+    </w:lvl>
+    <w:lvl w:ilvl="7" w:tplc="10000003" w:tentative="1">
+      <w:start w:val="1"/>
+      <w:numFmt w:val="bullet"/>
+      <w:lvlText w:val="o"/>
+      <w:lvlJc w:val="left"/>
+      <w:pPr>
+        <w:ind w:left="5760" w:hanging="360"/>
+      </w:pPr>
+      <w:rPr>
+        <w:rFonts w:ascii="Courier New" w:hAnsi="Courier New" w:cs="Courier New" w:hint="default"/>
+      </w:rPr>
+    </w:lvl>
+    <w:lvl w:ilvl="8" w:tplc="10000005" w:tentative="1">
+      <w:start w:val="1"/>
+      <w:numFmt w:val="bullet"/>
+      <w:lvlText w:val=""/>
+      <w:lvlJc w:val="left"/>
+      <w:pPr>
+        <w:ind w:left="6480" w:hanging="360"/>
+      </w:pPr>
+      <w:rPr>
+        <w:rFonts w:ascii="Wingdings" w:hAnsi="Wingdings" w:hint="default"/>
+      </w:rPr>
+    </w:lvl>
+  </w:abstractNum>
+  <w:abstractNum w:abstractNumId="6" w15:restartNumberingAfterBreak="0">
+    <w:nsid w:val="2D375447"/>
+    <w:multiLevelType w:val="hybridMultilevel"/>
+    <w:tmpl w:val="E48C55BC"/>
+    <w:lvl w:ilvl="0" w:tplc="10000001">
+      <w:start w:val="1"/>
+      <w:numFmt w:val="bullet"/>
+      <w:lvlText w:val=""/>
+      <w:lvlJc w:val="left"/>
+      <w:pPr>
+        <w:ind w:left="720" w:hanging="360"/>
+      </w:pPr>
+      <w:rPr>
+        <w:rFonts w:ascii="Symbol" w:hAnsi="Symbol" w:hint="default"/>
+      </w:rPr>
+    </w:lvl>
+    <w:lvl w:ilvl="1" w:tplc="10000003" w:tentative="1">
+      <w:start w:val="1"/>
+      <w:numFmt w:val="bullet"/>
+      <w:lvlText w:val="o"/>
+      <w:lvlJc w:val="left"/>
+      <w:pPr>
+        <w:ind w:left="1440" w:hanging="360"/>
+      </w:pPr>
+      <w:rPr>
+        <w:rFonts w:ascii="Courier New" w:hAnsi="Courier New" w:cs="Courier New" w:hint="default"/>
+      </w:rPr>
+    </w:lvl>
+    <w:lvl w:ilvl="2" w:tplc="10000005" w:tentative="1">
+      <w:start w:val="1"/>
+      <w:numFmt w:val="bullet"/>
+      <w:lvlText w:val=""/>
+      <w:lvlJc w:val="left"/>
+      <w:pPr>
+        <w:ind w:left="2160" w:hanging="360"/>
+      </w:pPr>
+      <w:rPr>
+        <w:rFonts w:ascii="Wingdings" w:hAnsi="Wingdings" w:hint="default"/>
+      </w:rPr>
+    </w:lvl>
+    <w:lvl w:ilvl="3" w:tplc="10000001" w:tentative="1">
+      <w:start w:val="1"/>
+      <w:numFmt w:val="bullet"/>
+      <w:lvlText w:val=""/>
+      <w:lvlJc w:val="left"/>
+      <w:pPr>
+        <w:ind w:left="2880" w:hanging="360"/>
+      </w:pPr>
+      <w:rPr>
+        <w:rFonts w:ascii="Symbol" w:hAnsi="Symbol" w:hint="default"/>
+      </w:rPr>
+    </w:lvl>
+    <w:lvl w:ilvl="4" w:tplc="10000003" w:tentative="1">
+      <w:start w:val="1"/>
+      <w:numFmt w:val="bullet"/>
+      <w:lvlText w:val="o"/>
+      <w:lvlJc w:val="left"/>
+      <w:pPr>
+        <w:ind w:left="3600" w:hanging="360"/>
+      </w:pPr>
+      <w:rPr>
+        <w:rFonts w:ascii="Courier New" w:hAnsi="Courier New" w:cs="Courier New" w:hint="default"/>
+      </w:rPr>
+    </w:lvl>
+    <w:lvl w:ilvl="5" w:tplc="10000005" w:tentative="1">
+      <w:start w:val="1"/>
+      <w:numFmt w:val="bullet"/>
+      <w:lvlText w:val=""/>
+      <w:lvlJc w:val="left"/>
+      <w:pPr>
+        <w:ind w:left="4320" w:hanging="360"/>
+      </w:pPr>
+      <w:rPr>
+        <w:rFonts w:ascii="Wingdings" w:hAnsi="Wingdings" w:hint="default"/>
+      </w:rPr>
+    </w:lvl>
+    <w:lvl w:ilvl="6" w:tplc="10000001" w:tentative="1">
+      <w:start w:val="1"/>
+      <w:numFmt w:val="bullet"/>
+      <w:lvlText w:val=""/>
+      <w:lvlJc w:val="left"/>
+      <w:pPr>
+        <w:ind w:left="5040" w:hanging="360"/>
+      </w:pPr>
+      <w:rPr>
+        <w:rFonts w:ascii="Symbol" w:hAnsi="Symbol" w:hint="default"/>
+      </w:rPr>
+    </w:lvl>
+    <w:lvl w:ilvl="7" w:tplc="10000003" w:tentative="1">
+      <w:start w:val="1"/>
+      <w:numFmt w:val="bullet"/>
+      <w:lvlText w:val="o"/>
+      <w:lvlJc w:val="left"/>
+      <w:pPr>
+        <w:ind w:left="5760" w:hanging="360"/>
+      </w:pPr>
+      <w:rPr>
+        <w:rFonts w:ascii="Courier New" w:hAnsi="Courier New" w:cs="Courier New" w:hint="default"/>
+      </w:rPr>
+    </w:lvl>
+    <w:lvl w:ilvl="8" w:tplc="10000005" w:tentative="1">
+      <w:start w:val="1"/>
+      <w:numFmt w:val="bullet"/>
+      <w:lvlText w:val=""/>
+      <w:lvlJc w:val="left"/>
+      <w:pPr>
+        <w:ind w:left="6480" w:hanging="360"/>
+      </w:pPr>
+      <w:rPr>
+        <w:rFonts w:ascii="Wingdings" w:hAnsi="Wingdings" w:hint="default"/>
+      </w:rPr>
+    </w:lvl>
+  </w:abstractNum>
+  <w:abstractNum w:abstractNumId="7" w15:restartNumberingAfterBreak="0">
     <w:nsid w:val="2F5A55A9"/>
     <w:multiLevelType w:val="multilevel"/>
     <w:tmpl w:val="DBD629DE"/>
@@ -1246,7 +2891,233 @@
       </w:rPr>
     </w:lvl>
   </w:abstractNum>
-  <w:abstractNum w:abstractNumId="2" w15:restartNumberingAfterBreak="0">
+  <w:abstractNum w:abstractNumId="8" w15:restartNumberingAfterBreak="0">
+    <w:nsid w:val="428F1B2E"/>
+    <w:multiLevelType w:val="hybridMultilevel"/>
+    <w:tmpl w:val="37FC270E"/>
+    <w:lvl w:ilvl="0" w:tplc="10000001">
+      <w:start w:val="1"/>
+      <w:numFmt w:val="bullet"/>
+      <w:lvlText w:val=""/>
+      <w:lvlJc w:val="left"/>
+      <w:pPr>
+        <w:ind w:left="720" w:hanging="360"/>
+      </w:pPr>
+      <w:rPr>
+        <w:rFonts w:ascii="Symbol" w:hAnsi="Symbol" w:hint="default"/>
+      </w:rPr>
+    </w:lvl>
+    <w:lvl w:ilvl="1" w:tplc="10000003" w:tentative="1">
+      <w:start w:val="1"/>
+      <w:numFmt w:val="bullet"/>
+      <w:lvlText w:val="o"/>
+      <w:lvlJc w:val="left"/>
+      <w:pPr>
+        <w:ind w:left="1440" w:hanging="360"/>
+      </w:pPr>
+      <w:rPr>
+        <w:rFonts w:ascii="Courier New" w:hAnsi="Courier New" w:cs="Courier New" w:hint="default"/>
+      </w:rPr>
+    </w:lvl>
+    <w:lvl w:ilvl="2" w:tplc="10000005" w:tentative="1">
+      <w:start w:val="1"/>
+      <w:numFmt w:val="bullet"/>
+      <w:lvlText w:val=""/>
+      <w:lvlJc w:val="left"/>
+      <w:pPr>
+        <w:ind w:left="2160" w:hanging="360"/>
+      </w:pPr>
+      <w:rPr>
+        <w:rFonts w:ascii="Wingdings" w:hAnsi="Wingdings" w:hint="default"/>
+      </w:rPr>
+    </w:lvl>
+    <w:lvl w:ilvl="3" w:tplc="10000001" w:tentative="1">
+      <w:start w:val="1"/>
+      <w:numFmt w:val="bullet"/>
+      <w:lvlText w:val=""/>
+      <w:lvlJc w:val="left"/>
+      <w:pPr>
+        <w:ind w:left="2880" w:hanging="360"/>
+      </w:pPr>
+      <w:rPr>
+        <w:rFonts w:ascii="Symbol" w:hAnsi="Symbol" w:hint="default"/>
+      </w:rPr>
+    </w:lvl>
+    <w:lvl w:ilvl="4" w:tplc="10000003" w:tentative="1">
+      <w:start w:val="1"/>
+      <w:numFmt w:val="bullet"/>
+      <w:lvlText w:val="o"/>
+      <w:lvlJc w:val="left"/>
+      <w:pPr>
+        <w:ind w:left="3600" w:hanging="360"/>
+      </w:pPr>
+      <w:rPr>
+        <w:rFonts w:ascii="Courier New" w:hAnsi="Courier New" w:cs="Courier New" w:hint="default"/>
+      </w:rPr>
+    </w:lvl>
+    <w:lvl w:ilvl="5" w:tplc="10000005" w:tentative="1">
+      <w:start w:val="1"/>
+      <w:numFmt w:val="bullet"/>
+      <w:lvlText w:val=""/>
+      <w:lvlJc w:val="left"/>
+      <w:pPr>
+        <w:ind w:left="4320" w:hanging="360"/>
+      </w:pPr>
+      <w:rPr>
+        <w:rFonts w:ascii="Wingdings" w:hAnsi="Wingdings" w:hint="default"/>
+      </w:rPr>
+    </w:lvl>
+    <w:lvl w:ilvl="6" w:tplc="10000001" w:tentative="1">
+      <w:start w:val="1"/>
+      <w:numFmt w:val="bullet"/>
+      <w:lvlText w:val=""/>
+      <w:lvlJc w:val="left"/>
+      <w:pPr>
+        <w:ind w:left="5040" w:hanging="360"/>
+      </w:pPr>
+      <w:rPr>
+        <w:rFonts w:ascii="Symbol" w:hAnsi="Symbol" w:hint="default"/>
+      </w:rPr>
+    </w:lvl>
+    <w:lvl w:ilvl="7" w:tplc="10000003" w:tentative="1">
+      <w:start w:val="1"/>
+      <w:numFmt w:val="bullet"/>
+      <w:lvlText w:val="o"/>
+      <w:lvlJc w:val="left"/>
+      <w:pPr>
+        <w:ind w:left="5760" w:hanging="360"/>
+      </w:pPr>
+      <w:rPr>
+        <w:rFonts w:ascii="Courier New" w:hAnsi="Courier New" w:cs="Courier New" w:hint="default"/>
+      </w:rPr>
+    </w:lvl>
+    <w:lvl w:ilvl="8" w:tplc="10000005" w:tentative="1">
+      <w:start w:val="1"/>
+      <w:numFmt w:val="bullet"/>
+      <w:lvlText w:val=""/>
+      <w:lvlJc w:val="left"/>
+      <w:pPr>
+        <w:ind w:left="6480" w:hanging="360"/>
+      </w:pPr>
+      <w:rPr>
+        <w:rFonts w:ascii="Wingdings" w:hAnsi="Wingdings" w:hint="default"/>
+      </w:rPr>
+    </w:lvl>
+  </w:abstractNum>
+  <w:abstractNum w:abstractNumId="9" w15:restartNumberingAfterBreak="0">
+    <w:nsid w:val="43234E23"/>
+    <w:multiLevelType w:val="hybridMultilevel"/>
+    <w:tmpl w:val="C1E8967A"/>
+    <w:lvl w:ilvl="0" w:tplc="10000001">
+      <w:start w:val="1"/>
+      <w:numFmt w:val="bullet"/>
+      <w:lvlText w:val=""/>
+      <w:lvlJc w:val="left"/>
+      <w:pPr>
+        <w:ind w:left="720" w:hanging="360"/>
+      </w:pPr>
+      <w:rPr>
+        <w:rFonts w:ascii="Symbol" w:hAnsi="Symbol" w:hint="default"/>
+      </w:rPr>
+    </w:lvl>
+    <w:lvl w:ilvl="1" w:tplc="10000003" w:tentative="1">
+      <w:start w:val="1"/>
+      <w:numFmt w:val="bullet"/>
+      <w:lvlText w:val="o"/>
+      <w:lvlJc w:val="left"/>
+      <w:pPr>
+        <w:ind w:left="1440" w:hanging="360"/>
+      </w:pPr>
+      <w:rPr>
+        <w:rFonts w:ascii="Courier New" w:hAnsi="Courier New" w:cs="Courier New" w:hint="default"/>
+      </w:rPr>
+    </w:lvl>
+    <w:lvl w:ilvl="2" w:tplc="10000005" w:tentative="1">
+      <w:start w:val="1"/>
+      <w:numFmt w:val="bullet"/>
+      <w:lvlText w:val=""/>
+      <w:lvlJc w:val="left"/>
+      <w:pPr>
+        <w:ind w:left="2160" w:hanging="360"/>
+      </w:pPr>
+      <w:rPr>
+        <w:rFonts w:ascii="Wingdings" w:hAnsi="Wingdings" w:hint="default"/>
+      </w:rPr>
+    </w:lvl>
+    <w:lvl w:ilvl="3" w:tplc="10000001" w:tentative="1">
+      <w:start w:val="1"/>
+      <w:numFmt w:val="bullet"/>
+      <w:lvlText w:val=""/>
+      <w:lvlJc w:val="left"/>
+      <w:pPr>
+        <w:ind w:left="2880" w:hanging="360"/>
+      </w:pPr>
+      <w:rPr>
+        <w:rFonts w:ascii="Symbol" w:hAnsi="Symbol" w:hint="default"/>
+      </w:rPr>
+    </w:lvl>
+    <w:lvl w:ilvl="4" w:tplc="10000003" w:tentative="1">
+      <w:start w:val="1"/>
+      <w:numFmt w:val="bullet"/>
+      <w:lvlText w:val="o"/>
+      <w:lvlJc w:val="left"/>
+      <w:pPr>
+        <w:ind w:left="3600" w:hanging="360"/>
+      </w:pPr>
+      <w:rPr>
+        <w:rFonts w:ascii="Courier New" w:hAnsi="Courier New" w:cs="Courier New" w:hint="default"/>
+      </w:rPr>
+    </w:lvl>
+    <w:lvl w:ilvl="5" w:tplc="10000005" w:tentative="1">
+      <w:start w:val="1"/>
+      <w:numFmt w:val="bullet"/>
+      <w:lvlText w:val=""/>
+      <w:lvlJc w:val="left"/>
+      <w:pPr>
+        <w:ind w:left="4320" w:hanging="360"/>
+      </w:pPr>
+      <w:rPr>
+        <w:rFonts w:ascii="Wingdings" w:hAnsi="Wingdings" w:hint="default"/>
+      </w:rPr>
+    </w:lvl>
+    <w:lvl w:ilvl="6" w:tplc="10000001" w:tentative="1">
+      <w:start w:val="1"/>
+      <w:numFmt w:val="bullet"/>
+      <w:lvlText w:val=""/>
+      <w:lvlJc w:val="left"/>
+      <w:pPr>
+        <w:ind w:left="5040" w:hanging="360"/>
+      </w:pPr>
+      <w:rPr>
+        <w:rFonts w:ascii="Symbol" w:hAnsi="Symbol" w:hint="default"/>
+      </w:rPr>
+    </w:lvl>
+    <w:lvl w:ilvl="7" w:tplc="10000003" w:tentative="1">
+      <w:start w:val="1"/>
+      <w:numFmt w:val="bullet"/>
+      <w:lvlText w:val="o"/>
+      <w:lvlJc w:val="left"/>
+      <w:pPr>
+        <w:ind w:left="5760" w:hanging="360"/>
+      </w:pPr>
+      <w:rPr>
+        <w:rFonts w:ascii="Courier New" w:hAnsi="Courier New" w:cs="Courier New" w:hint="default"/>
+      </w:rPr>
+    </w:lvl>
+    <w:lvl w:ilvl="8" w:tplc="10000005" w:tentative="1">
+      <w:start w:val="1"/>
+      <w:numFmt w:val="bullet"/>
+      <w:lvlText w:val=""/>
+      <w:lvlJc w:val="left"/>
+      <w:pPr>
+        <w:ind w:left="6480" w:hanging="360"/>
+      </w:pPr>
+      <w:rPr>
+        <w:rFonts w:ascii="Wingdings" w:hAnsi="Wingdings" w:hint="default"/>
+      </w:rPr>
+    </w:lvl>
+  </w:abstractNum>
+  <w:abstractNum w:abstractNumId="10" w15:restartNumberingAfterBreak="0">
     <w:nsid w:val="49B27B42"/>
     <w:multiLevelType w:val="hybridMultilevel"/>
     <w:tmpl w:val="46A6A13E"/>
@@ -1256,7 +3127,7 @@
       <w:lvlText w:val="%1."/>
       <w:lvlJc w:val="left"/>
       <w:pPr>
-        <w:ind w:left="1080" w:hanging="360"/>
+        <w:ind w:left="630" w:hanging="360"/>
       </w:pPr>
       <w:rPr>
         <w:rFonts w:hint="default"/>
@@ -1268,7 +3139,7 @@
       <w:lvlText w:val="%2."/>
       <w:lvlJc w:val="left"/>
       <w:pPr>
-        <w:ind w:left="1800" w:hanging="360"/>
+        <w:ind w:left="1350" w:hanging="360"/>
       </w:pPr>
     </w:lvl>
     <w:lvl w:ilvl="2" w:tplc="0409001B" w:tentative="1">
@@ -1277,7 +3148,7 @@
       <w:lvlText w:val="%3."/>
       <w:lvlJc w:val="right"/>
       <w:pPr>
-        <w:ind w:left="2520" w:hanging="180"/>
+        <w:ind w:left="2070" w:hanging="180"/>
       </w:pPr>
     </w:lvl>
     <w:lvl w:ilvl="3" w:tplc="0409000F" w:tentative="1">
@@ -1286,7 +3157,7 @@
       <w:lvlText w:val="%4."/>
       <w:lvlJc w:val="left"/>
       <w:pPr>
-        <w:ind w:left="3240" w:hanging="360"/>
+        <w:ind w:left="2790" w:hanging="360"/>
       </w:pPr>
     </w:lvl>
     <w:lvl w:ilvl="4" w:tplc="04090019" w:tentative="1">
@@ -1295,7 +3166,7 @@
       <w:lvlText w:val="%5."/>
       <w:lvlJc w:val="left"/>
       <w:pPr>
-        <w:ind w:left="3960" w:hanging="360"/>
+        <w:ind w:left="3510" w:hanging="360"/>
       </w:pPr>
     </w:lvl>
     <w:lvl w:ilvl="5" w:tplc="0409001B" w:tentative="1">
@@ -1304,7 +3175,7 @@
       <w:lvlText w:val="%6."/>
       <w:lvlJc w:val="right"/>
       <w:pPr>
-        <w:ind w:left="4680" w:hanging="180"/>
+        <w:ind w:left="4230" w:hanging="180"/>
       </w:pPr>
     </w:lvl>
     <w:lvl w:ilvl="6" w:tplc="0409000F" w:tentative="1">
@@ -1313,7 +3184,7 @@
       <w:lvlText w:val="%7."/>
       <w:lvlJc w:val="left"/>
       <w:pPr>
-        <w:ind w:left="5400" w:hanging="360"/>
+        <w:ind w:left="4950" w:hanging="360"/>
       </w:pPr>
     </w:lvl>
     <w:lvl w:ilvl="7" w:tplc="04090019" w:tentative="1">
@@ -1322,7 +3193,7 @@
       <w:lvlText w:val="%8."/>
       <w:lvlJc w:val="left"/>
       <w:pPr>
-        <w:ind w:left="6120" w:hanging="360"/>
+        <w:ind w:left="5670" w:hanging="360"/>
       </w:pPr>
     </w:lvl>
     <w:lvl w:ilvl="8" w:tplc="0409001B" w:tentative="1">
@@ -1331,11 +3202,11 @@
       <w:lvlText w:val="%9."/>
       <w:lvlJc w:val="right"/>
       <w:pPr>
-        <w:ind w:left="6840" w:hanging="180"/>
+        <w:ind w:left="6390" w:hanging="180"/>
       </w:pPr>
     </w:lvl>
   </w:abstractNum>
-  <w:abstractNum w:abstractNumId="3" w15:restartNumberingAfterBreak="0">
+  <w:abstractNum w:abstractNumId="11" w15:restartNumberingAfterBreak="0">
     <w:nsid w:val="4DBE306E"/>
     <w:multiLevelType w:val="multilevel"/>
     <w:tmpl w:val="627473D4"/>
@@ -1484,7 +3355,120 @@
       </w:rPr>
     </w:lvl>
   </w:abstractNum>
-  <w:abstractNum w:abstractNumId="4" w15:restartNumberingAfterBreak="0">
+  <w:abstractNum w:abstractNumId="12" w15:restartNumberingAfterBreak="0">
+    <w:nsid w:val="50B0465E"/>
+    <w:multiLevelType w:val="hybridMultilevel"/>
+    <w:tmpl w:val="7790684A"/>
+    <w:lvl w:ilvl="0" w:tplc="10000001">
+      <w:start w:val="1"/>
+      <w:numFmt w:val="bullet"/>
+      <w:lvlText w:val=""/>
+      <w:lvlJc w:val="left"/>
+      <w:pPr>
+        <w:ind w:left="720" w:hanging="360"/>
+      </w:pPr>
+      <w:rPr>
+        <w:rFonts w:ascii="Symbol" w:hAnsi="Symbol" w:hint="default"/>
+      </w:rPr>
+    </w:lvl>
+    <w:lvl w:ilvl="1" w:tplc="10000003" w:tentative="1">
+      <w:start w:val="1"/>
+      <w:numFmt w:val="bullet"/>
+      <w:lvlText w:val="o"/>
+      <w:lvlJc w:val="left"/>
+      <w:pPr>
+        <w:ind w:left="1440" w:hanging="360"/>
+      </w:pPr>
+      <w:rPr>
+        <w:rFonts w:ascii="Courier New" w:hAnsi="Courier New" w:cs="Courier New" w:hint="default"/>
+      </w:rPr>
+    </w:lvl>
+    <w:lvl w:ilvl="2" w:tplc="10000005" w:tentative="1">
+      <w:start w:val="1"/>
+      <w:numFmt w:val="bullet"/>
+      <w:lvlText w:val=""/>
+      <w:lvlJc w:val="left"/>
+      <w:pPr>
+        <w:ind w:left="2160" w:hanging="360"/>
+      </w:pPr>
+      <w:rPr>
+        <w:rFonts w:ascii="Wingdings" w:hAnsi="Wingdings" w:hint="default"/>
+      </w:rPr>
+    </w:lvl>
+    <w:lvl w:ilvl="3" w:tplc="10000001" w:tentative="1">
+      <w:start w:val="1"/>
+      <w:numFmt w:val="bullet"/>
+      <w:lvlText w:val=""/>
+      <w:lvlJc w:val="left"/>
+      <w:pPr>
+        <w:ind w:left="2880" w:hanging="360"/>
+      </w:pPr>
+      <w:rPr>
+        <w:rFonts w:ascii="Symbol" w:hAnsi="Symbol" w:hint="default"/>
+      </w:rPr>
+    </w:lvl>
+    <w:lvl w:ilvl="4" w:tplc="10000003" w:tentative="1">
+      <w:start w:val="1"/>
+      <w:numFmt w:val="bullet"/>
+      <w:lvlText w:val="o"/>
+      <w:lvlJc w:val="left"/>
+      <w:pPr>
+        <w:ind w:left="3600" w:hanging="360"/>
+      </w:pPr>
+      <w:rPr>
+        <w:rFonts w:ascii="Courier New" w:hAnsi="Courier New" w:cs="Courier New" w:hint="default"/>
+      </w:rPr>
+    </w:lvl>
+    <w:lvl w:ilvl="5" w:tplc="10000005" w:tentative="1">
+      <w:start w:val="1"/>
+      <w:numFmt w:val="bullet"/>
+      <w:lvlText w:val=""/>
+      <w:lvlJc w:val="left"/>
+      <w:pPr>
+        <w:ind w:left="4320" w:hanging="360"/>
+      </w:pPr>
+      <w:rPr>
+        <w:rFonts w:ascii="Wingdings" w:hAnsi="Wingdings" w:hint="default"/>
+      </w:rPr>
+    </w:lvl>
+    <w:lvl w:ilvl="6" w:tplc="10000001" w:tentative="1">
+      <w:start w:val="1"/>
+      <w:numFmt w:val="bullet"/>
+      <w:lvlText w:val=""/>
+      <w:lvlJc w:val="left"/>
+      <w:pPr>
+        <w:ind w:left="5040" w:hanging="360"/>
+      </w:pPr>
+      <w:rPr>
+        <w:rFonts w:ascii="Symbol" w:hAnsi="Symbol" w:hint="default"/>
+      </w:rPr>
+    </w:lvl>
+    <w:lvl w:ilvl="7" w:tplc="10000003" w:tentative="1">
+      <w:start w:val="1"/>
+      <w:numFmt w:val="bullet"/>
+      <w:lvlText w:val="o"/>
+      <w:lvlJc w:val="left"/>
+      <w:pPr>
+        <w:ind w:left="5760" w:hanging="360"/>
+      </w:pPr>
+      <w:rPr>
+        <w:rFonts w:ascii="Courier New" w:hAnsi="Courier New" w:cs="Courier New" w:hint="default"/>
+      </w:rPr>
+    </w:lvl>
+    <w:lvl w:ilvl="8" w:tplc="10000005" w:tentative="1">
+      <w:start w:val="1"/>
+      <w:numFmt w:val="bullet"/>
+      <w:lvlText w:val=""/>
+      <w:lvlJc w:val="left"/>
+      <w:pPr>
+        <w:ind w:left="6480" w:hanging="360"/>
+      </w:pPr>
+      <w:rPr>
+        <w:rFonts w:ascii="Wingdings" w:hAnsi="Wingdings" w:hint="default"/>
+      </w:rPr>
+    </w:lvl>
+  </w:abstractNum>
+  <w:abstractNum w:abstractNumId="13" w15:restartNumberingAfterBreak="0">
     <w:nsid w:val="55503707"/>
     <w:multiLevelType w:val="multilevel"/>
     <w:tmpl w:val="8CA4FA6C"/>
@@ -1633,7 +3617,120 @@
       </w:rPr>
     </w:lvl>
   </w:abstractNum>
-  <w:abstractNum w:abstractNumId="5" w15:restartNumberingAfterBreak="0">
+  <w:abstractNum w:abstractNumId="14" w15:restartNumberingAfterBreak="0">
+    <w:nsid w:val="557A77EE"/>
+    <w:multiLevelType w:val="hybridMultilevel"/>
+    <w:tmpl w:val="546E5ACC"/>
+    <w:lvl w:ilvl="0" w:tplc="7A325640">
+      <w:start w:val="1"/>
+      <w:numFmt w:val="bullet"/>
+      <w:lvlText w:val="-"/>
+      <w:lvlJc w:val="left"/>
+      <w:pPr>
+        <w:ind w:left="720" w:hanging="360"/>
+      </w:pPr>
+      <w:rPr>
+        <w:rFonts w:ascii="Aptos" w:eastAsiaTheme="minorHAnsi" w:hAnsi="Aptos" w:cstheme="minorBidi" w:hint="default"/>
+      </w:rPr>
+    </w:lvl>
+    <w:lvl w:ilvl="1" w:tplc="10000003" w:tentative="1">
+      <w:start w:val="1"/>
+      <w:numFmt w:val="bullet"/>
+      <w:lvlText w:val="o"/>
+      <w:lvlJc w:val="left"/>
+      <w:pPr>
+        <w:ind w:left="1440" w:hanging="360"/>
+      </w:pPr>
+      <w:rPr>
+        <w:rFonts w:ascii="Courier New" w:hAnsi="Courier New" w:cs="Courier New" w:hint="default"/>
+      </w:rPr>
+    </w:lvl>
+    <w:lvl w:ilvl="2" w:tplc="10000005" w:tentative="1">
+      <w:start w:val="1"/>
+      <w:numFmt w:val="bullet"/>
+      <w:lvlText w:val=""/>
+      <w:lvlJc w:val="left"/>
+      <w:pPr>
+        <w:ind w:left="2160" w:hanging="360"/>
+      </w:pPr>
+      <w:rPr>
+        <w:rFonts w:ascii="Wingdings" w:hAnsi="Wingdings" w:hint="default"/>
+      </w:rPr>
+    </w:lvl>
+    <w:lvl w:ilvl="3" w:tplc="10000001" w:tentative="1">
+      <w:start w:val="1"/>
+      <w:numFmt w:val="bullet"/>
+      <w:lvlText w:val=""/>
+      <w:lvlJc w:val="left"/>
+      <w:pPr>
+        <w:ind w:left="2880" w:hanging="360"/>
+      </w:pPr>
+      <w:rPr>
+        <w:rFonts w:ascii="Symbol" w:hAnsi="Symbol" w:hint="default"/>
+      </w:rPr>
+    </w:lvl>
+    <w:lvl w:ilvl="4" w:tplc="10000003" w:tentative="1">
+      <w:start w:val="1"/>
+      <w:numFmt w:val="bullet"/>
+      <w:lvlText w:val="o"/>
+      <w:lvlJc w:val="left"/>
+      <w:pPr>
+        <w:ind w:left="3600" w:hanging="360"/>
+      </w:pPr>
+      <w:rPr>
+        <w:rFonts w:ascii="Courier New" w:hAnsi="Courier New" w:cs="Courier New" w:hint="default"/>
+      </w:rPr>
+    </w:lvl>
+    <w:lvl w:ilvl="5" w:tplc="10000005" w:tentative="1">
+      <w:start w:val="1"/>
+      <w:numFmt w:val="bullet"/>
+      <w:lvlText w:val=""/>
+      <w:lvlJc w:val="left"/>
+      <w:pPr>
+        <w:ind w:left="4320" w:hanging="360"/>
+      </w:pPr>
+      <w:rPr>
+        <w:rFonts w:ascii="Wingdings" w:hAnsi="Wingdings" w:hint="default"/>
+      </w:rPr>
+    </w:lvl>
+    <w:lvl w:ilvl="6" w:tplc="10000001" w:tentative="1">
+      <w:start w:val="1"/>
+      <w:numFmt w:val="bullet"/>
+      <w:lvlText w:val=""/>
+      <w:lvlJc w:val="left"/>
+      <w:pPr>
+        <w:ind w:left="5040" w:hanging="360"/>
+      </w:pPr>
+      <w:rPr>
+        <w:rFonts w:ascii="Symbol" w:hAnsi="Symbol" w:hint="default"/>
+      </w:rPr>
+    </w:lvl>
+    <w:lvl w:ilvl="7" w:tplc="10000003" w:tentative="1">
+      <w:start w:val="1"/>
+      <w:numFmt w:val="bullet"/>
+      <w:lvlText w:val="o"/>
+      <w:lvlJc w:val="left"/>
+      <w:pPr>
+        <w:ind w:left="5760" w:hanging="360"/>
+      </w:pPr>
+      <w:rPr>
+        <w:rFonts w:ascii="Courier New" w:hAnsi="Courier New" w:cs="Courier New" w:hint="default"/>
+      </w:rPr>
+    </w:lvl>
+    <w:lvl w:ilvl="8" w:tplc="10000005" w:tentative="1">
+      <w:start w:val="1"/>
+      <w:numFmt w:val="bullet"/>
+      <w:lvlText w:val=""/>
+      <w:lvlJc w:val="left"/>
+      <w:pPr>
+        <w:ind w:left="6480" w:hanging="360"/>
+      </w:pPr>
+      <w:rPr>
+        <w:rFonts w:ascii="Wingdings" w:hAnsi="Wingdings" w:hint="default"/>
+      </w:rPr>
+    </w:lvl>
+  </w:abstractNum>
+  <w:abstractNum w:abstractNumId="15" w15:restartNumberingAfterBreak="0">
     <w:nsid w:val="5E966797"/>
     <w:multiLevelType w:val="hybridMultilevel"/>
     <w:tmpl w:val="89A2AD8A"/>
@@ -1722,7 +3819,120 @@
       </w:pPr>
     </w:lvl>
   </w:abstractNum>
-  <w:abstractNum w:abstractNumId="6" w15:restartNumberingAfterBreak="0">
+  <w:abstractNum w:abstractNumId="16" w15:restartNumberingAfterBreak="0">
+    <w:nsid w:val="5EB8114F"/>
+    <w:multiLevelType w:val="hybridMultilevel"/>
+    <w:tmpl w:val="C6CAE5B2"/>
+    <w:lvl w:ilvl="0" w:tplc="82882978">
+      <w:start w:val="1"/>
+      <w:numFmt w:val="bullet"/>
+      <w:lvlText w:val="-"/>
+      <w:lvlJc w:val="left"/>
+      <w:pPr>
+        <w:ind w:left="720" w:hanging="360"/>
+      </w:pPr>
+      <w:rPr>
+        <w:rFonts w:ascii="Aptos" w:eastAsiaTheme="minorHAnsi" w:hAnsi="Aptos" w:cstheme="minorBidi" w:hint="default"/>
+      </w:rPr>
+    </w:lvl>
+    <w:lvl w:ilvl="1" w:tplc="10000003" w:tentative="1">
+      <w:start w:val="1"/>
+      <w:numFmt w:val="bullet"/>
+      <w:lvlText w:val="o"/>
+      <w:lvlJc w:val="left"/>
+      <w:pPr>
+        <w:ind w:left="1440" w:hanging="360"/>
+      </w:pPr>
+      <w:rPr>
+        <w:rFonts w:ascii="Courier New" w:hAnsi="Courier New" w:cs="Courier New" w:hint="default"/>
+      </w:rPr>
+    </w:lvl>
+    <w:lvl w:ilvl="2" w:tplc="10000005" w:tentative="1">
+      <w:start w:val="1"/>
+      <w:numFmt w:val="bullet"/>
+      <w:lvlText w:val=""/>
+      <w:lvlJc w:val="left"/>
+      <w:pPr>
+        <w:ind w:left="2160" w:hanging="360"/>
+      </w:pPr>
+      <w:rPr>
+        <w:rFonts w:ascii="Wingdings" w:hAnsi="Wingdings" w:hint="default"/>
+      </w:rPr>
+    </w:lvl>
+    <w:lvl w:ilvl="3" w:tplc="10000001" w:tentative="1">
+      <w:start w:val="1"/>
+      <w:numFmt w:val="bullet"/>
+      <w:lvlText w:val=""/>
+      <w:lvlJc w:val="left"/>
+      <w:pPr>
+        <w:ind w:left="2880" w:hanging="360"/>
+      </w:pPr>
+      <w:rPr>
+        <w:rFonts w:ascii="Symbol" w:hAnsi="Symbol" w:hint="default"/>
+      </w:rPr>
+    </w:lvl>
+    <w:lvl w:ilvl="4" w:tplc="10000003" w:tentative="1">
+      <w:start w:val="1"/>
+      <w:numFmt w:val="bullet"/>
+      <w:lvlText w:val="o"/>
+      <w:lvlJc w:val="left"/>
+      <w:pPr>
+        <w:ind w:left="3600" w:hanging="360"/>
+      </w:pPr>
+      <w:rPr>
+        <w:rFonts w:ascii="Courier New" w:hAnsi="Courier New" w:cs="Courier New" w:hint="default"/>
+      </w:rPr>
+    </w:lvl>
+    <w:lvl w:ilvl="5" w:tplc="10000005" w:tentative="1">
+      <w:start w:val="1"/>
+      <w:numFmt w:val="bullet"/>
+      <w:lvlText w:val=""/>
+      <w:lvlJc w:val="left"/>
+      <w:pPr>
+        <w:ind w:left="4320" w:hanging="360"/>
+      </w:pPr>
+      <w:rPr>
+        <w:rFonts w:ascii="Wingdings" w:hAnsi="Wingdings" w:hint="default"/>
+      </w:rPr>
+    </w:lvl>
+    <w:lvl w:ilvl="6" w:tplc="10000001" w:tentative="1">
+      <w:start w:val="1"/>
+      <w:numFmt w:val="bullet"/>
+      <w:lvlText w:val=""/>
+      <w:lvlJc w:val="left"/>
+      <w:pPr>
+        <w:ind w:left="5040" w:hanging="360"/>
+      </w:pPr>
+      <w:rPr>
+        <w:rFonts w:ascii="Symbol" w:hAnsi="Symbol" w:hint="default"/>
+      </w:rPr>
+    </w:lvl>
+    <w:lvl w:ilvl="7" w:tplc="10000003" w:tentative="1">
+      <w:start w:val="1"/>
+      <w:numFmt w:val="bullet"/>
+      <w:lvlText w:val="o"/>
+      <w:lvlJc w:val="left"/>
+      <w:pPr>
+        <w:ind w:left="5760" w:hanging="360"/>
+      </w:pPr>
+      <w:rPr>
+        <w:rFonts w:ascii="Courier New" w:hAnsi="Courier New" w:cs="Courier New" w:hint="default"/>
+      </w:rPr>
+    </w:lvl>
+    <w:lvl w:ilvl="8" w:tplc="10000005" w:tentative="1">
+      <w:start w:val="1"/>
+      <w:numFmt w:val="bullet"/>
+      <w:lvlText w:val=""/>
+      <w:lvlJc w:val="left"/>
+      <w:pPr>
+        <w:ind w:left="6480" w:hanging="360"/>
+      </w:pPr>
+      <w:rPr>
+        <w:rFonts w:ascii="Wingdings" w:hAnsi="Wingdings" w:hint="default"/>
+      </w:rPr>
+    </w:lvl>
+  </w:abstractNum>
+  <w:abstractNum w:abstractNumId="17" w15:restartNumberingAfterBreak="0">
     <w:nsid w:val="68303A09"/>
     <w:multiLevelType w:val="hybridMultilevel"/>
     <w:tmpl w:val="623E6138"/>
@@ -1835,7 +4045,7 @@
       </w:rPr>
     </w:lvl>
   </w:abstractNum>
-  <w:abstractNum w:abstractNumId="7" w15:restartNumberingAfterBreak="0">
+  <w:abstractNum w:abstractNumId="18" w15:restartNumberingAfterBreak="0">
     <w:nsid w:val="77C342F3"/>
     <w:multiLevelType w:val="multilevel"/>
     <w:tmpl w:val="56741380"/>
@@ -1984,35 +4194,184 @@
       </w:rPr>
     </w:lvl>
   </w:abstractNum>
-  <w:num w:numId="1" w16cid:durableId="1958095128">
+  <w:abstractNum w:abstractNumId="19" w15:restartNumberingAfterBreak="0">
+    <w:nsid w:val="7FF64AAA"/>
+    <w:multiLevelType w:val="hybridMultilevel"/>
+    <w:tmpl w:val="2B42E6BA"/>
+    <w:lvl w:ilvl="0" w:tplc="03542D52">
+      <w:start w:val="1"/>
+      <w:numFmt w:val="bullet"/>
+      <w:lvlText w:val="-"/>
+      <w:lvlJc w:val="left"/>
+      <w:pPr>
+        <w:ind w:left="720" w:hanging="360"/>
+      </w:pPr>
+      <w:rPr>
+        <w:rFonts w:ascii="Consolas" w:eastAsiaTheme="minorHAnsi" w:hAnsi="Consolas" w:cstheme="minorBidi" w:hint="default"/>
+      </w:rPr>
+    </w:lvl>
+    <w:lvl w:ilvl="1" w:tplc="10000003" w:tentative="1">
+      <w:start w:val="1"/>
+      <w:numFmt w:val="bullet"/>
+      <w:lvlText w:val="o"/>
+      <w:lvlJc w:val="left"/>
+      <w:pPr>
+        <w:ind w:left="1440" w:hanging="360"/>
+      </w:pPr>
+      <w:rPr>
+        <w:rFonts w:ascii="Courier New" w:hAnsi="Courier New" w:cs="Courier New" w:hint="default"/>
+      </w:rPr>
+    </w:lvl>
+    <w:lvl w:ilvl="2" w:tplc="10000005" w:tentative="1">
+      <w:start w:val="1"/>
+      <w:numFmt w:val="bullet"/>
+      <w:lvlText w:val=""/>
+      <w:lvlJc w:val="left"/>
+      <w:pPr>
+        <w:ind w:left="2160" w:hanging="360"/>
+      </w:pPr>
+      <w:rPr>
+        <w:rFonts w:ascii="Wingdings" w:hAnsi="Wingdings" w:hint="default"/>
+      </w:rPr>
+    </w:lvl>
+    <w:lvl w:ilvl="3" w:tplc="10000001" w:tentative="1">
+      <w:start w:val="1"/>
+      <w:numFmt w:val="bullet"/>
+      <w:lvlText w:val=""/>
+      <w:lvlJc w:val="left"/>
+      <w:pPr>
+        <w:ind w:left="2880" w:hanging="360"/>
+      </w:pPr>
+      <w:rPr>
+        <w:rFonts w:ascii="Symbol" w:hAnsi="Symbol" w:hint="default"/>
+      </w:rPr>
+    </w:lvl>
+    <w:lvl w:ilvl="4" w:tplc="10000003" w:tentative="1">
+      <w:start w:val="1"/>
+      <w:numFmt w:val="bullet"/>
+      <w:lvlText w:val="o"/>
+      <w:lvlJc w:val="left"/>
+      <w:pPr>
+        <w:ind w:left="3600" w:hanging="360"/>
+      </w:pPr>
+      <w:rPr>
+        <w:rFonts w:ascii="Courier New" w:hAnsi="Courier New" w:cs="Courier New" w:hint="default"/>
+      </w:rPr>
+    </w:lvl>
+    <w:lvl w:ilvl="5" w:tplc="10000005" w:tentative="1">
+      <w:start w:val="1"/>
+      <w:numFmt w:val="bullet"/>
+      <w:lvlText w:val=""/>
+      <w:lvlJc w:val="left"/>
+      <w:pPr>
+        <w:ind w:left="4320" w:hanging="360"/>
+      </w:pPr>
+      <w:rPr>
+        <w:rFonts w:ascii="Wingdings" w:hAnsi="Wingdings" w:hint="default"/>
+      </w:rPr>
+    </w:lvl>
+    <w:lvl w:ilvl="6" w:tplc="10000001" w:tentative="1">
+      <w:start w:val="1"/>
+      <w:numFmt w:val="bullet"/>
+      <w:lvlText w:val=""/>
+      <w:lvlJc w:val="left"/>
+      <w:pPr>
+        <w:ind w:left="5040" w:hanging="360"/>
+      </w:pPr>
+      <w:rPr>
+        <w:rFonts w:ascii="Symbol" w:hAnsi="Symbol" w:hint="default"/>
+      </w:rPr>
+    </w:lvl>
+    <w:lvl w:ilvl="7" w:tplc="10000003" w:tentative="1">
+      <w:start w:val="1"/>
+      <w:numFmt w:val="bullet"/>
+      <w:lvlText w:val="o"/>
+      <w:lvlJc w:val="left"/>
+      <w:pPr>
+        <w:ind w:left="5760" w:hanging="360"/>
+      </w:pPr>
+      <w:rPr>
+        <w:rFonts w:ascii="Courier New" w:hAnsi="Courier New" w:cs="Courier New" w:hint="default"/>
+      </w:rPr>
+    </w:lvl>
+    <w:lvl w:ilvl="8" w:tplc="10000005" w:tentative="1">
+      <w:start w:val="1"/>
+      <w:numFmt w:val="bullet"/>
+      <w:lvlText w:val=""/>
+      <w:lvlJc w:val="left"/>
+      <w:pPr>
+        <w:ind w:left="6480" w:hanging="360"/>
+      </w:pPr>
+      <w:rPr>
+        <w:rFonts w:ascii="Wingdings" w:hAnsi="Wingdings" w:hint="default"/>
+      </w:rPr>
+    </w:lvl>
+  </w:abstractNum>
+  <w:num w:numId="1">
+    <w:abstractNumId w:val="15"/>
+  </w:num>
+  <w:num w:numId="2">
+    <w:abstractNumId w:val="10"/>
+  </w:num>
+  <w:num w:numId="3">
+    <w:abstractNumId w:val="17"/>
+  </w:num>
+  <w:num w:numId="4">
+    <w:abstractNumId w:val="7"/>
+  </w:num>
+  <w:num w:numId="5">
+    <w:abstractNumId w:val="1"/>
+  </w:num>
+  <w:num w:numId="6">
+    <w:abstractNumId w:val="13"/>
+  </w:num>
+  <w:num w:numId="7">
+    <w:abstractNumId w:val="18"/>
+  </w:num>
+  <w:num w:numId="8">
+    <w:abstractNumId w:val="11"/>
+  </w:num>
+  <w:num w:numId="9">
+    <w:abstractNumId w:val="0"/>
+  </w:num>
+  <w:num w:numId="10">
+    <w:abstractNumId w:val="16"/>
+  </w:num>
+  <w:num w:numId="11">
+    <w:abstractNumId w:val="3"/>
+  </w:num>
+  <w:num w:numId="12">
+    <w:abstractNumId w:val="2"/>
+  </w:num>
+  <w:num w:numId="13">
+    <w:abstractNumId w:val="19"/>
+  </w:num>
+  <w:num w:numId="14">
+    <w:abstractNumId w:val="8"/>
+  </w:num>
+  <w:num w:numId="15">
     <w:abstractNumId w:val="5"/>
   </w:num>
-  <w:num w:numId="2" w16cid:durableId="451943466">
-    <w:abstractNumId w:val="2"/>
+  <w:num w:numId="16">
+    <w:abstractNumId w:val="14"/>
   </w:num>
-  <w:num w:numId="3" w16cid:durableId="129203260">
+  <w:num w:numId="17">
+    <w:abstractNumId w:val="9"/>
+  </w:num>
+  <w:num w:numId="18">
     <w:abstractNumId w:val="6"/>
   </w:num>
-  <w:num w:numId="4" w16cid:durableId="1450393350">
-    <w:abstractNumId w:val="1"/>
-  </w:num>
-  <w:num w:numId="5" w16cid:durableId="158540940">
-    <w:abstractNumId w:val="0"/>
-  </w:num>
-  <w:num w:numId="6" w16cid:durableId="1109856044">
+  <w:num w:numId="19">
     <w:abstractNumId w:val="4"/>
   </w:num>
-  <w:num w:numId="7" w16cid:durableId="955599496">
-    <w:abstractNumId w:val="7"/>
-  </w:num>
-  <w:num w:numId="8" w16cid:durableId="1986162075">
-    <w:abstractNumId w:val="3"/>
+  <w:num w:numId="20">
+    <w:abstractNumId w:val="12"/>
   </w:num>
 </w:numbering>
 </file>
 
 <file path=word/styles.xml><?xml version="1.0" encoding="utf-8"?>
-<w:styles xmlns:mc="http://schemas.openxmlformats.org/markup-compatibility/2006" xmlns:r="http://schemas.openxmlformats.org/officeDocument/2006/relationships" xmlns:w="http://schemas.openxmlformats.org/wordprocessingml/2006/main" xmlns:w14="http://schemas.microsoft.com/office/word/2010/wordml" xmlns:w15="http://schemas.microsoft.com/office/word/2012/wordml" xmlns:w16cex="http://schemas.microsoft.com/office/word/2018/wordml/cex" xmlns:w16cid="http://schemas.microsoft.com/office/word/2016/wordml/cid" xmlns:w16="http://schemas.microsoft.com/office/word/2018/wordml" xmlns:w16du="http://schemas.microsoft.com/office/word/2023/wordml/word16du" xmlns:w16sdtdh="http://schemas.microsoft.com/office/word/2020/wordml/sdtdatahash" xmlns:w16sdtfl="http://schemas.microsoft.com/office/word/2024/wordml/sdtformatlock" xmlns:w16se="http://schemas.microsoft.com/office/word/2015/wordml/symex" mc:Ignorable="w14 w15 w16se w16cid w16 w16cex w16sdtdh w16sdtfl w16du">
+<w:styles xmlns:mc="http://schemas.openxmlformats.org/markup-compatibility/2006" xmlns:r="http://schemas.openxmlformats.org/officeDocument/2006/relationships" xmlns:w="http://schemas.openxmlformats.org/wordprocessingml/2006/main" xmlns:w14="http://schemas.microsoft.com/office/word/2010/wordml" xmlns:w15="http://schemas.microsoft.com/office/word/2012/wordml" xmlns:w16cex="http://schemas.microsoft.com/office/word/2018/wordml/cex" xmlns:w16cid="http://schemas.microsoft.com/office/word/2016/wordml/cid" xmlns:w16="http://schemas.microsoft.com/office/word/2018/wordml" xmlns:w16sdtdh="http://schemas.microsoft.com/office/word/2020/wordml/sdtdatahash" xmlns:w16se="http://schemas.microsoft.com/office/word/2015/wordml/symex" mc:Ignorable="w14 w15 w16se w16cid w16 w16cex w16sdtdh">
   <w:docDefaults>
     <w:rPrDefault>
       <w:rPr>
@@ -2461,7 +4820,6 @@
     <w:next w:val="Normal"/>
     <w:link w:val="Heading3Char"/>
     <w:uiPriority w:val="9"/>
-    <w:semiHidden/>
     <w:unhideWhenUsed/>
     <w:qFormat/>
     <w:rsid w:val="00540DB1"/>
@@ -2484,7 +4842,6 @@
     <w:next w:val="Normal"/>
     <w:link w:val="Heading4Char"/>
     <w:uiPriority w:val="9"/>
-    <w:semiHidden/>
     <w:unhideWhenUsed/>
     <w:qFormat/>
     <w:rsid w:val="00540DB1"/>
@@ -2613,7 +4970,6 @@
   <w:style w:type="character" w:default="1" w:styleId="DefaultParagraphFont">
     <w:name w:val="Default Paragraph Font"/>
     <w:uiPriority w:val="1"/>
-    <w:semiHidden/>
     <w:unhideWhenUsed/>
   </w:style>
   <w:style w:type="table" w:default="1" w:styleId="TableNormal">
@@ -2668,7 +5024,6 @@
     <w:basedOn w:val="DefaultParagraphFont"/>
     <w:link w:val="Heading3"/>
     <w:uiPriority w:val="9"/>
-    <w:semiHidden/>
     <w:rsid w:val="00540DB1"/>
     <w:rPr>
       <w:rFonts w:eastAsiaTheme="majorEastAsia" w:cstheme="majorBidi"/>
@@ -2682,7 +5037,6 @@
     <w:basedOn w:val="DefaultParagraphFont"/>
     <w:link w:val="Heading4"/>
     <w:uiPriority w:val="9"/>
-    <w:semiHidden/>
     <w:rsid w:val="00540DB1"/>
     <w:rPr>
       <w:rFonts w:eastAsiaTheme="majorEastAsia" w:cstheme="majorBidi"/>
@@ -2956,6 +5310,147 @@
       <w:rFonts w:ascii="Courier New" w:eastAsia="Times New Roman" w:hAnsi="Courier New" w:cs="Courier New"/>
       <w:sz w:val="20"/>
       <w:szCs w:val="20"/>
+    </w:rPr>
+  </w:style>
+  <w:style w:type="paragraph" w:styleId="Header">
+    <w:name w:val="header"/>
+    <w:basedOn w:val="Normal"/>
+    <w:link w:val="HeaderChar"/>
+    <w:uiPriority w:val="99"/>
+    <w:unhideWhenUsed/>
+    <w:rsid w:val="00B63F17"/>
+    <w:pPr>
+      <w:tabs>
+        <w:tab w:val="center" w:pos="4513"/>
+        <w:tab w:val="right" w:pos="9026"/>
+      </w:tabs>
+      <w:spacing w:after="0" w:line="240" w:lineRule="auto"/>
+    </w:pPr>
+  </w:style>
+  <w:style w:type="character" w:customStyle="1" w:styleId="HeaderChar">
+    <w:name w:val="Header Char"/>
+    <w:basedOn w:val="DefaultParagraphFont"/>
+    <w:link w:val="Header"/>
+    <w:uiPriority w:val="99"/>
+    <w:rsid w:val="00B63F17"/>
+  </w:style>
+  <w:style w:type="paragraph" w:styleId="Footer">
+    <w:name w:val="footer"/>
+    <w:basedOn w:val="Normal"/>
+    <w:link w:val="FooterChar"/>
+    <w:uiPriority w:val="99"/>
+    <w:unhideWhenUsed/>
+    <w:rsid w:val="00B63F17"/>
+    <w:pPr>
+      <w:tabs>
+        <w:tab w:val="center" w:pos="4513"/>
+        <w:tab w:val="right" w:pos="9026"/>
+      </w:tabs>
+      <w:spacing w:after="0" w:line="240" w:lineRule="auto"/>
+    </w:pPr>
+  </w:style>
+  <w:style w:type="character" w:customStyle="1" w:styleId="FooterChar">
+    <w:name w:val="Footer Char"/>
+    <w:basedOn w:val="DefaultParagraphFont"/>
+    <w:link w:val="Footer"/>
+    <w:uiPriority w:val="99"/>
+    <w:rsid w:val="00B63F17"/>
+  </w:style>
+  <w:style w:type="character" w:styleId="SubtleEmphasis">
+    <w:name w:val="Subtle Emphasis"/>
+    <w:basedOn w:val="DefaultParagraphFont"/>
+    <w:uiPriority w:val="19"/>
+    <w:qFormat/>
+    <w:rsid w:val="00B63F17"/>
+    <w:rPr>
+      <w:i/>
+      <w:iCs/>
+      <w:color w:val="404040" w:themeColor="text1" w:themeTint="BF"/>
+    </w:rPr>
+  </w:style>
+  <w:style w:type="paragraph" w:styleId="EndnoteText">
+    <w:name w:val="endnote text"/>
+    <w:basedOn w:val="Normal"/>
+    <w:link w:val="EndnoteTextChar"/>
+    <w:uiPriority w:val="99"/>
+    <w:semiHidden/>
+    <w:unhideWhenUsed/>
+    <w:rsid w:val="00B63F17"/>
+    <w:pPr>
+      <w:spacing w:after="0" w:line="240" w:lineRule="auto"/>
+    </w:pPr>
+    <w:rPr>
+      <w:sz w:val="20"/>
+      <w:szCs w:val="20"/>
+    </w:rPr>
+  </w:style>
+  <w:style w:type="character" w:customStyle="1" w:styleId="EndnoteTextChar">
+    <w:name w:val="Endnote Text Char"/>
+    <w:basedOn w:val="DefaultParagraphFont"/>
+    <w:link w:val="EndnoteText"/>
+    <w:uiPriority w:val="99"/>
+    <w:semiHidden/>
+    <w:rsid w:val="00B63F17"/>
+    <w:rPr>
+      <w:sz w:val="20"/>
+      <w:szCs w:val="20"/>
+    </w:rPr>
+  </w:style>
+  <w:style w:type="character" w:styleId="EndnoteReference">
+    <w:name w:val="endnote reference"/>
+    <w:basedOn w:val="DefaultParagraphFont"/>
+    <w:uiPriority w:val="99"/>
+    <w:semiHidden/>
+    <w:unhideWhenUsed/>
+    <w:rsid w:val="00B63F17"/>
+    <w:rPr>
+      <w:vertAlign w:val="superscript"/>
+    </w:rPr>
+  </w:style>
+  <w:style w:type="paragraph" w:styleId="BodyText">
+    <w:name w:val="Body Text"/>
+    <w:basedOn w:val="Normal"/>
+    <w:link w:val="BodyTextChar"/>
+    <w:uiPriority w:val="99"/>
+    <w:unhideWhenUsed/>
+    <w:rsid w:val="00B63F17"/>
+    <w:pPr>
+      <w:jc w:val="both"/>
+    </w:pPr>
+  </w:style>
+  <w:style w:type="character" w:customStyle="1" w:styleId="BodyTextChar">
+    <w:name w:val="Body Text Char"/>
+    <w:basedOn w:val="DefaultParagraphFont"/>
+    <w:link w:val="BodyText"/>
+    <w:uiPriority w:val="99"/>
+    <w:rsid w:val="00B63F17"/>
+  </w:style>
+  <w:style w:type="paragraph" w:customStyle="1" w:styleId="code">
+    <w:name w:val="code"/>
+    <w:basedOn w:val="Normal"/>
+    <w:qFormat/>
+    <w:rsid w:val="001376E0"/>
+    <w:rPr>
+      <w:rFonts w:ascii="Consolas" w:hAnsi="Consolas"/>
+    </w:rPr>
+  </w:style>
+  <w:style w:type="paragraph" w:styleId="Caption">
+    <w:name w:val="caption"/>
+    <w:basedOn w:val="Normal"/>
+    <w:next w:val="Normal"/>
+    <w:uiPriority w:val="35"/>
+    <w:unhideWhenUsed/>
+    <w:qFormat/>
+    <w:rsid w:val="00EE14A6"/>
+    <w:pPr>
+      <w:spacing w:after="200" w:line="240" w:lineRule="auto"/>
+    </w:pPr>
+    <w:rPr>
+      <w:i/>
+      <w:iCs/>
+      <w:color w:val="0E2841" w:themeColor="text2"/>
+      <w:sz w:val="18"/>
+      <w:szCs w:val="18"/>
     </w:rPr>
   </w:style>
 </w:styles>
@@ -3274,4 +5769,16 @@
     </a:ext>
   </a:extLst>
 </a:theme>
+</file>
+
+<file path=customXml/item1.xml><?xml version="1.0" encoding="utf-8"?>
+<b:Sources xmlns:b="http://schemas.openxmlformats.org/officeDocument/2006/bibliography" xmlns="http://schemas.openxmlformats.org/officeDocument/2006/bibliography" SelectedStyle="\APASixthEditionOfficeOnline.xsl" StyleName="APA" Version="6"/>
+</file>
+
+<file path=customXml/itemProps1.xml><?xml version="1.0" encoding="utf-8"?>
+<ds:datastoreItem xmlns:ds="http://schemas.openxmlformats.org/officeDocument/2006/customXml" ds:itemID="{EAC5C593-BE4C-436A-86BC-7AE8E83ABE3B}">
+  <ds:schemaRefs>
+    <ds:schemaRef ds:uri="http://schemas.openxmlformats.org/officeDocument/2006/bibliography"/>
+  </ds:schemaRefs>
+</ds:datastoreItem>
 </file>
</xml_diff>

<commit_message>
Edited grammer and words
</commit_message>
<xml_diff>
--- a/Documents/Analysis of Current State and Design.docx
+++ b/Documents/Analysis of Current State and Design.docx
@@ -1248,7 +1248,16 @@
     </w:p>
     <w:p>
       <w:r>
-        <w:t>The visual styling of slides is managed by the Style class, which uses static fields and hardcoded values to define the available styles. For example:</w:t>
+        <w:t xml:space="preserve">The visual styling of slides is managed by the </w:t>
+      </w:r>
+      <w:r>
+        <w:rPr>
+          <w:color w:val="4C94D8" w:themeColor="text2" w:themeTint="80"/>
+        </w:rPr>
+        <w:t xml:space="preserve">Style </w:t>
+      </w:r>
+      <w:r>
+        <w:t>class, which uses static fields and hardcoded values to define the available styles. For example:</w:t>
       </w:r>
     </w:p>
     <w:p>
@@ -1422,19 +1431,37 @@
       </w:r>
       <w:proofErr w:type="spellStart"/>
       <w:r>
+        <w:rPr>
+          <w:color w:val="4C94D8" w:themeColor="text2" w:themeTint="80"/>
+        </w:rPr>
         <w:t>MenuController</w:t>
       </w:r>
       <w:proofErr w:type="spellEnd"/>
       <w:r>
-        <w:t xml:space="preserve"> class directly instantiates the </w:t>
+        <w:rPr>
+          <w:color w:val="4C94D8" w:themeColor="text2" w:themeTint="80"/>
+        </w:rPr>
+        <w:t xml:space="preserve"> </w:t>
+      </w:r>
+      <w:r>
+        <w:t xml:space="preserve">class directly instantiates the </w:t>
       </w:r>
       <w:proofErr w:type="spellStart"/>
       <w:r>
+        <w:rPr>
+          <w:color w:val="4C94D8" w:themeColor="text2" w:themeTint="80"/>
+        </w:rPr>
         <w:t>XMLAccessor</w:t>
       </w:r>
       <w:proofErr w:type="spellEnd"/>
       <w:r>
-        <w:t xml:space="preserve"> class when loading or saving presentations. For example:</w:t>
+        <w:rPr>
+          <w:color w:val="4C94D8" w:themeColor="text2" w:themeTint="80"/>
+        </w:rPr>
+        <w:t xml:space="preserve"> </w:t>
+      </w:r>
+      <w:r>
+        <w:t>class when loading or saving presentations. For example:</w:t>
       </w:r>
     </w:p>
     <w:p>
@@ -1525,7 +1552,10 @@
         <w:t>Layered Pattern</w:t>
       </w:r>
       <w:r>
-        <w:t>, but the boundaries between layers are blurred.</w:t>
+        <w:t>, but the boundaries between layers are blurred</w:t>
+      </w:r>
+      <w:r>
+        <w:t xml:space="preserve"> and inconsistently enforced. A quick overview:</w:t>
       </w:r>
     </w:p>
     <w:p>
@@ -1874,6 +1904,12 @@
         </w:tc>
       </w:tr>
     </w:tbl>
+    <w:p>
+      <w:pPr>
+        <w:spacing w:after="0"/>
+        <w:jc w:val="both"/>
+      </w:pPr>
+    </w:p>
     <w:p>
       <w:pPr>
         <w:spacing w:after="0"/>

</xml_diff>

<commit_message>
Added a chapter 3 for future architecture
</commit_message>
<xml_diff>
--- a/Documents/Analysis of Current State and Design.docx
+++ b/Documents/Analysis of Current State and Design.docx
@@ -88,6 +88,9 @@
       </w:r>
     </w:p>
     <w:p>
+      <w:pPr>
+        <w:jc w:val="both"/>
+      </w:pPr>
       <w:r>
         <w:t xml:space="preserve">The current state of </w:t>
       </w:r>
@@ -107,12 +110,16 @@
           <w:ilvl w:val="0"/>
           <w:numId w:val="19"/>
         </w:numPr>
+        <w:jc w:val="both"/>
       </w:pPr>
       <w:r>
         <w:t>Tight Coupling Between Domain and Presentation:</w:t>
       </w:r>
     </w:p>
     <w:p>
+      <w:pPr>
+        <w:jc w:val="both"/>
+      </w:pPr>
       <w:r>
         <w:t>Classes involved:</w:t>
       </w:r>
@@ -127,6 +134,7 @@
           <w:ilvl w:val="0"/>
           <w:numId w:val="14"/>
         </w:numPr>
+        <w:jc w:val="both"/>
       </w:pPr>
       <w:proofErr w:type="spellStart"/>
       <w:r>
@@ -141,6 +149,7 @@
           <w:ilvl w:val="0"/>
           <w:numId w:val="14"/>
         </w:numPr>
+        <w:jc w:val="both"/>
       </w:pPr>
       <w:proofErr w:type="spellStart"/>
       <w:r>
@@ -155,6 +164,7 @@
           <w:ilvl w:val="0"/>
           <w:numId w:val="14"/>
         </w:numPr>
+        <w:jc w:val="both"/>
       </w:pPr>
       <w:proofErr w:type="spellStart"/>
       <w:r>
@@ -163,11 +173,17 @@
       <w:proofErr w:type="spellEnd"/>
     </w:p>
     <w:p>
+      <w:pPr>
+        <w:jc w:val="both"/>
+      </w:pPr>
       <w:r>
         <w:t>Issues:</w:t>
       </w:r>
     </w:p>
     <w:p>
+      <w:pPr>
+        <w:jc w:val="both"/>
+      </w:pPr>
       <w:r>
         <w:t xml:space="preserve">The domain model contains functionality that directly depends on graphical user interface components. In the </w:t>
       </w:r>
@@ -190,6 +206,9 @@
       </w:r>
     </w:p>
     <w:p>
+      <w:pPr>
+        <w:jc w:val="both"/>
+      </w:pPr>
       <w:r>
         <w:rPr>
           <w:noProof/>
@@ -249,14 +268,24 @@
                             <w:r>
                               <w:t xml:space="preserve">Figure </w:t>
                             </w:r>
-                            <w:fldSimple w:instr=" SEQ Figure \* ARABIC ">
-                              <w:r>
-                                <w:rPr>
-                                  <w:noProof/>
-                                </w:rPr>
-                                <w:t>1</w:t>
-                              </w:r>
-                            </w:fldSimple>
+                            <w:r>
+                              <w:fldChar w:fldCharType="begin"/>
+                            </w:r>
+                            <w:r>
+                              <w:instrText xml:space="preserve"> SEQ Figure \* ARABIC </w:instrText>
+                            </w:r>
+                            <w:r>
+                              <w:fldChar w:fldCharType="separate"/>
+                            </w:r>
+                            <w:r>
+                              <w:rPr>
+                                <w:noProof/>
+                              </w:rPr>
+                              <w:t>1</w:t>
+                            </w:r>
+                            <w:r>
+                              <w:fldChar w:fldCharType="end"/>
+                            </w:r>
                             <w:r>
                               <w:t xml:space="preserve">: Code from </w:t>
                             </w:r>
@@ -289,7 +318,7 @@
                 <v:stroke joinstyle="miter"/>
                 <v:path gradientshapeok="t" o:connecttype="rect"/>
               </v:shapetype>
-              <v:shape id="Text Box 8" o:spid="_x0000_s1026" type="#_x0000_t202" style="position:absolute;margin-left:0;margin-top:106.3pt;width:468.65pt;height:.05pt;z-index:-251649024;visibility:visible;mso-wrap-style:square;mso-wrap-distance-left:9pt;mso-wrap-distance-top:0;mso-wrap-distance-right:9pt;mso-wrap-distance-bottom:0;mso-position-horizontal:absolute;mso-position-horizontal-relative:text;mso-position-vertical:absolute;mso-position-vertical-relative:text;v-text-anchor:top" o:gfxdata="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" stroked="f">
+              <v:shape id="Text Box 8" o:spid="_x0000_s1026" type="#_x0000_t202" style="position:absolute;left:0;text-align:left;margin-left:0;margin-top:106.3pt;width:468.65pt;height:.05pt;z-index:-251649024;visibility:visible;mso-wrap-style:square;mso-wrap-distance-left:9pt;mso-wrap-distance-top:0;mso-wrap-distance-right:9pt;mso-wrap-distance-bottom:0;mso-position-horizontal:absolute;mso-position-horizontal-relative:text;mso-position-vertical:absolute;mso-position-vertical-relative:text;v-text-anchor:top" o:gfxdata="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" stroked="f">
                 <v:textbox style="mso-fit-shape-to-text:t" inset="0,0,0,0">
                   <w:txbxContent>
                     <w:p>
@@ -303,14 +332,24 @@
                       <w:r>
                         <w:t xml:space="preserve">Figure </w:t>
                       </w:r>
-                      <w:fldSimple w:instr=" SEQ Figure \* ARABIC ">
-                        <w:r>
-                          <w:rPr>
-                            <w:noProof/>
-                          </w:rPr>
-                          <w:t>1</w:t>
-                        </w:r>
-                      </w:fldSimple>
+                      <w:r>
+                        <w:fldChar w:fldCharType="begin"/>
+                      </w:r>
+                      <w:r>
+                        <w:instrText xml:space="preserve"> SEQ Figure \* ARABIC </w:instrText>
+                      </w:r>
+                      <w:r>
+                        <w:fldChar w:fldCharType="separate"/>
+                      </w:r>
+                      <w:r>
+                        <w:rPr>
+                          <w:noProof/>
+                        </w:rPr>
+                        <w:t>1</w:t>
+                      </w:r>
+                      <w:r>
+                        <w:fldChar w:fldCharType="end"/>
+                      </w:r>
                       <w:r>
                         <w:t xml:space="preserve">: Code from </w:t>
                       </w:r>
@@ -415,6 +454,9 @@
       </w:r>
     </w:p>
     <w:p>
+      <w:pPr>
+        <w:jc w:val="both"/>
+      </w:pPr>
       <w:r>
         <w:t xml:space="preserve">It depends on graphical classes such as </w:t>
       </w:r>
@@ -446,6 +488,7 @@
           <w:ilvl w:val="0"/>
           <w:numId w:val="19"/>
         </w:numPr>
+        <w:jc w:val="both"/>
       </w:pPr>
       <w:r>
         <w:t xml:space="preserve">MVC Violation </w:t>
@@ -460,6 +503,9 @@
       </w:r>
     </w:p>
     <w:p>
+      <w:pPr>
+        <w:jc w:val="both"/>
+      </w:pPr>
       <w:r>
         <w:t>Class involved:</w:t>
       </w:r>
@@ -471,6 +517,7 @@
           <w:ilvl w:val="0"/>
           <w:numId w:val="15"/>
         </w:numPr>
+        <w:jc w:val="both"/>
       </w:pPr>
       <w:r>
         <w:t>Presentation</w:t>
@@ -483,6 +530,7 @@
           <w:ilvl w:val="0"/>
           <w:numId w:val="15"/>
         </w:numPr>
+        <w:jc w:val="both"/>
       </w:pPr>
       <w:proofErr w:type="spellStart"/>
       <w:r>
@@ -491,12 +539,18 @@
       <w:proofErr w:type="spellEnd"/>
     </w:p>
     <w:p>
+      <w:pPr>
+        <w:jc w:val="both"/>
+      </w:pPr>
       <w:r>
         <w:lastRenderedPageBreak/>
         <w:t>Issues:</w:t>
       </w:r>
     </w:p>
     <w:p>
+      <w:pPr>
+        <w:jc w:val="both"/>
+      </w:pPr>
       <w:r>
         <w:rPr>
           <w:noProof/>
@@ -556,14 +610,24 @@
                             <w:r>
                               <w:t xml:space="preserve">Figure </w:t>
                             </w:r>
-                            <w:fldSimple w:instr=" SEQ Figure \* ARABIC ">
-                              <w:r>
-                                <w:rPr>
-                                  <w:noProof/>
-                                </w:rPr>
-                                <w:t>2</w:t>
-                              </w:r>
-                            </w:fldSimple>
+                            <w:r>
+                              <w:fldChar w:fldCharType="begin"/>
+                            </w:r>
+                            <w:r>
+                              <w:instrText xml:space="preserve"> SEQ Figure \* ARABIC </w:instrText>
+                            </w:r>
+                            <w:r>
+                              <w:fldChar w:fldCharType="separate"/>
+                            </w:r>
+                            <w:r>
+                              <w:rPr>
+                                <w:noProof/>
+                              </w:rPr>
+                              <w:t>2</w:t>
+                            </w:r>
+                            <w:r>
+                              <w:fldChar w:fldCharType="end"/>
+                            </w:r>
                             <w:r>
                               <w:t>: Code from Presentation Class 1</w:t>
                             </w:r>
@@ -584,7 +648,7 @@
           </mc:Choice>
           <mc:Fallback>
             <w:pict>
-              <v:shape w14:anchorId="243CBA1D" id="Text Box 7" o:spid="_x0000_s1027" type="#_x0000_t202" style="position:absolute;margin-left:0;margin-top:69.15pt;width:517.95pt;height:.05pt;z-index:-251651072;visibility:visible;mso-wrap-style:square;mso-wrap-distance-left:9pt;mso-wrap-distance-top:0;mso-wrap-distance-right:9pt;mso-wrap-distance-bottom:0;mso-position-horizontal:absolute;mso-position-horizontal-relative:text;mso-position-vertical:absolute;mso-position-vertical-relative:text;v-text-anchor:top" o:gfxdata="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" stroked="f">
+              <v:shape w14:anchorId="243CBA1D" id="Text Box 7" o:spid="_x0000_s1027" type="#_x0000_t202" style="position:absolute;left:0;text-align:left;margin-left:0;margin-top:69.15pt;width:517.95pt;height:.05pt;z-index:-251651072;visibility:visible;mso-wrap-style:square;mso-wrap-distance-left:9pt;mso-wrap-distance-top:0;mso-wrap-distance-right:9pt;mso-wrap-distance-bottom:0;mso-position-horizontal:absolute;mso-position-horizontal-relative:text;mso-position-vertical:absolute;mso-position-vertical-relative:text;v-text-anchor:top" o:gfxdata="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" stroked="f">
                 <v:textbox style="mso-fit-shape-to-text:t" inset="0,0,0,0">
                   <w:txbxContent>
                     <w:p>
@@ -598,14 +662,24 @@
                       <w:r>
                         <w:t xml:space="preserve">Figure </w:t>
                       </w:r>
-                      <w:fldSimple w:instr=" SEQ Figure \* ARABIC ">
-                        <w:r>
-                          <w:rPr>
-                            <w:noProof/>
-                          </w:rPr>
-                          <w:t>2</w:t>
-                        </w:r>
-                      </w:fldSimple>
+                      <w:r>
+                        <w:fldChar w:fldCharType="begin"/>
+                      </w:r>
+                      <w:r>
+                        <w:instrText xml:space="preserve"> SEQ Figure \* ARABIC </w:instrText>
+                      </w:r>
+                      <w:r>
+                        <w:fldChar w:fldCharType="separate"/>
+                      </w:r>
+                      <w:r>
+                        <w:rPr>
+                          <w:noProof/>
+                        </w:rPr>
+                        <w:t>2</w:t>
+                      </w:r>
+                      <w:r>
+                        <w:fldChar w:fldCharType="end"/>
+                      </w:r>
                       <w:r>
                         <w:t>: Code from Presentation Class 1</w:t>
                       </w:r>
@@ -697,6 +771,9 @@
       </w:r>
     </w:p>
     <w:p>
+      <w:pPr>
+        <w:jc w:val="both"/>
+      </w:pPr>
       <w:r>
         <w:t>And later in the code:</w:t>
       </w:r>
@@ -704,6 +781,7 @@
     <w:p>
       <w:pPr>
         <w:keepNext/>
+        <w:jc w:val="both"/>
       </w:pPr>
       <w:r>
         <w:drawing>
@@ -746,18 +824,29 @@
     <w:p>
       <w:pPr>
         <w:pStyle w:val="Caption"/>
+        <w:jc w:val="both"/>
       </w:pPr>
       <w:r>
         <w:t xml:space="preserve">Figure </w:t>
       </w:r>
-      <w:fldSimple w:instr=" SEQ Figure \* ARABIC ">
-        <w:r>
-          <w:rPr>
-            <w:noProof/>
-          </w:rPr>
-          <w:t>3</w:t>
-        </w:r>
-      </w:fldSimple>
+      <w:r>
+        <w:fldChar w:fldCharType="begin"/>
+      </w:r>
+      <w:r>
+        <w:instrText xml:space="preserve"> SEQ Figure \* ARABIC </w:instrText>
+      </w:r>
+      <w:r>
+        <w:fldChar w:fldCharType="separate"/>
+      </w:r>
+      <w:r>
+        <w:rPr>
+          <w:noProof/>
+        </w:rPr>
+        <w:t>3</w:t>
+      </w:r>
+      <w:r>
+        <w:fldChar w:fldCharType="end"/>
+      </w:r>
       <w:r>
         <w:t xml:space="preserve">: Code from </w:t>
       </w:r>
@@ -785,6 +874,7 @@
           <w:ilvl w:val="0"/>
           <w:numId w:val="19"/>
         </w:numPr>
+        <w:jc w:val="both"/>
       </w:pPr>
       <w:bookmarkStart w:id="0" w:name="_Ref224252026"/>
       <w:r>
@@ -793,6 +883,9 @@
       <w:bookmarkEnd w:id="0"/>
     </w:p>
     <w:p>
+      <w:pPr>
+        <w:jc w:val="both"/>
+      </w:pPr>
       <w:r>
         <w:t>Classes involved:</w:t>
       </w:r>
@@ -804,6 +897,7 @@
           <w:ilvl w:val="0"/>
           <w:numId w:val="17"/>
         </w:numPr>
+        <w:jc w:val="both"/>
       </w:pPr>
       <w:proofErr w:type="spellStart"/>
       <w:r>
@@ -818,6 +912,7 @@
           <w:ilvl w:val="0"/>
           <w:numId w:val="17"/>
         </w:numPr>
+        <w:jc w:val="both"/>
       </w:pPr>
       <w:proofErr w:type="spellStart"/>
       <w:r>
@@ -832,6 +927,7 @@
           <w:ilvl w:val="0"/>
           <w:numId w:val="17"/>
         </w:numPr>
+        <w:jc w:val="both"/>
       </w:pPr>
       <w:proofErr w:type="spellStart"/>
       <w:r>
@@ -846,17 +942,24 @@
           <w:ilvl w:val="0"/>
           <w:numId w:val="17"/>
         </w:numPr>
+        <w:jc w:val="both"/>
       </w:pPr>
       <w:r>
         <w:t>Slide</w:t>
       </w:r>
     </w:p>
     <w:p>
+      <w:pPr>
+        <w:jc w:val="both"/>
+      </w:pPr>
       <w:r>
         <w:t>Issue:</w:t>
       </w:r>
     </w:p>
     <w:p>
+      <w:pPr>
+        <w:jc w:val="both"/>
+      </w:pPr>
       <w:r>
         <w:rPr>
           <w:noProof/>
@@ -917,14 +1020,24 @@
                             <w:r>
                               <w:t xml:space="preserve">Figure </w:t>
                             </w:r>
-                            <w:fldSimple w:instr=" SEQ Figure \* ARABIC ">
-                              <w:r>
-                                <w:rPr>
-                                  <w:noProof/>
-                                </w:rPr>
-                                <w:t>4</w:t>
-                              </w:r>
-                            </w:fldSimple>
+                            <w:r>
+                              <w:fldChar w:fldCharType="begin"/>
+                            </w:r>
+                            <w:r>
+                              <w:instrText xml:space="preserve"> SEQ Figure \* ARABIC </w:instrText>
+                            </w:r>
+                            <w:r>
+                              <w:fldChar w:fldCharType="separate"/>
+                            </w:r>
+                            <w:r>
+                              <w:rPr>
+                                <w:noProof/>
+                              </w:rPr>
+                              <w:t>4</w:t>
+                            </w:r>
+                            <w:r>
+                              <w:fldChar w:fldCharType="end"/>
+                            </w:r>
                             <w:r>
                               <w:t xml:space="preserve">: Code from </w:t>
                             </w:r>
@@ -953,7 +1066,7 @@
           </mc:Choice>
           <mc:Fallback>
             <w:pict>
-              <v:shape w14:anchorId="21F9B6B5" id="Text Box 6" o:spid="_x0000_s1028" type="#_x0000_t202" style="position:absolute;margin-left:0;margin-top:277.1pt;width:475.3pt;height:.05pt;z-index:251663360;visibility:visible;mso-wrap-style:square;mso-wrap-distance-left:9pt;mso-wrap-distance-top:0;mso-wrap-distance-right:9pt;mso-wrap-distance-bottom:0;mso-position-horizontal:absolute;mso-position-horizontal-relative:text;mso-position-vertical:absolute;mso-position-vertical-relative:text;v-text-anchor:top" o:gfxdata="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" stroked="f">
+              <v:shape w14:anchorId="21F9B6B5" id="Text Box 6" o:spid="_x0000_s1028" type="#_x0000_t202" style="position:absolute;left:0;text-align:left;margin-left:0;margin-top:277.1pt;width:475.3pt;height:.05pt;z-index:251663360;visibility:visible;mso-wrap-style:square;mso-wrap-distance-left:9pt;mso-wrap-distance-top:0;mso-wrap-distance-right:9pt;mso-wrap-distance-bottom:0;mso-position-horizontal:absolute;mso-position-horizontal-relative:text;mso-position-vertical:absolute;mso-position-vertical-relative:text;v-text-anchor:top" o:gfxdata="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" stroked="f">
                 <v:textbox style="mso-fit-shape-to-text:t" inset="0,0,0,0">
                   <w:txbxContent>
                     <w:p>
@@ -967,14 +1080,24 @@
                       <w:r>
                         <w:t xml:space="preserve">Figure </w:t>
                       </w:r>
-                      <w:fldSimple w:instr=" SEQ Figure \* ARABIC ">
-                        <w:r>
-                          <w:rPr>
-                            <w:noProof/>
-                          </w:rPr>
-                          <w:t>4</w:t>
-                        </w:r>
-                      </w:fldSimple>
+                      <w:r>
+                        <w:fldChar w:fldCharType="begin"/>
+                      </w:r>
+                      <w:r>
+                        <w:instrText xml:space="preserve"> SEQ Figure \* ARABIC </w:instrText>
+                      </w:r>
+                      <w:r>
+                        <w:fldChar w:fldCharType="separate"/>
+                      </w:r>
+                      <w:r>
+                        <w:rPr>
+                          <w:noProof/>
+                        </w:rPr>
+                        <w:t>4</w:t>
+                      </w:r>
+                      <w:r>
+                        <w:fldChar w:fldCharType="end"/>
+                      </w:r>
                       <w:r>
                         <w:t xml:space="preserve">: Code from </w:t>
                       </w:r>
@@ -1085,6 +1208,9 @@
       </w:r>
     </w:p>
     <w:p>
+      <w:pPr>
+        <w:jc w:val="both"/>
+      </w:pPr>
       <w:r>
         <w:t xml:space="preserve">This code shows that the class determines the slide item type and directly instantiates the corresponding objects. As a result, the class combines file access, parsing logic, and object creation. This violates the </w:t>
       </w:r>
@@ -1106,12 +1232,16 @@
           <w:ilvl w:val="0"/>
           <w:numId w:val="19"/>
         </w:numPr>
+        <w:jc w:val="both"/>
       </w:pPr>
       <w:r>
         <w:t>Violation of the Open-Closed Principle</w:t>
       </w:r>
     </w:p>
     <w:p>
+      <w:pPr>
+        <w:jc w:val="both"/>
+      </w:pPr>
       <w:r>
         <w:t>Class involved:</w:t>
       </w:r>
@@ -1123,6 +1253,7 @@
           <w:ilvl w:val="0"/>
           <w:numId w:val="18"/>
         </w:numPr>
+        <w:jc w:val="both"/>
       </w:pPr>
       <w:proofErr w:type="spellStart"/>
       <w:r>
@@ -1137,6 +1268,7 @@
           <w:ilvl w:val="0"/>
           <w:numId w:val="18"/>
         </w:numPr>
+        <w:jc w:val="both"/>
       </w:pPr>
       <w:proofErr w:type="spellStart"/>
       <w:r>
@@ -1151,6 +1283,7 @@
           <w:ilvl w:val="0"/>
           <w:numId w:val="18"/>
         </w:numPr>
+        <w:jc w:val="both"/>
       </w:pPr>
       <w:proofErr w:type="spellStart"/>
       <w:r>
@@ -1159,11 +1292,17 @@
       <w:proofErr w:type="spellEnd"/>
     </w:p>
     <w:p>
+      <w:pPr>
+        <w:jc w:val="both"/>
+      </w:pPr>
       <w:r>
         <w:t>Issue:</w:t>
       </w:r>
     </w:p>
     <w:p>
+      <w:pPr>
+        <w:jc w:val="both"/>
+      </w:pPr>
       <w:r>
         <w:t xml:space="preserve">The system is not easily extensible with new types of slide items. In the </w:t>
       </w:r>
@@ -1186,6 +1325,9 @@
       </w:r>
     </w:p>
     <w:p>
+      <w:pPr>
+        <w:jc w:val="both"/>
+      </w:pPr>
       <w:r>
         <w:t xml:space="preserve">Figure 4 shows that every time a new slide item type is introduced (for example </w:t>
       </w:r>
@@ -1218,6 +1360,7 @@
           <w:ilvl w:val="0"/>
           <w:numId w:val="19"/>
         </w:numPr>
+        <w:jc w:val="both"/>
       </w:pPr>
       <w:r>
         <w:lastRenderedPageBreak/>
@@ -1225,6 +1368,9 @@
       </w:r>
     </w:p>
     <w:p>
+      <w:pPr>
+        <w:jc w:val="both"/>
+      </w:pPr>
       <w:r>
         <w:t>Classes involved:</w:t>
       </w:r>
@@ -1236,17 +1382,24 @@
           <w:ilvl w:val="0"/>
           <w:numId w:val="20"/>
         </w:numPr>
+        <w:jc w:val="both"/>
       </w:pPr>
       <w:r>
         <w:t>Style</w:t>
       </w:r>
     </w:p>
     <w:p>
+      <w:pPr>
+        <w:jc w:val="both"/>
+      </w:pPr>
       <w:r>
         <w:t>Issue:</w:t>
       </w:r>
     </w:p>
     <w:p>
+      <w:pPr>
+        <w:jc w:val="both"/>
+      </w:pPr>
       <w:r>
         <w:t xml:space="preserve">The visual styling of slides is managed by the </w:t>
       </w:r>
@@ -1261,6 +1414,9 @@
       </w:r>
     </w:p>
     <w:p>
+      <w:pPr>
+        <w:jc w:val="both"/>
+      </w:pPr>
       <w:r>
         <w:drawing>
           <wp:inline distT="0" distB="0" distL="0" distR="0" wp14:anchorId="5BFC9C3B" wp14:editId="5ED8A036">
@@ -1300,6 +1456,9 @@
       </w:r>
     </w:p>
     <w:p>
+      <w:pPr>
+        <w:jc w:val="both"/>
+      </w:pPr>
       <w:r>
         <w:drawing>
           <wp:inline distT="0" distB="0" distL="0" distR="0" wp14:anchorId="36EFB2CE" wp14:editId="34A9C965">
@@ -1339,6 +1498,9 @@
       </w:r>
     </w:p>
     <w:p>
+      <w:pPr>
+        <w:jc w:val="both"/>
+      </w:pPr>
       <w:r>
         <w:t xml:space="preserve">The styles are defined at runtime using fixed values for font size, indentation, and other layout properties. </w:t>
       </w:r>
@@ -1383,12 +1545,16 @@
           <w:ilvl w:val="0"/>
           <w:numId w:val="19"/>
         </w:numPr>
+        <w:jc w:val="both"/>
       </w:pPr>
       <w:r>
         <w:t>Direct Dependency on Concrete Persistence Class</w:t>
       </w:r>
     </w:p>
     <w:p>
+      <w:pPr>
+        <w:jc w:val="both"/>
+      </w:pPr>
       <w:r>
         <w:t>Classes Involved:</w:t>
       </w:r>
@@ -1400,6 +1566,7 @@
           <w:ilvl w:val="0"/>
           <w:numId w:val="20"/>
         </w:numPr>
+        <w:jc w:val="both"/>
       </w:pPr>
       <w:proofErr w:type="spellStart"/>
       <w:r>
@@ -1414,6 +1581,7 @@
           <w:ilvl w:val="0"/>
           <w:numId w:val="20"/>
         </w:numPr>
+        <w:jc w:val="both"/>
       </w:pPr>
       <w:proofErr w:type="spellStart"/>
       <w:r>
@@ -1422,6 +1590,9 @@
       <w:proofErr w:type="spellEnd"/>
     </w:p>
     <w:p>
+      <w:pPr>
+        <w:jc w:val="both"/>
+      </w:pPr>
       <w:r>
         <w:t>Issue:</w:t>
       </w:r>
@@ -1465,6 +1636,9 @@
       </w:r>
     </w:p>
     <w:p>
+      <w:pPr>
+        <w:jc w:val="both"/>
+      </w:pPr>
       <w:r>
         <w:lastRenderedPageBreak/>
         <w:drawing>
@@ -1505,12 +1679,16 @@
       </w:r>
     </w:p>
     <w:p>
+      <w:pPr>
+        <w:jc w:val="both"/>
+      </w:pPr>
       <w:r>
         <w:t>The controller becomes tightly coupled to the XML implementation. If another storage format or persistence method were introduced, the controller would need to be modified. A more flexible design would depend on abstractions rather than concrete implementations.</w:t>
       </w:r>
     </w:p>
     <w:p>
       <w:pPr>
+        <w:jc w:val="both"/>
         <w:rPr>
           <w:rFonts w:asciiTheme="majorHAnsi" w:eastAsiaTheme="majorEastAsia" w:hAnsiTheme="majorHAnsi" w:cstheme="majorBidi"/>
           <w:color w:val="0F4761" w:themeColor="accent1" w:themeShade="BF"/>
@@ -1912,9 +2090,842 @@
     </w:p>
     <w:p>
       <w:pPr>
-        <w:spacing w:after="0"/>
         <w:jc w:val="both"/>
       </w:pPr>
+      <w:r>
+        <w:br w:type="page"/>
+      </w:r>
+    </w:p>
+    <w:p>
+      <w:pPr>
+        <w:pStyle w:val="Heading1"/>
+        <w:numPr>
+          <w:ilvl w:val="0"/>
+          <w:numId w:val="2"/>
+        </w:numPr>
+        <w:jc w:val="both"/>
+      </w:pPr>
+      <w:r>
+        <w:lastRenderedPageBreak/>
+        <w:t>Redesign (Future Architecture)</w:t>
+      </w:r>
+    </w:p>
+    <w:p>
+      <w:pPr>
+        <w:pStyle w:val="Heading4"/>
+        <w:numPr>
+          <w:ilvl w:val="0"/>
+          <w:numId w:val="25"/>
+        </w:numPr>
+        <w:rPr>
+          <w:lang/>
+        </w:rPr>
+      </w:pPr>
+      <w:r>
+        <w:rPr>
+          <w:lang/>
+        </w:rPr>
+        <w:t>Overview of the Redesigned Architecture</w:t>
+      </w:r>
+    </w:p>
+    <w:p>
+      <w:pPr>
+        <w:rPr>
+          <w:lang/>
+        </w:rPr>
+      </w:pPr>
+      <w:r>
+        <w:rPr>
+          <w:lang/>
+        </w:rPr>
+        <w:t>The updated architecture enforces strict separation between:</w:t>
+      </w:r>
+    </w:p>
+    <w:p>
+      <w:pPr>
+        <w:numPr>
+          <w:ilvl w:val="0"/>
+          <w:numId w:val="21"/>
+        </w:numPr>
+        <w:rPr>
+          <w:lang/>
+        </w:rPr>
+      </w:pPr>
+      <w:r>
+        <w:rPr>
+          <w:b/>
+          <w:bCs/>
+          <w:lang/>
+        </w:rPr>
+        <w:t>Presentation Layer</w:t>
+      </w:r>
+      <w:r>
+        <w:rPr>
+          <w:lang/>
+        </w:rPr>
+        <w:t xml:space="preserve"> – responsible only for displaying slides</w:t>
+      </w:r>
+    </w:p>
+    <w:p>
+      <w:pPr>
+        <w:numPr>
+          <w:ilvl w:val="0"/>
+          <w:numId w:val="21"/>
+        </w:numPr>
+        <w:rPr>
+          <w:lang/>
+        </w:rPr>
+      </w:pPr>
+      <w:r>
+        <w:rPr>
+          <w:b/>
+          <w:bCs/>
+          <w:lang/>
+        </w:rPr>
+        <w:t>Controller Layer</w:t>
+      </w:r>
+      <w:r>
+        <w:rPr>
+          <w:lang/>
+        </w:rPr>
+        <w:t xml:space="preserve"> – handles user input and delegates actions</w:t>
+      </w:r>
+    </w:p>
+    <w:p>
+      <w:pPr>
+        <w:numPr>
+          <w:ilvl w:val="0"/>
+          <w:numId w:val="21"/>
+        </w:numPr>
+        <w:rPr>
+          <w:lang/>
+        </w:rPr>
+      </w:pPr>
+      <w:r>
+        <w:rPr>
+          <w:b/>
+          <w:bCs/>
+          <w:lang/>
+        </w:rPr>
+        <w:t>Domain Layer</w:t>
+      </w:r>
+      <w:r>
+        <w:rPr>
+          <w:lang/>
+        </w:rPr>
+        <w:t xml:space="preserve"> – contains pure data and business logic</w:t>
+      </w:r>
+    </w:p>
+    <w:p>
+      <w:pPr>
+        <w:numPr>
+          <w:ilvl w:val="0"/>
+          <w:numId w:val="21"/>
+        </w:numPr>
+        <w:rPr>
+          <w:lang/>
+        </w:rPr>
+      </w:pPr>
+      <w:r>
+        <w:rPr>
+          <w:b/>
+          <w:bCs/>
+          <w:lang/>
+        </w:rPr>
+        <w:t>Persistence Layer</w:t>
+      </w:r>
+      <w:r>
+        <w:rPr>
+          <w:lang/>
+        </w:rPr>
+        <w:t xml:space="preserve"> – loads and saves presentations through an abstraction</w:t>
+      </w:r>
+    </w:p>
+    <w:p>
+      <w:pPr>
+        <w:rPr>
+          <w:lang/>
+        </w:rPr>
+      </w:pPr>
+      <w:r>
+        <w:rPr>
+          <w:lang/>
+        </w:rPr>
+        <w:t>This eliminates circular dependencies and restores a proper MVC</w:t>
+      </w:r>
+      <w:r>
+        <w:rPr>
+          <w:lang/>
+        </w:rPr>
+        <w:noBreakHyphen/>
+        <w:t>style structure.</w:t>
+      </w:r>
+    </w:p>
+    <w:p>
+      <w:pPr>
+        <w:pStyle w:val="Heading4"/>
+        <w:numPr>
+          <w:ilvl w:val="0"/>
+          <w:numId w:val="25"/>
+        </w:numPr>
+        <w:rPr>
+          <w:lang/>
+        </w:rPr>
+      </w:pPr>
+      <w:r>
+        <w:rPr>
+          <w:lang/>
+        </w:rPr>
+        <w:t>High</w:t>
+      </w:r>
+      <w:r>
+        <w:rPr>
+          <w:lang/>
+        </w:rPr>
+        <w:noBreakHyphen/>
+        <w:t>Level Architecture Diagram</w:t>
+      </w:r>
+    </w:p>
+    <w:p>
+      <w:pPr>
+        <w:rPr>
+          <w:lang/>
+        </w:rPr>
+      </w:pPr>
+      <w:r>
+        <w:rPr>
+          <w:i/>
+          <w:iCs/>
+          <w:lang/>
+        </w:rPr>
+        <w:t>(This is not UML — just a simple structural overview.)</w:t>
+      </w:r>
+    </w:p>
+    <w:p>
+      <w:pPr>
+        <w:rPr>
+          <w:lang/>
+        </w:rPr>
+      </w:pPr>
+      <w:r>
+        <w:rPr>
+          <w:lang/>
+        </w:rPr>
+        <w:t>Code</w:t>
+      </w:r>
+    </w:p>
+    <w:p>
+      <w:pPr>
+        <w:rPr>
+          <w:lang/>
+        </w:rPr>
+      </w:pPr>
+      <w:r>
+        <w:rPr>
+          <w:lang/>
+        </w:rPr>
+        <w:t>Presentation Layer</w:t>
+      </w:r>
+    </w:p>
+    <w:p>
+      <w:pPr>
+        <w:rPr>
+          <w:lang/>
+        </w:rPr>
+      </w:pPr>
+      <w:r>
+        <w:rPr>
+          <w:lang/>
+        </w:rPr>
+        <w:t xml:space="preserve">    ↓</w:t>
+      </w:r>
+    </w:p>
+    <w:p>
+      <w:pPr>
+        <w:rPr>
+          <w:lang/>
+        </w:rPr>
+      </w:pPr>
+      <w:r>
+        <w:rPr>
+          <w:lang/>
+        </w:rPr>
+        <w:t>Controller Layer</w:t>
+      </w:r>
+    </w:p>
+    <w:p>
+      <w:pPr>
+        <w:rPr>
+          <w:lang/>
+        </w:rPr>
+      </w:pPr>
+      <w:r>
+        <w:rPr>
+          <w:lang/>
+        </w:rPr>
+        <w:t xml:space="preserve">    ↓</w:t>
+      </w:r>
+    </w:p>
+    <w:p>
+      <w:pPr>
+        <w:rPr>
+          <w:lang/>
+        </w:rPr>
+      </w:pPr>
+      <w:r>
+        <w:rPr>
+          <w:lang/>
+        </w:rPr>
+        <w:t>Domain Layer</w:t>
+      </w:r>
+    </w:p>
+    <w:p>
+      <w:pPr>
+        <w:rPr>
+          <w:lang/>
+        </w:rPr>
+      </w:pPr>
+      <w:r>
+        <w:rPr>
+          <w:lang/>
+        </w:rPr>
+        <w:t xml:space="preserve">    ↓</w:t>
+      </w:r>
+    </w:p>
+    <w:p>
+      <w:pPr>
+        <w:rPr>
+          <w:lang/>
+        </w:rPr>
+      </w:pPr>
+      <w:r>
+        <w:rPr>
+          <w:lang/>
+        </w:rPr>
+        <w:t>Persistence Layer</w:t>
+      </w:r>
+    </w:p>
+    <w:p>
+      <w:pPr>
+        <w:rPr>
+          <w:lang/>
+        </w:rPr>
+      </w:pPr>
+      <w:r>
+        <w:rPr>
+          <w:lang/>
+        </w:rPr>
+        <w:t>This one</w:t>
+      </w:r>
+      <w:r>
+        <w:rPr>
+          <w:lang/>
+        </w:rPr>
+        <w:noBreakHyphen/>
+        <w:t>directional flow ensures that no layer depends on a higher layer.</w:t>
+      </w:r>
+    </w:p>
+    <w:p>
+      <w:pPr>
+        <w:pStyle w:val="Heading4"/>
+        <w:numPr>
+          <w:ilvl w:val="0"/>
+          <w:numId w:val="25"/>
+        </w:numPr>
+        <w:rPr>
+          <w:lang/>
+        </w:rPr>
+      </w:pPr>
+      <w:r>
+        <w:rPr>
+          <w:lang/>
+        </w:rPr>
+        <w:t>Updated Class Structure</w:t>
+      </w:r>
+    </w:p>
+    <w:p>
+      <w:pPr>
+        <w:rPr>
+          <w:lang/>
+        </w:rPr>
+      </w:pPr>
+      <w:r>
+        <w:rPr>
+          <w:i/>
+          <w:iCs/>
+        </w:rPr>
+        <w:t>(</w:t>
+      </w:r>
+      <w:proofErr w:type="gramStart"/>
+      <w:r>
+        <w:rPr>
+          <w:i/>
+          <w:iCs/>
+        </w:rPr>
+        <w:t>new</w:t>
+      </w:r>
+      <w:proofErr w:type="gramEnd"/>
+      <w:r>
+        <w:rPr>
+          <w:i/>
+          <w:iCs/>
+        </w:rPr>
+        <w:t xml:space="preserve"> </w:t>
+      </w:r>
+      <w:r>
+        <w:rPr>
+          <w:i/>
+          <w:iCs/>
+          <w:lang/>
+        </w:rPr>
+        <w:t>class diagram here.)</w:t>
+      </w:r>
+    </w:p>
+    <w:p>
+      <w:pPr>
+        <w:rPr>
+          <w:lang/>
+        </w:rPr>
+      </w:pPr>
+      <w:r>
+        <w:rPr>
+          <w:lang/>
+        </w:rPr>
+        <w:t>The redesigned class structure introduces:</w:t>
+      </w:r>
+    </w:p>
+    <w:p>
+      <w:pPr>
+        <w:numPr>
+          <w:ilvl w:val="0"/>
+          <w:numId w:val="22"/>
+        </w:numPr>
+        <w:rPr>
+          <w:lang/>
+        </w:rPr>
+      </w:pPr>
+      <w:r>
+        <w:rPr>
+          <w:lang/>
+        </w:rPr>
+        <w:t>A clean domain model without rendering logic</w:t>
+      </w:r>
+    </w:p>
+    <w:p>
+      <w:pPr>
+        <w:numPr>
+          <w:ilvl w:val="0"/>
+          <w:numId w:val="22"/>
+        </w:numPr>
+        <w:rPr>
+          <w:lang/>
+        </w:rPr>
+      </w:pPr>
+      <w:r>
+        <w:rPr>
+          <w:lang/>
+        </w:rPr>
+        <w:t>Dedicated renderer classes for drawing slide items</w:t>
+      </w:r>
+    </w:p>
+    <w:p>
+      <w:pPr>
+        <w:numPr>
+          <w:ilvl w:val="0"/>
+          <w:numId w:val="22"/>
+        </w:numPr>
+        <w:rPr>
+          <w:lang/>
+        </w:rPr>
+      </w:pPr>
+      <w:r>
+        <w:rPr>
+          <w:lang/>
+        </w:rPr>
+        <w:t>An Accessor interface for persistence, allowing multiple file formats</w:t>
+      </w:r>
+    </w:p>
+    <w:p>
+      <w:pPr>
+        <w:numPr>
+          <w:ilvl w:val="0"/>
+          <w:numId w:val="22"/>
+        </w:numPr>
+        <w:rPr>
+          <w:lang/>
+        </w:rPr>
+      </w:pPr>
+      <w:r>
+        <w:rPr>
+          <w:lang/>
+        </w:rPr>
+        <w:t>A factory for creating slide items without modifying existing code</w:t>
+      </w:r>
+    </w:p>
+    <w:p>
+      <w:pPr>
+        <w:numPr>
+          <w:ilvl w:val="0"/>
+          <w:numId w:val="22"/>
+        </w:numPr>
+        <w:rPr>
+          <w:lang/>
+        </w:rPr>
+      </w:pPr>
+      <w:r>
+        <w:rPr>
+          <w:lang/>
+        </w:rPr>
+        <w:lastRenderedPageBreak/>
+        <w:t>A configurable Style system instead of static hardcoded values</w:t>
+      </w:r>
+    </w:p>
+    <w:p>
+      <w:pPr>
+        <w:pStyle w:val="Heading4"/>
+        <w:numPr>
+          <w:ilvl w:val="0"/>
+          <w:numId w:val="25"/>
+        </w:numPr>
+        <w:rPr>
+          <w:lang/>
+        </w:rPr>
+      </w:pPr>
+      <w:r>
+        <w:rPr>
+          <w:lang/>
+        </w:rPr>
+        <w:t>Key Improvements</w:t>
+      </w:r>
+    </w:p>
+    <w:p>
+      <w:pPr>
+        <w:rPr>
+          <w:lang/>
+        </w:rPr>
+      </w:pPr>
+      <w:r>
+        <w:rPr>
+          <w:lang/>
+        </w:rPr>
+        <w:t>The redesign addresses the issues identified in Chapter 1 through the following changes:</w:t>
+      </w:r>
+    </w:p>
+    <w:p>
+      <w:pPr>
+        <w:numPr>
+          <w:ilvl w:val="0"/>
+          <w:numId w:val="23"/>
+        </w:numPr>
+        <w:rPr>
+          <w:lang/>
+        </w:rPr>
+      </w:pPr>
+      <w:r>
+        <w:rPr>
+          <w:b/>
+          <w:bCs/>
+          <w:lang/>
+        </w:rPr>
+        <w:t>Rendering logic removed from domain classes</w:t>
+      </w:r>
+      <w:r>
+        <w:rPr>
+          <w:lang/>
+        </w:rPr>
+        <w:t>, improving testability</w:t>
+      </w:r>
+    </w:p>
+    <w:p>
+      <w:pPr>
+        <w:numPr>
+          <w:ilvl w:val="0"/>
+          <w:numId w:val="23"/>
+        </w:numPr>
+        <w:rPr>
+          <w:lang/>
+        </w:rPr>
+      </w:pPr>
+      <w:r>
+        <w:rPr>
+          <w:b/>
+          <w:bCs/>
+          <w:lang/>
+        </w:rPr>
+        <w:t>Controllers depend on an abstraction (</w:t>
+      </w:r>
+      <w:r>
+        <w:rPr>
+          <w:lang/>
+        </w:rPr>
+        <w:t>Accessor</w:t>
+      </w:r>
+      <w:r>
+        <w:rPr>
+          <w:b/>
+          <w:bCs/>
+          <w:lang/>
+        </w:rPr>
+        <w:t>)</w:t>
+      </w:r>
+      <w:r>
+        <w:rPr>
+          <w:lang/>
+        </w:rPr>
+        <w:t>, not concrete classes</w:t>
+      </w:r>
+    </w:p>
+    <w:p>
+      <w:pPr>
+        <w:numPr>
+          <w:ilvl w:val="0"/>
+          <w:numId w:val="23"/>
+        </w:numPr>
+        <w:rPr>
+          <w:lang/>
+        </w:rPr>
+      </w:pPr>
+      <w:r>
+        <w:rPr>
+          <w:b/>
+          <w:bCs/>
+          <w:lang/>
+        </w:rPr>
+        <w:t>Slide item creation delegated to a factory</w:t>
+      </w:r>
+      <w:r>
+        <w:rPr>
+          <w:lang/>
+        </w:rPr>
+        <w:t>, supporting extensibility</w:t>
+      </w:r>
+    </w:p>
+    <w:p>
+      <w:pPr>
+        <w:numPr>
+          <w:ilvl w:val="0"/>
+          <w:numId w:val="23"/>
+        </w:numPr>
+        <w:rPr>
+          <w:lang/>
+        </w:rPr>
+      </w:pPr>
+      <w:r>
+        <w:rPr>
+          <w:b/>
+          <w:bCs/>
+          <w:lang/>
+        </w:rPr>
+        <w:t>Presentation no longer updates the view directly</w:t>
+      </w:r>
+      <w:r>
+        <w:rPr>
+          <w:lang/>
+        </w:rPr>
+        <w:t>, restoring MVC separation</w:t>
+      </w:r>
+    </w:p>
+    <w:p>
+      <w:pPr>
+        <w:numPr>
+          <w:ilvl w:val="0"/>
+          <w:numId w:val="23"/>
+        </w:numPr>
+        <w:rPr>
+          <w:lang/>
+        </w:rPr>
+      </w:pPr>
+      <w:r>
+        <w:rPr>
+          <w:b/>
+          <w:bCs/>
+          <w:lang/>
+        </w:rPr>
+        <w:t>Styles are configurable</w:t>
+      </w:r>
+      <w:r>
+        <w:rPr>
+          <w:lang/>
+        </w:rPr>
+        <w:t>, not hardcoded</w:t>
+      </w:r>
+    </w:p>
+    <w:p>
+      <w:pPr>
+        <w:pStyle w:val="Heading4"/>
+        <w:numPr>
+          <w:ilvl w:val="0"/>
+          <w:numId w:val="25"/>
+        </w:numPr>
+        <w:rPr>
+          <w:lang/>
+        </w:rPr>
+      </w:pPr>
+      <w:r>
+        <w:rPr>
+          <w:lang/>
+        </w:rPr>
+        <w:t>Application of SOLID Principles</w:t>
+      </w:r>
+    </w:p>
+    <w:p>
+      <w:pPr>
+        <w:rPr>
+          <w:lang/>
+        </w:rPr>
+      </w:pPr>
+      <w:r>
+        <w:rPr>
+          <w:lang/>
+        </w:rPr>
+        <w:t>The redesigned architecture applies SOLID as follows:</w:t>
+      </w:r>
+    </w:p>
+    <w:p>
+      <w:pPr>
+        <w:numPr>
+          <w:ilvl w:val="0"/>
+          <w:numId w:val="24"/>
+        </w:numPr>
+        <w:rPr>
+          <w:lang/>
+        </w:rPr>
+      </w:pPr>
+      <w:r>
+        <w:rPr>
+          <w:b/>
+          <w:bCs/>
+          <w:lang/>
+        </w:rPr>
+        <w:t>SRP</w:t>
+      </w:r>
+      <w:r>
+        <w:rPr>
+          <w:lang/>
+        </w:rPr>
+        <w:t>: Each class has one responsibility (rendering, domain logic, persistence, input handling).</w:t>
+      </w:r>
+    </w:p>
+    <w:p>
+      <w:pPr>
+        <w:numPr>
+          <w:ilvl w:val="0"/>
+          <w:numId w:val="24"/>
+        </w:numPr>
+        <w:rPr>
+          <w:lang/>
+        </w:rPr>
+      </w:pPr>
+      <w:r>
+        <w:rPr>
+          <w:b/>
+          <w:bCs/>
+          <w:lang/>
+        </w:rPr>
+        <w:t>OCP</w:t>
+      </w:r>
+      <w:r>
+        <w:rPr>
+          <w:lang/>
+        </w:rPr>
+        <w:t>: New slide item types can be added without modifying existing code.</w:t>
+      </w:r>
+    </w:p>
+    <w:p>
+      <w:pPr>
+        <w:numPr>
+          <w:ilvl w:val="0"/>
+          <w:numId w:val="24"/>
+        </w:numPr>
+        <w:rPr>
+          <w:lang/>
+        </w:rPr>
+      </w:pPr>
+      <w:r>
+        <w:rPr>
+          <w:b/>
+          <w:bCs/>
+          <w:lang/>
+        </w:rPr>
+        <w:t>LSP</w:t>
+      </w:r>
+      <w:r>
+        <w:rPr>
+          <w:lang/>
+        </w:rPr>
+        <w:t>: All slide items follow the same interface and can be substituted safely.</w:t>
+      </w:r>
+    </w:p>
+    <w:p>
+      <w:pPr>
+        <w:numPr>
+          <w:ilvl w:val="0"/>
+          <w:numId w:val="24"/>
+        </w:numPr>
+        <w:rPr>
+          <w:lang/>
+        </w:rPr>
+      </w:pPr>
+      <w:r>
+        <w:rPr>
+          <w:b/>
+          <w:bCs/>
+          <w:lang/>
+        </w:rPr>
+        <w:t>ISP</w:t>
+      </w:r>
+      <w:r>
+        <w:rPr>
+          <w:lang/>
+        </w:rPr>
+        <w:t>: Interfaces are small and focused (e.g., Accessor).</w:t>
+      </w:r>
+    </w:p>
+    <w:p>
+      <w:pPr>
+        <w:numPr>
+          <w:ilvl w:val="0"/>
+          <w:numId w:val="24"/>
+        </w:numPr>
+        <w:rPr>
+          <w:lang/>
+        </w:rPr>
+      </w:pPr>
+      <w:r>
+        <w:rPr>
+          <w:b/>
+          <w:bCs/>
+          <w:lang/>
+        </w:rPr>
+        <w:t>DIP</w:t>
+      </w:r>
+      <w:r>
+        <w:rPr>
+          <w:lang/>
+        </w:rPr>
+        <w:t>: Controllers depend on abstractions rather than concrete implementations.</w:t>
+      </w:r>
+    </w:p>
+    <w:p>
+      <w:pPr>
+        <w:pStyle w:val="Heading1"/>
+      </w:pPr>
+      <w:r>
+        <w:t>Summary</w:t>
+      </w:r>
+    </w:p>
+    <w:p>
+      <w:r>
+        <w:t xml:space="preserve">This document outlines the current structure and issues within the </w:t>
+      </w:r>
+      <w:proofErr w:type="spellStart"/>
+      <w:r>
+        <w:t>JabberPoint</w:t>
+      </w:r>
+      <w:proofErr w:type="spellEnd"/>
+      <w:r>
+        <w:t xml:space="preserve"> application and presents a redesigned architecture to improve its quality. The analysis shows that the existing system is tightly coupled, mixes responsibilities across layers, and violates several design principles. The redesign introduces a clear layered structure, removes rendering logic from domain classes, adds abstractions for persistence, and improves separation between model, view, and controller. These changes make the system more maintainable, extensible, and aligned with modern software development practices.</w:t>
+      </w:r>
     </w:p>
     <w:sectPr>
       <w:pgSz w:w="12240" w:h="15840"/>
@@ -2467,9 +3478,158 @@
     </w:lvl>
   </w:abstractNum>
   <w:abstractNum w:abstractNumId="4" w15:restartNumberingAfterBreak="0">
+    <w:nsid w:val="1B1527DF"/>
+    <w:multiLevelType w:val="multilevel"/>
+    <w:tmpl w:val="86724C80"/>
+    <w:lvl w:ilvl="0">
+      <w:start w:val="1"/>
+      <w:numFmt w:val="bullet"/>
+      <w:lvlText w:val=""/>
+      <w:lvlJc w:val="left"/>
+      <w:pPr>
+        <w:tabs>
+          <w:tab w:val="num" w:pos="720"/>
+        </w:tabs>
+        <w:ind w:left="720" w:hanging="360"/>
+      </w:pPr>
+      <w:rPr>
+        <w:rFonts w:ascii="Symbol" w:hAnsi="Symbol" w:hint="default"/>
+        <w:sz w:val="20"/>
+      </w:rPr>
+    </w:lvl>
+    <w:lvl w:ilvl="1" w:tentative="1">
+      <w:start w:val="1"/>
+      <w:numFmt w:val="bullet"/>
+      <w:lvlText w:val="o"/>
+      <w:lvlJc w:val="left"/>
+      <w:pPr>
+        <w:tabs>
+          <w:tab w:val="num" w:pos="1440"/>
+        </w:tabs>
+        <w:ind w:left="1440" w:hanging="360"/>
+      </w:pPr>
+      <w:rPr>
+        <w:rFonts w:ascii="Courier New" w:hAnsi="Courier New" w:hint="default"/>
+        <w:sz w:val="20"/>
+      </w:rPr>
+    </w:lvl>
+    <w:lvl w:ilvl="2" w:tentative="1">
+      <w:start w:val="1"/>
+      <w:numFmt w:val="bullet"/>
+      <w:lvlText w:val=""/>
+      <w:lvlJc w:val="left"/>
+      <w:pPr>
+        <w:tabs>
+          <w:tab w:val="num" w:pos="2160"/>
+        </w:tabs>
+        <w:ind w:left="2160" w:hanging="360"/>
+      </w:pPr>
+      <w:rPr>
+        <w:rFonts w:ascii="Wingdings" w:hAnsi="Wingdings" w:hint="default"/>
+        <w:sz w:val="20"/>
+      </w:rPr>
+    </w:lvl>
+    <w:lvl w:ilvl="3" w:tentative="1">
+      <w:start w:val="1"/>
+      <w:numFmt w:val="bullet"/>
+      <w:lvlText w:val=""/>
+      <w:lvlJc w:val="left"/>
+      <w:pPr>
+        <w:tabs>
+          <w:tab w:val="num" w:pos="2880"/>
+        </w:tabs>
+        <w:ind w:left="2880" w:hanging="360"/>
+      </w:pPr>
+      <w:rPr>
+        <w:rFonts w:ascii="Wingdings" w:hAnsi="Wingdings" w:hint="default"/>
+        <w:sz w:val="20"/>
+      </w:rPr>
+    </w:lvl>
+    <w:lvl w:ilvl="4" w:tentative="1">
+      <w:start w:val="1"/>
+      <w:numFmt w:val="bullet"/>
+      <w:lvlText w:val=""/>
+      <w:lvlJc w:val="left"/>
+      <w:pPr>
+        <w:tabs>
+          <w:tab w:val="num" w:pos="3600"/>
+        </w:tabs>
+        <w:ind w:left="3600" w:hanging="360"/>
+      </w:pPr>
+      <w:rPr>
+        <w:rFonts w:ascii="Wingdings" w:hAnsi="Wingdings" w:hint="default"/>
+        <w:sz w:val="20"/>
+      </w:rPr>
+    </w:lvl>
+    <w:lvl w:ilvl="5" w:tentative="1">
+      <w:start w:val="1"/>
+      <w:numFmt w:val="bullet"/>
+      <w:lvlText w:val=""/>
+      <w:lvlJc w:val="left"/>
+      <w:pPr>
+        <w:tabs>
+          <w:tab w:val="num" w:pos="4320"/>
+        </w:tabs>
+        <w:ind w:left="4320" w:hanging="360"/>
+      </w:pPr>
+      <w:rPr>
+        <w:rFonts w:ascii="Wingdings" w:hAnsi="Wingdings" w:hint="default"/>
+        <w:sz w:val="20"/>
+      </w:rPr>
+    </w:lvl>
+    <w:lvl w:ilvl="6" w:tentative="1">
+      <w:start w:val="1"/>
+      <w:numFmt w:val="bullet"/>
+      <w:lvlText w:val=""/>
+      <w:lvlJc w:val="left"/>
+      <w:pPr>
+        <w:tabs>
+          <w:tab w:val="num" w:pos="5040"/>
+        </w:tabs>
+        <w:ind w:left="5040" w:hanging="360"/>
+      </w:pPr>
+      <w:rPr>
+        <w:rFonts w:ascii="Wingdings" w:hAnsi="Wingdings" w:hint="default"/>
+        <w:sz w:val="20"/>
+      </w:rPr>
+    </w:lvl>
+    <w:lvl w:ilvl="7" w:tentative="1">
+      <w:start w:val="1"/>
+      <w:numFmt w:val="bullet"/>
+      <w:lvlText w:val=""/>
+      <w:lvlJc w:val="left"/>
+      <w:pPr>
+        <w:tabs>
+          <w:tab w:val="num" w:pos="5760"/>
+        </w:tabs>
+        <w:ind w:left="5760" w:hanging="360"/>
+      </w:pPr>
+      <w:rPr>
+        <w:rFonts w:ascii="Wingdings" w:hAnsi="Wingdings" w:hint="default"/>
+        <w:sz w:val="20"/>
+      </w:rPr>
+    </w:lvl>
+    <w:lvl w:ilvl="8" w:tentative="1">
+      <w:start w:val="1"/>
+      <w:numFmt w:val="bullet"/>
+      <w:lvlText w:val=""/>
+      <w:lvlJc w:val="left"/>
+      <w:pPr>
+        <w:tabs>
+          <w:tab w:val="num" w:pos="6480"/>
+        </w:tabs>
+        <w:ind w:left="6480" w:hanging="360"/>
+      </w:pPr>
+      <w:rPr>
+        <w:rFonts w:ascii="Wingdings" w:hAnsi="Wingdings" w:hint="default"/>
+        <w:sz w:val="20"/>
+      </w:rPr>
+    </w:lvl>
+  </w:abstractNum>
+  <w:abstractNum w:abstractNumId="5" w15:restartNumberingAfterBreak="0">
     <w:nsid w:val="1F937506"/>
     <w:multiLevelType w:val="hybridMultilevel"/>
-    <w:tmpl w:val="6FFA63F6"/>
+    <w:tmpl w:val="7F58ED26"/>
     <w:lvl w:ilvl="0" w:tplc="10000013">
       <w:start w:val="1"/>
       <w:numFmt w:val="upperRoman"/>
@@ -2552,7 +3712,156 @@
       </w:pPr>
     </w:lvl>
   </w:abstractNum>
-  <w:abstractNum w:abstractNumId="5" w15:restartNumberingAfterBreak="0">
+  <w:abstractNum w:abstractNumId="6" w15:restartNumberingAfterBreak="0">
+    <w:nsid w:val="2A414D9A"/>
+    <w:multiLevelType w:val="multilevel"/>
+    <w:tmpl w:val="B9F69EC6"/>
+    <w:lvl w:ilvl="0">
+      <w:start w:val="1"/>
+      <w:numFmt w:val="bullet"/>
+      <w:lvlText w:val=""/>
+      <w:lvlJc w:val="left"/>
+      <w:pPr>
+        <w:tabs>
+          <w:tab w:val="num" w:pos="720"/>
+        </w:tabs>
+        <w:ind w:left="720" w:hanging="360"/>
+      </w:pPr>
+      <w:rPr>
+        <w:rFonts w:ascii="Symbol" w:hAnsi="Symbol" w:hint="default"/>
+        <w:sz w:val="20"/>
+      </w:rPr>
+    </w:lvl>
+    <w:lvl w:ilvl="1" w:tentative="1">
+      <w:start w:val="1"/>
+      <w:numFmt w:val="bullet"/>
+      <w:lvlText w:val="o"/>
+      <w:lvlJc w:val="left"/>
+      <w:pPr>
+        <w:tabs>
+          <w:tab w:val="num" w:pos="1440"/>
+        </w:tabs>
+        <w:ind w:left="1440" w:hanging="360"/>
+      </w:pPr>
+      <w:rPr>
+        <w:rFonts w:ascii="Courier New" w:hAnsi="Courier New" w:hint="default"/>
+        <w:sz w:val="20"/>
+      </w:rPr>
+    </w:lvl>
+    <w:lvl w:ilvl="2" w:tentative="1">
+      <w:start w:val="1"/>
+      <w:numFmt w:val="bullet"/>
+      <w:lvlText w:val=""/>
+      <w:lvlJc w:val="left"/>
+      <w:pPr>
+        <w:tabs>
+          <w:tab w:val="num" w:pos="2160"/>
+        </w:tabs>
+        <w:ind w:left="2160" w:hanging="360"/>
+      </w:pPr>
+      <w:rPr>
+        <w:rFonts w:ascii="Wingdings" w:hAnsi="Wingdings" w:hint="default"/>
+        <w:sz w:val="20"/>
+      </w:rPr>
+    </w:lvl>
+    <w:lvl w:ilvl="3" w:tentative="1">
+      <w:start w:val="1"/>
+      <w:numFmt w:val="bullet"/>
+      <w:lvlText w:val=""/>
+      <w:lvlJc w:val="left"/>
+      <w:pPr>
+        <w:tabs>
+          <w:tab w:val="num" w:pos="2880"/>
+        </w:tabs>
+        <w:ind w:left="2880" w:hanging="360"/>
+      </w:pPr>
+      <w:rPr>
+        <w:rFonts w:ascii="Wingdings" w:hAnsi="Wingdings" w:hint="default"/>
+        <w:sz w:val="20"/>
+      </w:rPr>
+    </w:lvl>
+    <w:lvl w:ilvl="4" w:tentative="1">
+      <w:start w:val="1"/>
+      <w:numFmt w:val="bullet"/>
+      <w:lvlText w:val=""/>
+      <w:lvlJc w:val="left"/>
+      <w:pPr>
+        <w:tabs>
+          <w:tab w:val="num" w:pos="3600"/>
+        </w:tabs>
+        <w:ind w:left="3600" w:hanging="360"/>
+      </w:pPr>
+      <w:rPr>
+        <w:rFonts w:ascii="Wingdings" w:hAnsi="Wingdings" w:hint="default"/>
+        <w:sz w:val="20"/>
+      </w:rPr>
+    </w:lvl>
+    <w:lvl w:ilvl="5" w:tentative="1">
+      <w:start w:val="1"/>
+      <w:numFmt w:val="bullet"/>
+      <w:lvlText w:val=""/>
+      <w:lvlJc w:val="left"/>
+      <w:pPr>
+        <w:tabs>
+          <w:tab w:val="num" w:pos="4320"/>
+        </w:tabs>
+        <w:ind w:left="4320" w:hanging="360"/>
+      </w:pPr>
+      <w:rPr>
+        <w:rFonts w:ascii="Wingdings" w:hAnsi="Wingdings" w:hint="default"/>
+        <w:sz w:val="20"/>
+      </w:rPr>
+    </w:lvl>
+    <w:lvl w:ilvl="6" w:tentative="1">
+      <w:start w:val="1"/>
+      <w:numFmt w:val="bullet"/>
+      <w:lvlText w:val=""/>
+      <w:lvlJc w:val="left"/>
+      <w:pPr>
+        <w:tabs>
+          <w:tab w:val="num" w:pos="5040"/>
+        </w:tabs>
+        <w:ind w:left="5040" w:hanging="360"/>
+      </w:pPr>
+      <w:rPr>
+        <w:rFonts w:ascii="Wingdings" w:hAnsi="Wingdings" w:hint="default"/>
+        <w:sz w:val="20"/>
+      </w:rPr>
+    </w:lvl>
+    <w:lvl w:ilvl="7" w:tentative="1">
+      <w:start w:val="1"/>
+      <w:numFmt w:val="bullet"/>
+      <w:lvlText w:val=""/>
+      <w:lvlJc w:val="left"/>
+      <w:pPr>
+        <w:tabs>
+          <w:tab w:val="num" w:pos="5760"/>
+        </w:tabs>
+        <w:ind w:left="5760" w:hanging="360"/>
+      </w:pPr>
+      <w:rPr>
+        <w:rFonts w:ascii="Wingdings" w:hAnsi="Wingdings" w:hint="default"/>
+        <w:sz w:val="20"/>
+      </w:rPr>
+    </w:lvl>
+    <w:lvl w:ilvl="8" w:tentative="1">
+      <w:start w:val="1"/>
+      <w:numFmt w:val="bullet"/>
+      <w:lvlText w:val=""/>
+      <w:lvlJc w:val="left"/>
+      <w:pPr>
+        <w:tabs>
+          <w:tab w:val="num" w:pos="6480"/>
+        </w:tabs>
+        <w:ind w:left="6480" w:hanging="360"/>
+      </w:pPr>
+      <w:rPr>
+        <w:rFonts w:ascii="Wingdings" w:hAnsi="Wingdings" w:hint="default"/>
+        <w:sz w:val="20"/>
+      </w:rPr>
+    </w:lvl>
+  </w:abstractNum>
+  <w:abstractNum w:abstractNumId="7" w15:restartNumberingAfterBreak="0">
     <w:nsid w:val="2B5F0C27"/>
     <w:multiLevelType w:val="hybridMultilevel"/>
     <w:tmpl w:val="AA0C4314"/>
@@ -2665,7 +3974,7 @@
       </w:rPr>
     </w:lvl>
   </w:abstractNum>
-  <w:abstractNum w:abstractNumId="6" w15:restartNumberingAfterBreak="0">
+  <w:abstractNum w:abstractNumId="8" w15:restartNumberingAfterBreak="0">
     <w:nsid w:val="2D375447"/>
     <w:multiLevelType w:val="hybridMultilevel"/>
     <w:tmpl w:val="E48C55BC"/>
@@ -2778,7 +4087,7 @@
       </w:rPr>
     </w:lvl>
   </w:abstractNum>
-  <w:abstractNum w:abstractNumId="7" w15:restartNumberingAfterBreak="0">
+  <w:abstractNum w:abstractNumId="9" w15:restartNumberingAfterBreak="0">
     <w:nsid w:val="2F5A55A9"/>
     <w:multiLevelType w:val="multilevel"/>
     <w:tmpl w:val="DBD629DE"/>
@@ -2927,7 +4236,7 @@
       </w:rPr>
     </w:lvl>
   </w:abstractNum>
-  <w:abstractNum w:abstractNumId="8" w15:restartNumberingAfterBreak="0">
+  <w:abstractNum w:abstractNumId="10" w15:restartNumberingAfterBreak="0">
     <w:nsid w:val="428F1B2E"/>
     <w:multiLevelType w:val="hybridMultilevel"/>
     <w:tmpl w:val="37FC270E"/>
@@ -3040,7 +4349,7 @@
       </w:rPr>
     </w:lvl>
   </w:abstractNum>
-  <w:abstractNum w:abstractNumId="9" w15:restartNumberingAfterBreak="0">
+  <w:abstractNum w:abstractNumId="11" w15:restartNumberingAfterBreak="0">
     <w:nsid w:val="43234E23"/>
     <w:multiLevelType w:val="hybridMultilevel"/>
     <w:tmpl w:val="C1E8967A"/>
@@ -3153,10 +4462,10 @@
       </w:rPr>
     </w:lvl>
   </w:abstractNum>
-  <w:abstractNum w:abstractNumId="10" w15:restartNumberingAfterBreak="0">
+  <w:abstractNum w:abstractNumId="12" w15:restartNumberingAfterBreak="0">
     <w:nsid w:val="49B27B42"/>
     <w:multiLevelType w:val="hybridMultilevel"/>
-    <w:tmpl w:val="46A6A13E"/>
+    <w:tmpl w:val="E7E03D86"/>
     <w:lvl w:ilvl="0" w:tplc="0409000F">
       <w:start w:val="1"/>
       <w:numFmt w:val="decimal"/>
@@ -3242,7 +4551,7 @@
       </w:pPr>
     </w:lvl>
   </w:abstractNum>
-  <w:abstractNum w:abstractNumId="11" w15:restartNumberingAfterBreak="0">
+  <w:abstractNum w:abstractNumId="13" w15:restartNumberingAfterBreak="0">
     <w:nsid w:val="4DBE306E"/>
     <w:multiLevelType w:val="multilevel"/>
     <w:tmpl w:val="627473D4"/>
@@ -3391,7 +4700,7 @@
       </w:rPr>
     </w:lvl>
   </w:abstractNum>
-  <w:abstractNum w:abstractNumId="12" w15:restartNumberingAfterBreak="0">
+  <w:abstractNum w:abstractNumId="14" w15:restartNumberingAfterBreak="0">
     <w:nsid w:val="50B0465E"/>
     <w:multiLevelType w:val="hybridMultilevel"/>
     <w:tmpl w:val="7790684A"/>
@@ -3504,7 +4813,156 @@
       </w:rPr>
     </w:lvl>
   </w:abstractNum>
-  <w:abstractNum w:abstractNumId="13" w15:restartNumberingAfterBreak="0">
+  <w:abstractNum w:abstractNumId="15" w15:restartNumberingAfterBreak="0">
+    <w:nsid w:val="54C37D44"/>
+    <w:multiLevelType w:val="multilevel"/>
+    <w:tmpl w:val="B5200CA6"/>
+    <w:lvl w:ilvl="0">
+      <w:start w:val="1"/>
+      <w:numFmt w:val="bullet"/>
+      <w:lvlText w:val=""/>
+      <w:lvlJc w:val="left"/>
+      <w:pPr>
+        <w:tabs>
+          <w:tab w:val="num" w:pos="720"/>
+        </w:tabs>
+        <w:ind w:left="720" w:hanging="360"/>
+      </w:pPr>
+      <w:rPr>
+        <w:rFonts w:ascii="Symbol" w:hAnsi="Symbol" w:hint="default"/>
+        <w:sz w:val="20"/>
+      </w:rPr>
+    </w:lvl>
+    <w:lvl w:ilvl="1" w:tentative="1">
+      <w:start w:val="1"/>
+      <w:numFmt w:val="bullet"/>
+      <w:lvlText w:val="o"/>
+      <w:lvlJc w:val="left"/>
+      <w:pPr>
+        <w:tabs>
+          <w:tab w:val="num" w:pos="1440"/>
+        </w:tabs>
+        <w:ind w:left="1440" w:hanging="360"/>
+      </w:pPr>
+      <w:rPr>
+        <w:rFonts w:ascii="Courier New" w:hAnsi="Courier New" w:hint="default"/>
+        <w:sz w:val="20"/>
+      </w:rPr>
+    </w:lvl>
+    <w:lvl w:ilvl="2" w:tentative="1">
+      <w:start w:val="1"/>
+      <w:numFmt w:val="bullet"/>
+      <w:lvlText w:val=""/>
+      <w:lvlJc w:val="left"/>
+      <w:pPr>
+        <w:tabs>
+          <w:tab w:val="num" w:pos="2160"/>
+        </w:tabs>
+        <w:ind w:left="2160" w:hanging="360"/>
+      </w:pPr>
+      <w:rPr>
+        <w:rFonts w:ascii="Wingdings" w:hAnsi="Wingdings" w:hint="default"/>
+        <w:sz w:val="20"/>
+      </w:rPr>
+    </w:lvl>
+    <w:lvl w:ilvl="3" w:tentative="1">
+      <w:start w:val="1"/>
+      <w:numFmt w:val="bullet"/>
+      <w:lvlText w:val=""/>
+      <w:lvlJc w:val="left"/>
+      <w:pPr>
+        <w:tabs>
+          <w:tab w:val="num" w:pos="2880"/>
+        </w:tabs>
+        <w:ind w:left="2880" w:hanging="360"/>
+      </w:pPr>
+      <w:rPr>
+        <w:rFonts w:ascii="Wingdings" w:hAnsi="Wingdings" w:hint="default"/>
+        <w:sz w:val="20"/>
+      </w:rPr>
+    </w:lvl>
+    <w:lvl w:ilvl="4" w:tentative="1">
+      <w:start w:val="1"/>
+      <w:numFmt w:val="bullet"/>
+      <w:lvlText w:val=""/>
+      <w:lvlJc w:val="left"/>
+      <w:pPr>
+        <w:tabs>
+          <w:tab w:val="num" w:pos="3600"/>
+        </w:tabs>
+        <w:ind w:left="3600" w:hanging="360"/>
+      </w:pPr>
+      <w:rPr>
+        <w:rFonts w:ascii="Wingdings" w:hAnsi="Wingdings" w:hint="default"/>
+        <w:sz w:val="20"/>
+      </w:rPr>
+    </w:lvl>
+    <w:lvl w:ilvl="5" w:tentative="1">
+      <w:start w:val="1"/>
+      <w:numFmt w:val="bullet"/>
+      <w:lvlText w:val=""/>
+      <w:lvlJc w:val="left"/>
+      <w:pPr>
+        <w:tabs>
+          <w:tab w:val="num" w:pos="4320"/>
+        </w:tabs>
+        <w:ind w:left="4320" w:hanging="360"/>
+      </w:pPr>
+      <w:rPr>
+        <w:rFonts w:ascii="Wingdings" w:hAnsi="Wingdings" w:hint="default"/>
+        <w:sz w:val="20"/>
+      </w:rPr>
+    </w:lvl>
+    <w:lvl w:ilvl="6" w:tentative="1">
+      <w:start w:val="1"/>
+      <w:numFmt w:val="bullet"/>
+      <w:lvlText w:val=""/>
+      <w:lvlJc w:val="left"/>
+      <w:pPr>
+        <w:tabs>
+          <w:tab w:val="num" w:pos="5040"/>
+        </w:tabs>
+        <w:ind w:left="5040" w:hanging="360"/>
+      </w:pPr>
+      <w:rPr>
+        <w:rFonts w:ascii="Wingdings" w:hAnsi="Wingdings" w:hint="default"/>
+        <w:sz w:val="20"/>
+      </w:rPr>
+    </w:lvl>
+    <w:lvl w:ilvl="7" w:tentative="1">
+      <w:start w:val="1"/>
+      <w:numFmt w:val="bullet"/>
+      <w:lvlText w:val=""/>
+      <w:lvlJc w:val="left"/>
+      <w:pPr>
+        <w:tabs>
+          <w:tab w:val="num" w:pos="5760"/>
+        </w:tabs>
+        <w:ind w:left="5760" w:hanging="360"/>
+      </w:pPr>
+      <w:rPr>
+        <w:rFonts w:ascii="Wingdings" w:hAnsi="Wingdings" w:hint="default"/>
+        <w:sz w:val="20"/>
+      </w:rPr>
+    </w:lvl>
+    <w:lvl w:ilvl="8" w:tentative="1">
+      <w:start w:val="1"/>
+      <w:numFmt w:val="bullet"/>
+      <w:lvlText w:val=""/>
+      <w:lvlJc w:val="left"/>
+      <w:pPr>
+        <w:tabs>
+          <w:tab w:val="num" w:pos="6480"/>
+        </w:tabs>
+        <w:ind w:left="6480" w:hanging="360"/>
+      </w:pPr>
+      <w:rPr>
+        <w:rFonts w:ascii="Wingdings" w:hAnsi="Wingdings" w:hint="default"/>
+        <w:sz w:val="20"/>
+      </w:rPr>
+    </w:lvl>
+  </w:abstractNum>
+  <w:abstractNum w:abstractNumId="16" w15:restartNumberingAfterBreak="0">
     <w:nsid w:val="55503707"/>
     <w:multiLevelType w:val="multilevel"/>
     <w:tmpl w:val="8CA4FA6C"/>
@@ -3653,7 +5111,7 @@
       </w:rPr>
     </w:lvl>
   </w:abstractNum>
-  <w:abstractNum w:abstractNumId="14" w15:restartNumberingAfterBreak="0">
+  <w:abstractNum w:abstractNumId="17" w15:restartNumberingAfterBreak="0">
     <w:nsid w:val="557A77EE"/>
     <w:multiLevelType w:val="hybridMultilevel"/>
     <w:tmpl w:val="546E5ACC"/>
@@ -3766,7 +5224,93 @@
       </w:rPr>
     </w:lvl>
   </w:abstractNum>
-  <w:abstractNum w:abstractNumId="15" w15:restartNumberingAfterBreak="0">
+  <w:abstractNum w:abstractNumId="18" w15:restartNumberingAfterBreak="0">
+    <w:nsid w:val="5B0B0FD6"/>
+    <w:multiLevelType w:val="hybridMultilevel"/>
+    <w:tmpl w:val="18CA71C0"/>
+    <w:lvl w:ilvl="0" w:tplc="10000013">
+      <w:start w:val="1"/>
+      <w:numFmt w:val="upperRoman"/>
+      <w:lvlText w:val="%1."/>
+      <w:lvlJc w:val="right"/>
+      <w:pPr>
+        <w:ind w:left="720" w:hanging="360"/>
+      </w:pPr>
+    </w:lvl>
+    <w:lvl w:ilvl="1" w:tplc="10000019" w:tentative="1">
+      <w:start w:val="1"/>
+      <w:numFmt w:val="lowerLetter"/>
+      <w:lvlText w:val="%2."/>
+      <w:lvlJc w:val="left"/>
+      <w:pPr>
+        <w:ind w:left="1440" w:hanging="360"/>
+      </w:pPr>
+    </w:lvl>
+    <w:lvl w:ilvl="2" w:tplc="1000001B" w:tentative="1">
+      <w:start w:val="1"/>
+      <w:numFmt w:val="lowerRoman"/>
+      <w:lvlText w:val="%3."/>
+      <w:lvlJc w:val="right"/>
+      <w:pPr>
+        <w:ind w:left="2160" w:hanging="180"/>
+      </w:pPr>
+    </w:lvl>
+    <w:lvl w:ilvl="3" w:tplc="1000000F" w:tentative="1">
+      <w:start w:val="1"/>
+      <w:numFmt w:val="decimal"/>
+      <w:lvlText w:val="%4."/>
+      <w:lvlJc w:val="left"/>
+      <w:pPr>
+        <w:ind w:left="2880" w:hanging="360"/>
+      </w:pPr>
+    </w:lvl>
+    <w:lvl w:ilvl="4" w:tplc="10000019" w:tentative="1">
+      <w:start w:val="1"/>
+      <w:numFmt w:val="lowerLetter"/>
+      <w:lvlText w:val="%5."/>
+      <w:lvlJc w:val="left"/>
+      <w:pPr>
+        <w:ind w:left="3600" w:hanging="360"/>
+      </w:pPr>
+    </w:lvl>
+    <w:lvl w:ilvl="5" w:tplc="1000001B" w:tentative="1">
+      <w:start w:val="1"/>
+      <w:numFmt w:val="lowerRoman"/>
+      <w:lvlText w:val="%6."/>
+      <w:lvlJc w:val="right"/>
+      <w:pPr>
+        <w:ind w:left="4320" w:hanging="180"/>
+      </w:pPr>
+    </w:lvl>
+    <w:lvl w:ilvl="6" w:tplc="1000000F" w:tentative="1">
+      <w:start w:val="1"/>
+      <w:numFmt w:val="decimal"/>
+      <w:lvlText w:val="%7."/>
+      <w:lvlJc w:val="left"/>
+      <w:pPr>
+        <w:ind w:left="5040" w:hanging="360"/>
+      </w:pPr>
+    </w:lvl>
+    <w:lvl w:ilvl="7" w:tplc="10000019" w:tentative="1">
+      <w:start w:val="1"/>
+      <w:numFmt w:val="lowerLetter"/>
+      <w:lvlText w:val="%8."/>
+      <w:lvlJc w:val="left"/>
+      <w:pPr>
+        <w:ind w:left="5760" w:hanging="360"/>
+      </w:pPr>
+    </w:lvl>
+    <w:lvl w:ilvl="8" w:tplc="1000001B" w:tentative="1">
+      <w:start w:val="1"/>
+      <w:numFmt w:val="lowerRoman"/>
+      <w:lvlText w:val="%9."/>
+      <w:lvlJc w:val="right"/>
+      <w:pPr>
+        <w:ind w:left="6480" w:hanging="180"/>
+      </w:pPr>
+    </w:lvl>
+  </w:abstractNum>
+  <w:abstractNum w:abstractNumId="19" w15:restartNumberingAfterBreak="0">
     <w:nsid w:val="5E966797"/>
     <w:multiLevelType w:val="hybridMultilevel"/>
     <w:tmpl w:val="89A2AD8A"/>
@@ -3855,7 +5399,7 @@
       </w:pPr>
     </w:lvl>
   </w:abstractNum>
-  <w:abstractNum w:abstractNumId="16" w15:restartNumberingAfterBreak="0">
+  <w:abstractNum w:abstractNumId="20" w15:restartNumberingAfterBreak="0">
     <w:nsid w:val="5EB8114F"/>
     <w:multiLevelType w:val="hybridMultilevel"/>
     <w:tmpl w:val="C6CAE5B2"/>
@@ -3968,7 +5512,7 @@
       </w:rPr>
     </w:lvl>
   </w:abstractNum>
-  <w:abstractNum w:abstractNumId="17" w15:restartNumberingAfterBreak="0">
+  <w:abstractNum w:abstractNumId="21" w15:restartNumberingAfterBreak="0">
     <w:nsid w:val="68303A09"/>
     <w:multiLevelType w:val="hybridMultilevel"/>
     <w:tmpl w:val="623E6138"/>
@@ -4081,7 +5625,156 @@
       </w:rPr>
     </w:lvl>
   </w:abstractNum>
-  <w:abstractNum w:abstractNumId="18" w15:restartNumberingAfterBreak="0">
+  <w:abstractNum w:abstractNumId="22" w15:restartNumberingAfterBreak="0">
+    <w:nsid w:val="6A7318B4"/>
+    <w:multiLevelType w:val="multilevel"/>
+    <w:tmpl w:val="CD8E3FC2"/>
+    <w:lvl w:ilvl="0">
+      <w:start w:val="1"/>
+      <w:numFmt w:val="bullet"/>
+      <w:lvlText w:val=""/>
+      <w:lvlJc w:val="left"/>
+      <w:pPr>
+        <w:tabs>
+          <w:tab w:val="num" w:pos="720"/>
+        </w:tabs>
+        <w:ind w:left="720" w:hanging="360"/>
+      </w:pPr>
+      <w:rPr>
+        <w:rFonts w:ascii="Symbol" w:hAnsi="Symbol" w:hint="default"/>
+        <w:sz w:val="20"/>
+      </w:rPr>
+    </w:lvl>
+    <w:lvl w:ilvl="1" w:tentative="1">
+      <w:start w:val="1"/>
+      <w:numFmt w:val="bullet"/>
+      <w:lvlText w:val="o"/>
+      <w:lvlJc w:val="left"/>
+      <w:pPr>
+        <w:tabs>
+          <w:tab w:val="num" w:pos="1440"/>
+        </w:tabs>
+        <w:ind w:left="1440" w:hanging="360"/>
+      </w:pPr>
+      <w:rPr>
+        <w:rFonts w:ascii="Courier New" w:hAnsi="Courier New" w:hint="default"/>
+        <w:sz w:val="20"/>
+      </w:rPr>
+    </w:lvl>
+    <w:lvl w:ilvl="2" w:tentative="1">
+      <w:start w:val="1"/>
+      <w:numFmt w:val="bullet"/>
+      <w:lvlText w:val=""/>
+      <w:lvlJc w:val="left"/>
+      <w:pPr>
+        <w:tabs>
+          <w:tab w:val="num" w:pos="2160"/>
+        </w:tabs>
+        <w:ind w:left="2160" w:hanging="360"/>
+      </w:pPr>
+      <w:rPr>
+        <w:rFonts w:ascii="Wingdings" w:hAnsi="Wingdings" w:hint="default"/>
+        <w:sz w:val="20"/>
+      </w:rPr>
+    </w:lvl>
+    <w:lvl w:ilvl="3" w:tentative="1">
+      <w:start w:val="1"/>
+      <w:numFmt w:val="bullet"/>
+      <w:lvlText w:val=""/>
+      <w:lvlJc w:val="left"/>
+      <w:pPr>
+        <w:tabs>
+          <w:tab w:val="num" w:pos="2880"/>
+        </w:tabs>
+        <w:ind w:left="2880" w:hanging="360"/>
+      </w:pPr>
+      <w:rPr>
+        <w:rFonts w:ascii="Wingdings" w:hAnsi="Wingdings" w:hint="default"/>
+        <w:sz w:val="20"/>
+      </w:rPr>
+    </w:lvl>
+    <w:lvl w:ilvl="4" w:tentative="1">
+      <w:start w:val="1"/>
+      <w:numFmt w:val="bullet"/>
+      <w:lvlText w:val=""/>
+      <w:lvlJc w:val="left"/>
+      <w:pPr>
+        <w:tabs>
+          <w:tab w:val="num" w:pos="3600"/>
+        </w:tabs>
+        <w:ind w:left="3600" w:hanging="360"/>
+      </w:pPr>
+      <w:rPr>
+        <w:rFonts w:ascii="Wingdings" w:hAnsi="Wingdings" w:hint="default"/>
+        <w:sz w:val="20"/>
+      </w:rPr>
+    </w:lvl>
+    <w:lvl w:ilvl="5" w:tentative="1">
+      <w:start w:val="1"/>
+      <w:numFmt w:val="bullet"/>
+      <w:lvlText w:val=""/>
+      <w:lvlJc w:val="left"/>
+      <w:pPr>
+        <w:tabs>
+          <w:tab w:val="num" w:pos="4320"/>
+        </w:tabs>
+        <w:ind w:left="4320" w:hanging="360"/>
+      </w:pPr>
+      <w:rPr>
+        <w:rFonts w:ascii="Wingdings" w:hAnsi="Wingdings" w:hint="default"/>
+        <w:sz w:val="20"/>
+      </w:rPr>
+    </w:lvl>
+    <w:lvl w:ilvl="6" w:tentative="1">
+      <w:start w:val="1"/>
+      <w:numFmt w:val="bullet"/>
+      <w:lvlText w:val=""/>
+      <w:lvlJc w:val="left"/>
+      <w:pPr>
+        <w:tabs>
+          <w:tab w:val="num" w:pos="5040"/>
+        </w:tabs>
+        <w:ind w:left="5040" w:hanging="360"/>
+      </w:pPr>
+      <w:rPr>
+        <w:rFonts w:ascii="Wingdings" w:hAnsi="Wingdings" w:hint="default"/>
+        <w:sz w:val="20"/>
+      </w:rPr>
+    </w:lvl>
+    <w:lvl w:ilvl="7" w:tentative="1">
+      <w:start w:val="1"/>
+      <w:numFmt w:val="bullet"/>
+      <w:lvlText w:val=""/>
+      <w:lvlJc w:val="left"/>
+      <w:pPr>
+        <w:tabs>
+          <w:tab w:val="num" w:pos="5760"/>
+        </w:tabs>
+        <w:ind w:left="5760" w:hanging="360"/>
+      </w:pPr>
+      <w:rPr>
+        <w:rFonts w:ascii="Wingdings" w:hAnsi="Wingdings" w:hint="default"/>
+        <w:sz w:val="20"/>
+      </w:rPr>
+    </w:lvl>
+    <w:lvl w:ilvl="8" w:tentative="1">
+      <w:start w:val="1"/>
+      <w:numFmt w:val="bullet"/>
+      <w:lvlText w:val=""/>
+      <w:lvlJc w:val="left"/>
+      <w:pPr>
+        <w:tabs>
+          <w:tab w:val="num" w:pos="6480"/>
+        </w:tabs>
+        <w:ind w:left="6480" w:hanging="360"/>
+      </w:pPr>
+      <w:rPr>
+        <w:rFonts w:ascii="Wingdings" w:hAnsi="Wingdings" w:hint="default"/>
+        <w:sz w:val="20"/>
+      </w:rPr>
+    </w:lvl>
+  </w:abstractNum>
+  <w:abstractNum w:abstractNumId="23" w15:restartNumberingAfterBreak="0">
     <w:nsid w:val="77C342F3"/>
     <w:multiLevelType w:val="multilevel"/>
     <w:tmpl w:val="56741380"/>
@@ -4230,7 +5923,7 @@
       </w:rPr>
     </w:lvl>
   </w:abstractNum>
-  <w:abstractNum w:abstractNumId="19" w15:restartNumberingAfterBreak="0">
+  <w:abstractNum w:abstractNumId="24" w15:restartNumberingAfterBreak="0">
     <w:nsid w:val="7FF64AAA"/>
     <w:multiLevelType w:val="hybridMultilevel"/>
     <w:tmpl w:val="2B42E6BA"/>
@@ -4344,34 +6037,34 @@
     </w:lvl>
   </w:abstractNum>
   <w:num w:numId="1">
-    <w:abstractNumId w:val="15"/>
+    <w:abstractNumId w:val="19"/>
   </w:num>
   <w:num w:numId="2">
-    <w:abstractNumId w:val="10"/>
+    <w:abstractNumId w:val="12"/>
   </w:num>
   <w:num w:numId="3">
-    <w:abstractNumId w:val="17"/>
+    <w:abstractNumId w:val="21"/>
   </w:num>
   <w:num w:numId="4">
-    <w:abstractNumId w:val="7"/>
+    <w:abstractNumId w:val="9"/>
   </w:num>
   <w:num w:numId="5">
     <w:abstractNumId w:val="1"/>
   </w:num>
   <w:num w:numId="6">
-    <w:abstractNumId w:val="13"/>
+    <w:abstractNumId w:val="16"/>
   </w:num>
   <w:num w:numId="7">
-    <w:abstractNumId w:val="18"/>
+    <w:abstractNumId w:val="23"/>
   </w:num>
   <w:num w:numId="8">
-    <w:abstractNumId w:val="11"/>
+    <w:abstractNumId w:val="13"/>
   </w:num>
   <w:num w:numId="9">
     <w:abstractNumId w:val="0"/>
   </w:num>
   <w:num w:numId="10">
-    <w:abstractNumId w:val="16"/>
+    <w:abstractNumId w:val="20"/>
   </w:num>
   <w:num w:numId="11">
     <w:abstractNumId w:val="3"/>
@@ -4380,28 +6073,43 @@
     <w:abstractNumId w:val="2"/>
   </w:num>
   <w:num w:numId="13">
-    <w:abstractNumId w:val="19"/>
+    <w:abstractNumId w:val="24"/>
   </w:num>
   <w:num w:numId="14">
+    <w:abstractNumId w:val="10"/>
+  </w:num>
+  <w:num w:numId="15">
+    <w:abstractNumId w:val="7"/>
+  </w:num>
+  <w:num w:numId="16">
+    <w:abstractNumId w:val="17"/>
+  </w:num>
+  <w:num w:numId="17">
+    <w:abstractNumId w:val="11"/>
+  </w:num>
+  <w:num w:numId="18">
     <w:abstractNumId w:val="8"/>
   </w:num>
-  <w:num w:numId="15">
+  <w:num w:numId="19">
     <w:abstractNumId w:val="5"/>
   </w:num>
-  <w:num w:numId="16">
+  <w:num w:numId="20">
     <w:abstractNumId w:val="14"/>
   </w:num>
-  <w:num w:numId="17">
-    <w:abstractNumId w:val="9"/>
+  <w:num w:numId="21">
+    <w:abstractNumId w:val="22"/>
   </w:num>
-  <w:num w:numId="18">
+  <w:num w:numId="22">
+    <w:abstractNumId w:val="4"/>
+  </w:num>
+  <w:num w:numId="23">
     <w:abstractNumId w:val="6"/>
   </w:num>
-  <w:num w:numId="19">
-    <w:abstractNumId w:val="4"/>
+  <w:num w:numId="24">
+    <w:abstractNumId w:val="15"/>
   </w:num>
-  <w:num w:numId="20">
-    <w:abstractNumId w:val="12"/>
+  <w:num w:numId="25">
+    <w:abstractNumId w:val="18"/>
   </w:num>
 </w:numbering>
 </file>

</xml_diff>